<commit_message>
TS 4.1 Kramam Jatai compare
</commit_message>
<xml_diff>
--- a/TS-Kramam/TS-4.1/TS 4.1 Sanskrit Krama Paatam Corrections.docx
+++ b/TS-Kramam/TS-4.1/TS 4.1 Sanskrit Krama Paatam Corrections.docx
@@ -1,6 +1,6 @@
 
 <file path=word/document.xml><?xml version="1.0" encoding="utf-8"?>
-<w:document xmlns:wpc="http://schemas.microsoft.com/office/word/2010/wordprocessingCanvas" xmlns:cx="http://schemas.microsoft.com/office/drawing/2014/chartex" xmlns:cx1="http://schemas.microsoft.com/office/drawing/2015/9/8/chartex" xmlns:cx2="http://schemas.microsoft.com/office/drawing/2015/10/21/chartex" xmlns:cx3="http://schemas.microsoft.com/office/drawing/2016/5/9/chartex" xmlns:cx4="http://schemas.microsoft.com/office/drawing/2016/5/10/chartex" xmlns:cx5="http://schemas.microsoft.com/office/drawing/2016/5/11/chartex" xmlns:cx6="http://schemas.microsoft.com/office/drawing/2016/5/12/chartex" xmlns:cx7="http://schemas.microsoft.com/office/drawing/2016/5/13/chartex" xmlns:cx8="http://schemas.microsoft.com/office/drawing/2016/5/14/chartex" xmlns:mc="http://schemas.openxmlformats.org/markup-compatibility/2006" xmlns:aink="http://schemas.microsoft.com/office/drawing/2016/ink" xmlns:am3d="http://schemas.microsoft.com/office/drawing/2017/model3d" xmlns:o="urn:schemas-microsoft-com:office:office" xmlns:oel="http://schemas.microsoft.com/office/2019/extlst" xmlns:r="http://schemas.openxmlformats.org/officeDocument/2006/relationships" xmlns:m="http://schemas.openxmlformats.org/officeDocument/2006/math" xmlns:v="urn:schemas-microsoft-com:vml" xmlns:wp14="http://schemas.microsoft.com/office/word/2010/wordprocessingDrawing" xmlns:wp="http://schemas.openxmlformats.org/drawingml/2006/wordprocessingDrawing" xmlns:w10="urn:schemas-microsoft-com:office:word" xmlns:w="http://schemas.openxmlformats.org/wordprocessingml/2006/main" xmlns:w14="http://schemas.microsoft.com/office/word/2010/wordml" xmlns:w15="http://schemas.microsoft.com/office/word/2012/wordml" xmlns:w16cex="http://schemas.microsoft.com/office/word/2018/wordml/cex" xmlns:w16cid="http://schemas.microsoft.com/office/word/2016/wordml/cid" xmlns:w16="http://schemas.microsoft.com/office/word/2018/wordml" xmlns:w16du="http://schemas.microsoft.com/office/word/2023/wordml/word16du" xmlns:w16sdtdh="http://schemas.microsoft.com/office/word/2020/wordml/sdtdatahash" xmlns:w16sdtfl="http://schemas.microsoft.com/office/word/2024/wordml/sdtformatlock" xmlns:w16se="http://schemas.microsoft.com/office/word/2015/wordml/symex" xmlns:wpg="http://schemas.microsoft.com/office/word/2010/wordprocessingGroup" xmlns:wpi="http://schemas.microsoft.com/office/word/2010/wordprocessingInk" xmlns:wne="http://schemas.microsoft.com/office/word/2006/wordml" xmlns:wps="http://schemas.microsoft.com/office/word/2010/wordprocessingShape" mc:Ignorable="w14 w15 w16se w16cid w16 w16cex w16sdtdh w16sdtfl w16du wp14">
+<w:document xmlns:wpc="http://schemas.microsoft.com/office/word/2010/wordprocessingCanvas" xmlns:cx="http://schemas.microsoft.com/office/drawing/2014/chartex" xmlns:cx1="http://schemas.microsoft.com/office/drawing/2015/9/8/chartex" xmlns:cx2="http://schemas.microsoft.com/office/drawing/2015/10/21/chartex" xmlns:cx3="http://schemas.microsoft.com/office/drawing/2016/5/9/chartex" xmlns:cx4="http://schemas.microsoft.com/office/drawing/2016/5/10/chartex" xmlns:cx5="http://schemas.microsoft.com/office/drawing/2016/5/11/chartex" xmlns:cx6="http://schemas.microsoft.com/office/drawing/2016/5/12/chartex" xmlns:cx7="http://schemas.microsoft.com/office/drawing/2016/5/13/chartex" xmlns:cx8="http://schemas.microsoft.com/office/drawing/2016/5/14/chartex" xmlns:mc="http://schemas.openxmlformats.org/markup-compatibility/2006" xmlns:aink="http://schemas.microsoft.com/office/drawing/2016/ink" xmlns:am3d="http://schemas.microsoft.com/office/drawing/2017/model3d" xmlns:o="urn:schemas-microsoft-com:office:office" xmlns:oel="http://schemas.microsoft.com/office/2019/extlst" xmlns:r="http://schemas.openxmlformats.org/officeDocument/2006/relationships" xmlns:m="http://schemas.openxmlformats.org/officeDocument/2006/math" xmlns:v="urn:schemas-microsoft-com:vml" xmlns:wp14="http://schemas.microsoft.com/office/word/2010/wordprocessingDrawing" xmlns:wp="http://schemas.openxmlformats.org/drawingml/2006/wordprocessingDrawing" xmlns:w10="urn:schemas-microsoft-com:office:word" xmlns:w="http://schemas.openxmlformats.org/wordprocessingml/2006/main" xmlns:w14="http://schemas.microsoft.com/office/word/2010/wordml" xmlns:w15="http://schemas.microsoft.com/office/word/2012/wordml" xmlns:w16cei="http://schemas.microsoft.com/office/word/2026/wordml/cei" xmlns:w16cex="http://schemas.microsoft.com/office/word/2018/wordml/cex" xmlns:w16cid="http://schemas.microsoft.com/office/word/2016/wordml/cid" xmlns:w16="http://schemas.microsoft.com/office/word/2018/wordml" xmlns:w16du="http://schemas.microsoft.com/office/word/2023/wordml/word16du" xmlns:w16sdtdh="http://schemas.microsoft.com/office/word/2020/wordml/sdtdatahash" xmlns:w16sdtfl="http://schemas.microsoft.com/office/word/2024/wordml/sdtformatlock" xmlns:w16se="http://schemas.microsoft.com/office/word/2015/wordml/symex" xmlns:wpg="http://schemas.microsoft.com/office/word/2010/wordprocessingGroup" xmlns:wpi="http://schemas.microsoft.com/office/word/2010/wordprocessingInk" xmlns:wne="http://schemas.microsoft.com/office/word/2006/wordml" xmlns:wps="http://schemas.microsoft.com/office/word/2010/wordprocessingShape" mc:Ignorable="w14 w15 w16se w16cid w16 w16cex w16sdtdh w16sdtfl w16du wp14">
   <w:body>
     <w:p>
       <w:pPr>
@@ -141,12 +141,16 @@
               <w:spacing w:before="0" w:line="240" w:lineRule="auto"/>
               <w:jc w:val="center"/>
               <w:rPr>
-                <w:sz w:val="32"/>
-                <w:szCs w:val="32"/>
-              </w:rPr>
-            </w:pPr>
-            <w:r>
-              <w:rPr>
+                <w:b/>
+                <w:bCs/>
+                <w:sz w:val="32"/>
+                <w:szCs w:val="32"/>
+              </w:rPr>
+            </w:pPr>
+            <w:r>
+              <w:rPr>
+                <w:b/>
+                <w:bCs/>
                 <w:sz w:val="32"/>
                 <w:szCs w:val="32"/>
               </w:rPr>
@@ -158,12 +162,16 @@
               <w:spacing w:before="0" w:line="240" w:lineRule="auto"/>
               <w:jc w:val="center"/>
               <w:rPr>
-                <w:sz w:val="32"/>
-                <w:szCs w:val="32"/>
-              </w:rPr>
-            </w:pPr>
-            <w:r>
-              <w:rPr>
+                <w:b/>
+                <w:bCs/>
+                <w:sz w:val="32"/>
+                <w:szCs w:val="32"/>
+              </w:rPr>
+            </w:pPr>
+            <w:r>
+              <w:rPr>
+                <w:b/>
+                <w:bCs/>
                 <w:sz w:val="32"/>
                 <w:szCs w:val="32"/>
               </w:rPr>
@@ -180,12 +188,16 @@
               <w:spacing w:before="0" w:line="240" w:lineRule="auto"/>
               <w:jc w:val="center"/>
               <w:rPr>
-                <w:sz w:val="32"/>
-                <w:szCs w:val="32"/>
-              </w:rPr>
-            </w:pPr>
-            <w:r>
-              <w:rPr>
+                <w:b/>
+                <w:bCs/>
+                <w:sz w:val="32"/>
+                <w:szCs w:val="32"/>
+              </w:rPr>
+            </w:pPr>
+            <w:r>
+              <w:rPr>
+                <w:b/>
+                <w:bCs/>
                 <w:sz w:val="32"/>
                 <w:szCs w:val="32"/>
               </w:rPr>
@@ -203,12 +215,16 @@
               <w:ind w:right="-18"/>
               <w:jc w:val="center"/>
               <w:rPr>
-                <w:sz w:val="32"/>
-                <w:szCs w:val="32"/>
-              </w:rPr>
-            </w:pPr>
-            <w:r>
-              <w:rPr>
+                <w:b/>
+                <w:bCs/>
+                <w:sz w:val="32"/>
+                <w:szCs w:val="32"/>
+              </w:rPr>
+            </w:pPr>
+            <w:r>
+              <w:rPr>
+                <w:b/>
+                <w:bCs/>
                 <w:sz w:val="32"/>
                 <w:szCs w:val="32"/>
               </w:rPr>
@@ -265,7 +281,7 @@
                 <w:sz w:val="28"/>
                 <w:szCs w:val="32"/>
               </w:rPr>
-              <w:t>6.2</w:t>
+              <w:t>4.2</w:t>
             </w:r>
             <w:r>
               <w:rPr>
@@ -304,7 +320,17 @@
                 <w:szCs w:val="32"/>
                 <w:lang w:val="en-IN"/>
               </w:rPr>
-              <w:t>Krama Vaakyam No. - 44</w:t>
+              <w:t xml:space="preserve">Krama Vaakyam No. - </w:t>
+            </w:r>
+            <w:r>
+              <w:rPr>
+                <w:rFonts w:cs="Arial"/>
+                <w:b/>
+                <w:sz w:val="28"/>
+                <w:szCs w:val="32"/>
+                <w:lang w:val="en-IN"/>
+              </w:rPr>
+              <w:t>10</w:t>
             </w:r>
           </w:p>
           <w:p>
@@ -323,47 +349,36 @@
                 <w:b/>
                 <w:sz w:val="28"/>
                 <w:szCs w:val="32"/>
+              </w:rPr>
+            </w:pPr>
+            <w:r>
+              <w:rPr>
+                <w:rFonts w:cs="Arial"/>
+                <w:b/>
+                <w:sz w:val="28"/>
+                <w:szCs w:val="32"/>
                 <w:lang w:val="it-IT"/>
               </w:rPr>
-            </w:pPr>
-            <w:r>
-              <w:rPr>
-                <w:rFonts w:cs="Arial"/>
-                <w:b/>
-                <w:sz w:val="28"/>
+              <w:t>Panchaati No</w:t>
+            </w:r>
+            <w:r>
+              <w:rPr>
+                <w:rFonts w:cs="Arial"/>
+                <w:b/>
                 <w:szCs w:val="32"/>
                 <w:lang w:val="it-IT"/>
               </w:rPr>
-              <w:t>Panchaati No</w:t>
-            </w:r>
-            <w:r>
-              <w:rPr>
-                <w:rFonts w:cs="Arial"/>
-                <w:b/>
-                <w:szCs w:val="32"/>
+              <w:t xml:space="preserve">. - </w:t>
+            </w:r>
+            <w:r>
+              <w:rPr>
+                <w:rFonts w:cs="Arial"/>
+                <w:b/>
+                <w:sz w:val="28"/>
+                <w:szCs w:val="28"/>
                 <w:lang w:val="it-IT"/>
               </w:rPr>
-              <w:t xml:space="preserve">. - </w:t>
-            </w:r>
-            <w:r>
-              <w:rPr>
-                <w:rFonts w:cs="Arial"/>
-                <w:b/>
-                <w:sz w:val="28"/>
-                <w:szCs w:val="32"/>
-                <w:lang w:val="it-IT"/>
-              </w:rPr>
-              <w:t>2</w:t>
-            </w:r>
-            <w:r>
-              <w:rPr>
-                <w:rFonts w:cs="Arial"/>
-                <w:b/>
-                <w:sz w:val="28"/>
-                <w:szCs w:val="32"/>
-                <w:lang w:val="it-IT"/>
-              </w:rPr>
-              <w:t>3</w:t>
+              <w:t>15</w:t>
             </w:r>
           </w:p>
         </w:tc>
@@ -385,59 +400,312 @@
               <w:adjustRightInd w:val="0"/>
               <w:spacing w:before="0" w:line="240" w:lineRule="auto"/>
               <w:rPr>
-                <w:rFonts w:ascii="BRH Malayalam Extra" w:eastAsia="Times New Roman" w:hAnsi="BRH Malayalam Extra" w:cs="BRH Malayalam Extra"/>
-                <w:color w:val="000000"/>
-                <w:sz w:val="40"/>
-                <w:szCs w:val="40"/>
-                <w:lang w:val="en-IN" w:eastAsia="en-IN" w:bidi="ml-IN"/>
-              </w:rPr>
-            </w:pPr>
-            <w:r>
-              <w:rPr>
-                <w:rFonts w:ascii="BRH Devanagari Extra" w:hAnsi="BRH Devanagari Extra" w:cs="BRH Devanagari Extra"/>
-                <w:color w:val="000000"/>
-                <w:sz w:val="40"/>
-                <w:szCs w:val="40"/>
-              </w:rPr>
-              <w:t>E</w:t>
-            </w:r>
-            <w:r>
-              <w:rPr>
-                <w:rFonts w:ascii="BRH Malayalam Extra" w:hAnsi="BRH Malayalam Extra" w:cs="BRH Devanagari Extra"/>
-                <w:color w:val="000000"/>
-                <w:sz w:val="32"/>
-                <w:szCs w:val="40"/>
-              </w:rPr>
-              <w:t>–</w:t>
-            </w:r>
-            <w:r>
-              <w:rPr>
-                <w:rFonts w:ascii="BRH Devanagari Extra" w:hAnsi="BRH Devanagari Extra" w:cs="BRH Devanagari Extra"/>
-                <w:color w:val="000000"/>
-                <w:sz w:val="40"/>
-                <w:szCs w:val="40"/>
+                <w:rFonts w:ascii="Latha" w:hAnsi="Latha" w:cs="Latha"/>
+                <w:sz w:val="28"/>
+                <w:szCs w:val="28"/>
+                <w:lang w:bidi="ta-IN"/>
+              </w:rPr>
+            </w:pPr>
+            <w:r>
+              <w:rPr>
+                <w:rFonts w:ascii="Latha" w:hAnsi="Latha" w:cs="Latha"/>
+                <w:sz w:val="28"/>
+                <w:szCs w:val="28"/>
                 <w:highlight w:val="yellow"/>
-              </w:rPr>
-              <w:t>ZÉå</w:t>
-            </w:r>
-            <w:r>
-              <w:rPr>
-                <w:rFonts w:ascii="BRH Malayalam Extra" w:hAnsi="BRH Malayalam Extra" w:cs="BRH Devanagari Extra"/>
-                <w:color w:val="000000"/>
-                <w:sz w:val="32"/>
-                <w:szCs w:val="40"/>
+                <w:cs/>
+                <w:lang w:bidi="ta-IN"/>
+              </w:rPr>
+              <w:t>ஊ</w:t>
+            </w:r>
+            <w:r>
+              <w:rPr>
+                <w:rFonts w:ascii="BRH Tamil Tab Extra" w:hAnsi="BRH Tamil Tab Extra" w:cs="Latha"/>
+                <w:b/>
+                <w:sz w:val="36"/>
+                <w:szCs w:val="28"/>
                 <w:highlight w:val="yellow"/>
-              </w:rPr>
-              <w:t>–</w:t>
-            </w:r>
-            <w:r>
-              <w:rPr>
-                <w:rFonts w:ascii="BRH Devanagari Extra" w:hAnsi="BRH Devanagari Extra" w:cs="BRH Devanagari Extra"/>
-                <w:color w:val="000000"/>
-                <w:sz w:val="40"/>
-                <w:szCs w:val="40"/>
-              </w:rPr>
-              <w:t xml:space="preserve"> CirÉÑþZÉå ||</w:t>
+                <w:lang w:bidi="ta-IN"/>
+              </w:rPr>
+              <w:t>…</w:t>
+            </w:r>
+            <w:r>
+              <w:rPr>
+                <w:rFonts w:ascii="Latha" w:hAnsi="Latha" w:cs="Latha"/>
+                <w:sz w:val="28"/>
+                <w:szCs w:val="28"/>
+                <w:highlight w:val="yellow"/>
+                <w:cs/>
+                <w:lang w:bidi="ta-IN"/>
+              </w:rPr>
+              <w:t>ர்த்</w:t>
+            </w:r>
+            <w:r>
+              <w:rPr>
+                <w:rFonts w:ascii="Latha" w:hAnsi="Latha" w:cs="Latha"/>
+                <w:b/>
+                <w:bCs/>
+                <w:position w:val="-12"/>
+                <w:sz w:val="28"/>
+                <w:szCs w:val="28"/>
+                <w:highlight w:val="yellow"/>
+                <w:cs/>
+                <w:lang w:bidi="ta-IN"/>
+              </w:rPr>
+              <w:t>3</w:t>
+            </w:r>
+            <w:r>
+              <w:rPr>
+                <w:rFonts w:ascii="Latha" w:hAnsi="Latha" w:cs="Latha"/>
+                <w:sz w:val="28"/>
+                <w:szCs w:val="28"/>
+                <w:highlight w:val="yellow"/>
+                <w:cs/>
+                <w:lang w:bidi="ta-IN"/>
+              </w:rPr>
+              <w:t>தோ</w:t>
+            </w:r>
+            <w:r>
+              <w:rPr>
+                <w:rFonts w:ascii="Latha" w:hAnsi="Latha" w:cs="Latha"/>
+                <w:b/>
+                <w:bCs/>
+                <w:position w:val="-12"/>
+                <w:sz w:val="28"/>
+                <w:szCs w:val="28"/>
+                <w:highlight w:val="yellow"/>
+                <w:cs/>
+                <w:lang w:bidi="ta-IN"/>
+              </w:rPr>
+              <w:t>4</w:t>
+            </w:r>
+            <w:r>
+              <w:rPr>
+                <w:rFonts w:ascii="Latha" w:hAnsi="Latha" w:cs="Latha"/>
+                <w:b/>
+                <w:bCs/>
+                <w:position w:val="-12"/>
+                <w:sz w:val="28"/>
+                <w:szCs w:val="28"/>
+                <w:lang w:bidi="ta-IN"/>
+              </w:rPr>
+              <w:t xml:space="preserve"> </w:t>
+            </w:r>
+            <w:r>
+              <w:rPr>
+                <w:rFonts w:ascii="Latha" w:hAnsi="Latha" w:cs="Latha"/>
+                <w:sz w:val="28"/>
+                <w:szCs w:val="28"/>
+                <w:cs/>
+                <w:lang w:bidi="ta-IN"/>
+              </w:rPr>
+              <w:t>வாஜ</w:t>
+            </w:r>
+            <w:r>
+              <w:rPr>
+                <w:rFonts w:ascii="BRH Tamil Tab Extra" w:hAnsi="BRH Tamil Tab Extra" w:cs="Latha"/>
+                <w:b/>
+                <w:sz w:val="36"/>
+                <w:szCs w:val="28"/>
+                <w:lang w:bidi="ta-IN"/>
+              </w:rPr>
+              <w:t>†</w:t>
+            </w:r>
+            <w:r>
+              <w:rPr>
+                <w:rFonts w:ascii="Latha" w:hAnsi="Latha" w:cs="Latha"/>
+                <w:sz w:val="28"/>
+                <w:szCs w:val="28"/>
+                <w:cs/>
+                <w:lang w:bidi="ta-IN"/>
+              </w:rPr>
+              <w:t>ஸ்ய</w:t>
+            </w:r>
+            <w:r>
+              <w:rPr>
+                <w:rFonts w:ascii="Latha" w:hAnsi="Latha" w:cs="Latha"/>
+                <w:sz w:val="28"/>
+                <w:szCs w:val="28"/>
+                <w:lang w:bidi="ta-IN"/>
+              </w:rPr>
+              <w:t xml:space="preserve"> | </w:t>
+            </w:r>
+            <w:r>
+              <w:rPr>
+                <w:rFonts w:ascii="Latha" w:hAnsi="Latha" w:cs="Latha"/>
+                <w:sz w:val="28"/>
+                <w:szCs w:val="28"/>
+                <w:cs/>
+                <w:lang w:bidi="ta-IN"/>
+              </w:rPr>
+              <w:t>வாஜ</w:t>
+            </w:r>
+            <w:r>
+              <w:rPr>
+                <w:rFonts w:ascii="BRH Tamil Tab Extra" w:hAnsi="BRH Tamil Tab Extra" w:cs="Latha"/>
+                <w:b/>
+                <w:sz w:val="36"/>
+                <w:szCs w:val="28"/>
+                <w:lang w:bidi="ta-IN"/>
+              </w:rPr>
+              <w:t>†</w:t>
+            </w:r>
+            <w:r>
+              <w:rPr>
+                <w:rFonts w:ascii="Latha" w:hAnsi="Latha" w:cs="Latha"/>
+                <w:sz w:val="28"/>
+                <w:szCs w:val="28"/>
+                <w:cs/>
+                <w:lang w:bidi="ta-IN"/>
+              </w:rPr>
+              <w:t>ஸ்ய</w:t>
+            </w:r>
+            <w:r>
+              <w:rPr>
+                <w:rFonts w:ascii="BRH Tamil Tab Extra" w:hAnsi="BRH Tamil Tab Extra" w:cs="Latha"/>
+                <w:b/>
+                <w:sz w:val="36"/>
+                <w:szCs w:val="28"/>
+                <w:lang w:bidi="ta-IN"/>
+              </w:rPr>
+              <w:t>…</w:t>
+            </w:r>
+            <w:r>
+              <w:rPr>
+                <w:rFonts w:ascii="Latha" w:hAnsi="Latha" w:cs="Latha"/>
+                <w:sz w:val="28"/>
+                <w:szCs w:val="28"/>
+                <w:lang w:bidi="ta-IN"/>
+              </w:rPr>
+              <w:t xml:space="preserve"> </w:t>
+            </w:r>
+            <w:r>
+              <w:rPr>
+                <w:rFonts w:ascii="Latha" w:hAnsi="Latha" w:cs="Latha"/>
+                <w:sz w:val="28"/>
+                <w:szCs w:val="28"/>
+                <w:cs/>
+                <w:lang w:bidi="ta-IN"/>
+              </w:rPr>
+              <w:t>ஸனி</w:t>
+            </w:r>
+            <w:r>
+              <w:rPr>
+                <w:rFonts w:ascii="BRH Tamil Tab Extra" w:hAnsi="BRH Tamil Tab Extra" w:cs="Latha"/>
+                <w:b/>
+                <w:sz w:val="36"/>
+                <w:szCs w:val="28"/>
+                <w:lang w:bidi="ta-IN"/>
+              </w:rPr>
+              <w:t>†</w:t>
+            </w:r>
+            <w:r>
+              <w:rPr>
+                <w:rFonts w:ascii="Latha" w:hAnsi="Latha" w:cs="Latha"/>
+                <w:sz w:val="28"/>
+                <w:szCs w:val="28"/>
+                <w:cs/>
+                <w:lang w:bidi="ta-IN"/>
+              </w:rPr>
+              <w:t>தா</w:t>
+            </w:r>
+            <w:r>
+              <w:rPr>
+                <w:rFonts w:ascii="Latha" w:hAnsi="Latha" w:cs="Latha"/>
+                <w:sz w:val="28"/>
+                <w:szCs w:val="28"/>
+                <w:lang w:bidi="ta-IN"/>
+              </w:rPr>
+              <w:t xml:space="preserve"> </w:t>
+            </w:r>
+          </w:p>
+          <w:p>
+            <w:pPr>
+              <w:widowControl w:val="0"/>
+              <w:autoSpaceDE w:val="0"/>
+              <w:autoSpaceDN w:val="0"/>
+              <w:adjustRightInd w:val="0"/>
+              <w:spacing w:line="252" w:lineRule="auto"/>
+              <w:ind w:right="-279"/>
+              <w:rPr>
+                <w:rFonts w:ascii="BRH Devanagari Extra" w:hAnsi="BRH Devanagari Extra" w:cs="BRH Devanagari Extra"/>
+                <w:color w:val="000000"/>
+                <w:sz w:val="40"/>
+                <w:szCs w:val="40"/>
+              </w:rPr>
+            </w:pPr>
+            <w:r>
+              <w:rPr>
+                <w:rFonts w:ascii="BRH Devanagari Extra" w:hAnsi="BRH Devanagari Extra" w:cs="BRH Devanagari Extra"/>
+                <w:color w:val="000000"/>
+                <w:sz w:val="40"/>
+                <w:szCs w:val="40"/>
+              </w:rPr>
+              <w:t>F</w:t>
+            </w:r>
+            <w:r>
+              <w:rPr>
+                <w:rFonts w:ascii="BRH Malayalam Extra" w:hAnsi="BRH Malayalam Extra" w:cs="BRH Devanagari Extra"/>
+                <w:color w:val="EE0000"/>
+                <w:sz w:val="32"/>
+                <w:szCs w:val="40"/>
+                <w:highlight w:val="yellow"/>
+              </w:rPr>
+              <w:t>–</w:t>
+            </w:r>
+            <w:r>
+              <w:rPr>
+                <w:rFonts w:ascii="BRH Devanagari Extra" w:hAnsi="BRH Devanagari Extra" w:cs="BRH Devanagari Extra"/>
+                <w:color w:val="EE0000"/>
+                <w:sz w:val="40"/>
+                <w:szCs w:val="40"/>
+                <w:highlight w:val="yellow"/>
+              </w:rPr>
+              <w:t>®Éåï</w:t>
+            </w:r>
+            <w:r>
+              <w:rPr>
+                <w:rFonts w:ascii="BRH Devanagari Extra" w:hAnsi="BRH Devanagari Extra" w:cs="BRH Devanagari Extra"/>
+                <w:color w:val="000000"/>
+                <w:sz w:val="40"/>
+                <w:szCs w:val="40"/>
+              </w:rPr>
+              <w:t xml:space="preserve"> uÉÉeÉþxrÉ |</w:t>
+            </w:r>
+            <w:r>
+              <w:rPr>
+                <w:rFonts w:ascii="BRH Devanagari Extra" w:hAnsi="BRH Devanagari Extra" w:cs="BRH Devanagari Extra"/>
+                <w:color w:val="000000"/>
+                <w:sz w:val="40"/>
+                <w:szCs w:val="40"/>
+              </w:rPr>
+              <w:t xml:space="preserve"> </w:t>
+            </w:r>
+            <w:r>
+              <w:rPr>
+                <w:rFonts w:ascii="BRH Devanagari Extra" w:hAnsi="BRH Devanagari Extra" w:cs="BRH Devanagari Extra"/>
+                <w:color w:val="000000"/>
+                <w:sz w:val="40"/>
+                <w:szCs w:val="40"/>
+              </w:rPr>
+              <w:t>uÉÉeÉþxrÉ</w:t>
+            </w:r>
+            <w:r>
+              <w:rPr>
+                <w:rFonts w:ascii="BRH Malayalam Extra" w:hAnsi="BRH Malayalam Extra" w:cs="BRH Devanagari Extra"/>
+                <w:color w:val="000000"/>
+                <w:sz w:val="32"/>
+                <w:szCs w:val="40"/>
+              </w:rPr>
+              <w:t>–</w:t>
+            </w:r>
+            <w:r>
+              <w:rPr>
+                <w:rFonts w:ascii="BRH Devanagari Extra" w:hAnsi="BRH Devanagari Extra" w:cs="BRH Devanagari Extra"/>
+                <w:color w:val="000000"/>
+                <w:sz w:val="40"/>
+                <w:szCs w:val="40"/>
+              </w:rPr>
+              <w:t xml:space="preserve"> xÉÌlÉþiÉÉ |</w:t>
             </w:r>
           </w:p>
         </w:tc>
@@ -459,58 +727,231 @@
               <w:adjustRightInd w:val="0"/>
               <w:spacing w:before="0" w:line="240" w:lineRule="auto"/>
               <w:rPr>
-                <w:rFonts w:ascii="BRH Malayalam Extra" w:eastAsia="Times New Roman" w:hAnsi="BRH Malayalam Extra" w:cs="BRH Malayalam Extra"/>
-                <w:color w:val="000000"/>
-                <w:sz w:val="40"/>
-                <w:szCs w:val="40"/>
-                <w:lang w:val="en-IN" w:eastAsia="en-IN" w:bidi="ml-IN"/>
-              </w:rPr>
-            </w:pPr>
-            <w:r>
-              <w:rPr>
-                <w:rFonts w:ascii="BRH Devanagari Extra" w:hAnsi="BRH Devanagari Extra" w:cs="BRH Devanagari Extra"/>
-                <w:color w:val="000000"/>
-                <w:sz w:val="40"/>
-                <w:szCs w:val="40"/>
-              </w:rPr>
-              <w:t>E</w:t>
-            </w:r>
-            <w:r>
-              <w:rPr>
-                <w:rFonts w:ascii="BRH Malayalam Extra" w:hAnsi="BRH Malayalam Extra" w:cs="BRH Devanagari Extra"/>
-                <w:color w:val="000000"/>
-                <w:sz w:val="32"/>
-                <w:szCs w:val="40"/>
-              </w:rPr>
-              <w:t>–</w:t>
-            </w:r>
-            <w:r>
-              <w:rPr>
-                <w:rFonts w:ascii="BRH Devanagari Extra" w:hAnsi="BRH Devanagari Extra" w:cs="BRH Devanagari Extra"/>
-                <w:color w:val="000000"/>
-                <w:sz w:val="40"/>
-                <w:szCs w:val="40"/>
+                <w:rFonts w:ascii="BRH Devanagari Extra" w:hAnsi="BRH Devanagari Extra" w:cs="BRH Devanagari Extra"/>
+                <w:color w:val="000000"/>
+                <w:sz w:val="40"/>
+                <w:szCs w:val="40"/>
+              </w:rPr>
+            </w:pPr>
+            <w:r>
+              <w:rPr>
+                <w:rFonts w:ascii="Latha" w:hAnsi="Latha" w:cs="Latha"/>
+                <w:sz w:val="28"/>
+                <w:szCs w:val="28"/>
                 <w:highlight w:val="green"/>
-              </w:rPr>
-              <w:t>ZÉ</w:t>
-            </w:r>
-            <w:r>
-              <w:rPr>
-                <w:rFonts w:ascii="BRH Malayalam Extra" w:hAnsi="BRH Malayalam Extra" w:cs="BRH Devanagari Extra"/>
-                <w:color w:val="000000"/>
-                <w:sz w:val="32"/>
-                <w:szCs w:val="40"/>
-              </w:rPr>
-              <w:t>–</w:t>
-            </w:r>
-            <w:r>
-              <w:rPr>
-                <w:rFonts w:ascii="BRH Devanagari Extra" w:hAnsi="BRH Devanagari Extra" w:cs="BRH Devanagari Extra"/>
-                <w:color w:val="000000"/>
-                <w:sz w:val="40"/>
-                <w:szCs w:val="40"/>
-              </w:rPr>
-              <w:t xml:space="preserve"> CirÉÑþZÉå ||</w:t>
+                <w:cs/>
+                <w:lang w:bidi="ta-IN"/>
+              </w:rPr>
+              <w:t>ஊ</w:t>
+            </w:r>
+            <w:r>
+              <w:rPr>
+                <w:rFonts w:ascii="BRH Tamil Tab Extra" w:hAnsi="BRH Tamil Tab Extra" w:cs="Latha"/>
+                <w:b/>
+                <w:bCs/>
+                <w:sz w:val="28"/>
+                <w:szCs w:val="28"/>
+                <w:highlight w:val="green"/>
+                <w:lang w:bidi="ta-IN"/>
+              </w:rPr>
+              <w:t>…</w:t>
+            </w:r>
+            <w:r>
+              <w:rPr>
+                <w:rFonts w:ascii="Latha" w:hAnsi="Latha" w:cs="Latha"/>
+                <w:sz w:val="28"/>
+                <w:szCs w:val="28"/>
+                <w:highlight w:val="green"/>
+                <w:cs/>
+                <w:lang w:bidi="ta-IN"/>
+              </w:rPr>
+              <w:t>ர்த்</w:t>
+            </w:r>
+            <w:r>
+              <w:rPr>
+                <w:rFonts w:ascii="Latha" w:hAnsi="Latha" w:cs="Latha"/>
+                <w:b/>
+                <w:bCs/>
+                <w:position w:val="-12"/>
+                <w:sz w:val="28"/>
+                <w:szCs w:val="28"/>
+                <w:highlight w:val="green"/>
+                <w:cs/>
+                <w:lang w:bidi="ta-IN"/>
+              </w:rPr>
+              <w:t>3</w:t>
+            </w:r>
+            <w:r>
+              <w:rPr>
+                <w:rFonts w:ascii="Latha" w:hAnsi="Latha" w:cs="Latha"/>
+                <w:sz w:val="28"/>
+                <w:szCs w:val="28"/>
+                <w:highlight w:val="green"/>
+                <w:cs/>
+                <w:lang w:bidi="ta-IN"/>
+              </w:rPr>
+              <w:t>த்</w:t>
+            </w:r>
+            <w:r>
+              <w:rPr>
+                <w:rFonts w:ascii="Latha" w:hAnsi="Latha" w:cs="Latha"/>
+                <w:b/>
+                <w:bCs/>
+                <w:position w:val="-12"/>
+                <w:sz w:val="28"/>
+                <w:szCs w:val="28"/>
+                <w:highlight w:val="green"/>
+                <w:cs/>
+                <w:lang w:bidi="ta-IN"/>
+              </w:rPr>
+              <w:t>4</w:t>
+            </w:r>
+            <w:r>
+              <w:rPr>
+                <w:rFonts w:ascii="Latha" w:hAnsi="Latha" w:cs="Latha"/>
+                <w:sz w:val="28"/>
+                <w:szCs w:val="28"/>
+                <w:highlight w:val="green"/>
+                <w:cs/>
+                <w:lang w:bidi="ta-IN"/>
+              </w:rPr>
+              <w:t>வோ</w:t>
+            </w:r>
+            <w:r>
+              <w:rPr>
+                <w:rFonts w:ascii="Latha" w:hAnsi="Latha" w:cs="Latha"/>
+                <w:sz w:val="28"/>
+                <w:szCs w:val="28"/>
+                <w:lang w:bidi="ta-IN"/>
+              </w:rPr>
+              <w:t xml:space="preserve"> </w:t>
+            </w:r>
+            <w:r>
+              <w:rPr>
+                <w:rFonts w:ascii="Latha" w:hAnsi="Latha" w:cs="Latha"/>
+                <w:sz w:val="28"/>
+                <w:szCs w:val="28"/>
+                <w:cs/>
+                <w:lang w:bidi="ta-IN"/>
+              </w:rPr>
+              <w:t>வாஜ</w:t>
+            </w:r>
+            <w:r>
+              <w:rPr>
+                <w:rFonts w:ascii="BRH Tamil Tab Extra" w:hAnsi="BRH Tamil Tab Extra" w:cs="Latha"/>
+                <w:b/>
+                <w:sz w:val="36"/>
+                <w:szCs w:val="28"/>
+                <w:lang w:bidi="ta-IN"/>
+              </w:rPr>
+              <w:t>†</w:t>
+            </w:r>
+            <w:r>
+              <w:rPr>
+                <w:rFonts w:ascii="Latha" w:hAnsi="Latha" w:cs="Latha"/>
+                <w:sz w:val="28"/>
+                <w:szCs w:val="28"/>
+                <w:cs/>
+                <w:lang w:bidi="ta-IN"/>
+              </w:rPr>
+              <w:t>ஸ்ய</w:t>
+            </w:r>
+            <w:r>
+              <w:rPr>
+                <w:rFonts w:ascii="Latha" w:hAnsi="Latha" w:cs="Latha"/>
+                <w:sz w:val="28"/>
+                <w:szCs w:val="28"/>
+                <w:lang w:bidi="ta-IN"/>
+              </w:rPr>
+              <w:t xml:space="preserve"> | </w:t>
+            </w:r>
+            <w:r>
+              <w:rPr>
+                <w:rFonts w:ascii="Latha" w:hAnsi="Latha" w:cs="Latha"/>
+                <w:sz w:val="28"/>
+                <w:szCs w:val="28"/>
+                <w:cs/>
+                <w:lang w:bidi="ta-IN"/>
+              </w:rPr>
+              <w:t>வாஜ</w:t>
+            </w:r>
+            <w:r>
+              <w:rPr>
+                <w:rFonts w:ascii="BRH Tamil Tab Extra" w:hAnsi="BRH Tamil Tab Extra" w:cs="Latha"/>
+                <w:b/>
+                <w:sz w:val="36"/>
+                <w:szCs w:val="28"/>
+                <w:lang w:bidi="ta-IN"/>
+              </w:rPr>
+              <w:t>†</w:t>
+            </w:r>
+            <w:r>
+              <w:rPr>
+                <w:rFonts w:ascii="Latha" w:hAnsi="Latha" w:cs="Latha"/>
+                <w:sz w:val="28"/>
+                <w:szCs w:val="28"/>
+                <w:cs/>
+                <w:lang w:bidi="ta-IN"/>
+              </w:rPr>
+              <w:t>ஸ்ய</w:t>
+            </w:r>
+            <w:r>
+              <w:rPr>
+                <w:rFonts w:ascii="BRH Tamil Tab Extra" w:hAnsi="BRH Tamil Tab Extra" w:cs="Latha"/>
+                <w:b/>
+                <w:sz w:val="36"/>
+                <w:szCs w:val="28"/>
+                <w:lang w:bidi="ta-IN"/>
+              </w:rPr>
+              <w:t>…</w:t>
+            </w:r>
+            <w:r>
+              <w:rPr>
+                <w:rFonts w:ascii="Latha" w:hAnsi="Latha" w:cs="Latha"/>
+                <w:sz w:val="28"/>
+                <w:szCs w:val="28"/>
+                <w:lang w:bidi="ta-IN"/>
+              </w:rPr>
+              <w:t xml:space="preserve"> </w:t>
+            </w:r>
+            <w:r>
+              <w:rPr>
+                <w:rFonts w:ascii="Latha" w:hAnsi="Latha" w:cs="Latha"/>
+                <w:sz w:val="28"/>
+                <w:szCs w:val="28"/>
+                <w:cs/>
+                <w:lang w:bidi="ta-IN"/>
+              </w:rPr>
+              <w:t>ஸனி</w:t>
+            </w:r>
+            <w:r>
+              <w:rPr>
+                <w:rFonts w:ascii="BRH Tamil Tab Extra" w:hAnsi="BRH Tamil Tab Extra" w:cs="Latha"/>
+                <w:b/>
+                <w:sz w:val="36"/>
+                <w:szCs w:val="28"/>
+                <w:lang w:bidi="ta-IN"/>
+              </w:rPr>
+              <w:t>†</w:t>
+            </w:r>
+            <w:r>
+              <w:rPr>
+                <w:rFonts w:ascii="Latha" w:hAnsi="Latha" w:cs="Latha"/>
+                <w:sz w:val="28"/>
+                <w:szCs w:val="28"/>
+                <w:cs/>
+                <w:lang w:bidi="ta-IN"/>
+              </w:rPr>
+              <w:t>தா</w:t>
+            </w:r>
+            <w:r>
+              <w:rPr>
+                <w:rFonts w:ascii="Latha" w:hAnsi="Latha" w:cs="Latha"/>
+                <w:sz w:val="28"/>
+                <w:szCs w:val="28"/>
+                <w:lang w:bidi="ta-IN"/>
+              </w:rPr>
+              <w:t xml:space="preserve"> |</w:t>
             </w:r>
           </w:p>
         </w:tc>
@@ -563,7 +1004,7 @@
                 <w:sz w:val="28"/>
                 <w:szCs w:val="32"/>
               </w:rPr>
-              <w:t>8.4</w:t>
+              <w:t>6.2</w:t>
             </w:r>
             <w:r>
               <w:rPr>
@@ -602,17 +1043,7 @@
                 <w:szCs w:val="32"/>
                 <w:lang w:val="en-IN"/>
               </w:rPr>
-              <w:t xml:space="preserve">Krama Vaakyam No. - </w:t>
-            </w:r>
-            <w:r>
-              <w:rPr>
-                <w:rFonts w:cs="Arial"/>
-                <w:b/>
-                <w:sz w:val="28"/>
-                <w:szCs w:val="32"/>
-                <w:lang w:val="en-IN"/>
-              </w:rPr>
-              <w:t>6</w:t>
+              <w:t>Krama Vaakyam No. - 44</w:t>
             </w:r>
           </w:p>
           <w:p>
@@ -631,16 +1062,17 @@
                 <w:b/>
                 <w:sz w:val="28"/>
                 <w:szCs w:val="32"/>
-              </w:rPr>
-            </w:pPr>
-            <w:r>
-              <w:rPr>
-                <w:rFonts w:cs="Arial"/>
-                <w:b/>
-                <w:sz w:val="28"/>
-                <w:szCs w:val="32"/>
                 <w:lang w:val="it-IT"/>
               </w:rPr>
+            </w:pPr>
+            <w:r>
+              <w:rPr>
+                <w:rFonts w:cs="Arial"/>
+                <w:b/>
+                <w:sz w:val="28"/>
+                <w:szCs w:val="32"/>
+                <w:lang w:val="it-IT"/>
+              </w:rPr>
               <w:t>Panchaati No</w:t>
             </w:r>
             <w:r>
@@ -660,7 +1092,17 @@
                 <w:szCs w:val="32"/>
                 <w:lang w:val="it-IT"/>
               </w:rPr>
-              <w:t>32</w:t>
+              <w:t>2</w:t>
+            </w:r>
+            <w:r>
+              <w:rPr>
+                <w:rFonts w:cs="Arial"/>
+                <w:b/>
+                <w:sz w:val="28"/>
+                <w:szCs w:val="32"/>
+                <w:lang w:val="it-IT"/>
+              </w:rPr>
+              <w:t>3</w:t>
             </w:r>
           </w:p>
         </w:tc>
@@ -696,43 +1138,7 @@
                 <w:sz w:val="40"/>
                 <w:szCs w:val="40"/>
               </w:rPr>
-              <w:t>Wû</w:t>
-            </w:r>
-            <w:r>
-              <w:rPr>
-                <w:rFonts w:ascii="BRH Malayalam Extra" w:hAnsi="BRH Malayalam Extra" w:cs="BRH Devanagari Extra"/>
-                <w:color w:val="000000"/>
-                <w:sz w:val="32"/>
-                <w:szCs w:val="40"/>
-              </w:rPr>
-              <w:t>–</w:t>
-            </w:r>
-            <w:r>
-              <w:rPr>
-                <w:rFonts w:ascii="BRH Devanagari Extra" w:hAnsi="BRH Devanagari Extra" w:cs="BRH Devanagari Extra"/>
-                <w:color w:val="000000"/>
-                <w:sz w:val="40"/>
-                <w:szCs w:val="40"/>
-              </w:rPr>
-              <w:t>ÌuÉwÉÉþ ÌuÉkÉåqÉ | ÌuÉ</w:t>
-            </w:r>
-            <w:r>
-              <w:rPr>
-                <w:rFonts w:ascii="BRH Malayalam Extra" w:hAnsi="BRH Malayalam Extra" w:cs="BRH Devanagari Extra"/>
-                <w:color w:val="000000"/>
-                <w:sz w:val="32"/>
-                <w:szCs w:val="40"/>
-              </w:rPr>
-              <w:t>–</w:t>
-            </w:r>
-            <w:r>
-              <w:rPr>
-                <w:rFonts w:ascii="BRH Devanagari Extra" w:hAnsi="BRH Devanagari Extra" w:cs="BRH Devanagari Extra"/>
-                <w:color w:val="000000"/>
-                <w:sz w:val="40"/>
-                <w:szCs w:val="40"/>
-              </w:rPr>
-              <w:t>kÉå</w:t>
+              <w:t>E</w:t>
             </w:r>
             <w:r>
               <w:rPr>
@@ -751,16 +1157,26 @@
                 <w:szCs w:val="40"/>
                 <w:highlight w:val="yellow"/>
               </w:rPr>
-              <w:t>qÉ</w:t>
-            </w:r>
-            <w:r>
-              <w:rPr>
-                <w:rFonts w:ascii="BRH Devanagari Extra" w:hAnsi="BRH Devanagari Extra" w:cs="BRH Devanagari Extra"/>
-                <w:color w:val="000000"/>
-                <w:sz w:val="40"/>
-                <w:szCs w:val="40"/>
-              </w:rPr>
-              <w:t>ÌiÉþ ÌuÉkÉåqÉ ||</w:t>
+              <w:t>ZÉå</w:t>
+            </w:r>
+            <w:r>
+              <w:rPr>
+                <w:rFonts w:ascii="BRH Malayalam Extra" w:hAnsi="BRH Malayalam Extra" w:cs="BRH Devanagari Extra"/>
+                <w:color w:val="000000"/>
+                <w:sz w:val="32"/>
+                <w:szCs w:val="40"/>
+                <w:highlight w:val="yellow"/>
+              </w:rPr>
+              <w:t>–</w:t>
+            </w:r>
+            <w:r>
+              <w:rPr>
+                <w:rFonts w:ascii="BRH Devanagari Extra" w:hAnsi="BRH Devanagari Extra" w:cs="BRH Devanagari Extra"/>
+                <w:color w:val="000000"/>
+                <w:sz w:val="40"/>
+                <w:szCs w:val="40"/>
+              </w:rPr>
+              <w:t xml:space="preserve"> CirÉÑþZÉå ||</w:t>
             </w:r>
           </w:p>
         </w:tc>
@@ -796,43 +1212,7 @@
                 <w:sz w:val="40"/>
                 <w:szCs w:val="40"/>
               </w:rPr>
-              <w:t>Wû</w:t>
-            </w:r>
-            <w:r>
-              <w:rPr>
-                <w:rFonts w:ascii="BRH Malayalam Extra" w:hAnsi="BRH Malayalam Extra" w:cs="BRH Devanagari Extra"/>
-                <w:color w:val="000000"/>
-                <w:sz w:val="32"/>
-                <w:szCs w:val="40"/>
-              </w:rPr>
-              <w:t>–</w:t>
-            </w:r>
-            <w:r>
-              <w:rPr>
-                <w:rFonts w:ascii="BRH Devanagari Extra" w:hAnsi="BRH Devanagari Extra" w:cs="BRH Devanagari Extra"/>
-                <w:color w:val="000000"/>
-                <w:sz w:val="40"/>
-                <w:szCs w:val="40"/>
-              </w:rPr>
-              <w:t>ÌuÉwÉÉþ ÌuÉkÉåqÉ | ÌuÉ</w:t>
-            </w:r>
-            <w:r>
-              <w:rPr>
-                <w:rFonts w:ascii="BRH Malayalam Extra" w:hAnsi="BRH Malayalam Extra" w:cs="BRH Devanagari Extra"/>
-                <w:color w:val="000000"/>
-                <w:sz w:val="32"/>
-                <w:szCs w:val="40"/>
-              </w:rPr>
-              <w:t>–</w:t>
-            </w:r>
-            <w:r>
-              <w:rPr>
-                <w:rFonts w:ascii="BRH Devanagari Extra" w:hAnsi="BRH Devanagari Extra" w:cs="BRH Devanagari Extra"/>
-                <w:color w:val="000000"/>
-                <w:sz w:val="40"/>
-                <w:szCs w:val="40"/>
-              </w:rPr>
-              <w:t>kÉå</w:t>
+              <w:t>E</w:t>
             </w:r>
             <w:r>
               <w:rPr>
@@ -851,16 +1231,25 @@
                 <w:szCs w:val="40"/>
                 <w:highlight w:val="green"/>
               </w:rPr>
-              <w:t>qÉ</w:t>
-            </w:r>
-            <w:r>
-              <w:rPr>
-                <w:rFonts w:ascii="BRH Devanagari Extra" w:hAnsi="BRH Devanagari Extra" w:cs="BRH Devanagari Extra"/>
-                <w:color w:val="000000"/>
-                <w:sz w:val="40"/>
-                <w:szCs w:val="40"/>
-              </w:rPr>
-              <w:t>åÌiÉþ ÌuÉkÉåqÉ ||</w:t>
+              <w:t>ZÉ</w:t>
+            </w:r>
+            <w:r>
+              <w:rPr>
+                <w:rFonts w:ascii="BRH Malayalam Extra" w:hAnsi="BRH Malayalam Extra" w:cs="BRH Devanagari Extra"/>
+                <w:color w:val="000000"/>
+                <w:sz w:val="32"/>
+                <w:szCs w:val="40"/>
+              </w:rPr>
+              <w:t>–</w:t>
+            </w:r>
+            <w:r>
+              <w:rPr>
+                <w:rFonts w:ascii="BRH Devanagari Extra" w:hAnsi="BRH Devanagari Extra" w:cs="BRH Devanagari Extra"/>
+                <w:color w:val="000000"/>
+                <w:sz w:val="40"/>
+                <w:szCs w:val="40"/>
+              </w:rPr>
+              <w:t xml:space="preserve"> CirÉÑþZÉå ||</w:t>
             </w:r>
           </w:p>
         </w:tc>
@@ -897,6 +1286,151 @@
                 <w:szCs w:val="32"/>
               </w:rPr>
             </w:pPr>
+            <w:r>
+              <w:rPr>
+                <w:rFonts w:cs="Arial"/>
+                <w:b/>
+                <w:sz w:val="28"/>
+                <w:szCs w:val="32"/>
+              </w:rPr>
+              <w:t>T.S.4.1.</w:t>
+            </w:r>
+            <w:r>
+              <w:rPr>
+                <w:rFonts w:cs="Arial"/>
+                <w:b/>
+                <w:sz w:val="28"/>
+                <w:szCs w:val="32"/>
+              </w:rPr>
+              <w:t>6.2</w:t>
+            </w:r>
+            <w:r>
+              <w:rPr>
+                <w:rFonts w:cs="Arial"/>
+                <w:b/>
+                <w:sz w:val="28"/>
+                <w:szCs w:val="32"/>
+              </w:rPr>
+              <w:t xml:space="preserve"> – Kramam</w:t>
+            </w:r>
+          </w:p>
+          <w:p>
+            <w:pPr>
+              <w:widowControl w:val="0"/>
+              <w:tabs>
+                <w:tab w:val="left" w:pos="993"/>
+              </w:tabs>
+              <w:autoSpaceDE w:val="0"/>
+              <w:autoSpaceDN w:val="0"/>
+              <w:adjustRightInd w:val="0"/>
+              <w:spacing w:before="0" w:line="252" w:lineRule="auto"/>
+              <w:ind w:right="297"/>
+              <w:rPr>
+                <w:rFonts w:cs="Arial"/>
+                <w:b/>
+                <w:sz w:val="28"/>
+                <w:szCs w:val="32"/>
+                <w:lang w:val="en-IN"/>
+              </w:rPr>
+            </w:pPr>
+            <w:r>
+              <w:rPr>
+                <w:rFonts w:cs="Arial"/>
+                <w:b/>
+                <w:sz w:val="28"/>
+                <w:szCs w:val="32"/>
+                <w:lang w:val="en-IN"/>
+              </w:rPr>
+              <w:t xml:space="preserve">Krama Vaakyam No. </w:t>
+            </w:r>
+            <w:r>
+              <w:rPr>
+                <w:rFonts w:cs="Arial"/>
+                <w:b/>
+                <w:sz w:val="28"/>
+                <w:szCs w:val="32"/>
+                <w:lang w:val="en-IN"/>
+              </w:rPr>
+              <w:t>–</w:t>
+            </w:r>
+            <w:r>
+              <w:rPr>
+                <w:rFonts w:cs="Arial"/>
+                <w:b/>
+                <w:sz w:val="28"/>
+                <w:szCs w:val="32"/>
+                <w:lang w:val="en-IN"/>
+              </w:rPr>
+              <w:t xml:space="preserve"> </w:t>
+            </w:r>
+            <w:r>
+              <w:rPr>
+                <w:rFonts w:cs="Arial"/>
+                <w:b/>
+                <w:sz w:val="28"/>
+                <w:szCs w:val="32"/>
+                <w:lang w:val="en-IN"/>
+              </w:rPr>
+              <w:t>55 and 56</w:t>
+            </w:r>
+          </w:p>
+          <w:p>
+            <w:pPr>
+              <w:widowControl w:val="0"/>
+              <w:tabs>
+                <w:tab w:val="left" w:pos="993"/>
+              </w:tabs>
+              <w:autoSpaceDE w:val="0"/>
+              <w:autoSpaceDN w:val="0"/>
+              <w:adjustRightInd w:val="0"/>
+              <w:spacing w:before="0" w:line="252" w:lineRule="auto"/>
+              <w:ind w:right="297"/>
+              <w:rPr>
+                <w:rFonts w:cs="Arial"/>
+                <w:b/>
+                <w:sz w:val="28"/>
+                <w:szCs w:val="32"/>
+              </w:rPr>
+            </w:pPr>
+            <w:r>
+              <w:rPr>
+                <w:rFonts w:cs="Arial"/>
+                <w:b/>
+                <w:sz w:val="28"/>
+                <w:szCs w:val="32"/>
+                <w:lang w:val="it-IT"/>
+              </w:rPr>
+              <w:t>Panchaati No</w:t>
+            </w:r>
+            <w:r>
+              <w:rPr>
+                <w:rFonts w:cs="Arial"/>
+                <w:b/>
+                <w:szCs w:val="32"/>
+                <w:lang w:val="it-IT"/>
+              </w:rPr>
+              <w:t xml:space="preserve">. - </w:t>
+            </w:r>
+            <w:r>
+              <w:rPr>
+                <w:rFonts w:cs="Arial"/>
+                <w:b/>
+                <w:sz w:val="28"/>
+                <w:szCs w:val="32"/>
+                <w:lang w:val="it-IT"/>
+              </w:rPr>
+              <w:t>2</w:t>
+            </w:r>
+            <w:r>
+              <w:rPr>
+                <w:rFonts w:cs="Arial"/>
+                <w:b/>
+                <w:sz w:val="28"/>
+                <w:szCs w:val="32"/>
+                <w:lang w:val="it-IT"/>
+              </w:rPr>
+              <w:t>3</w:t>
+            </w:r>
           </w:p>
         </w:tc>
         <w:tc>
@@ -917,12 +1451,414 @@
               <w:adjustRightInd w:val="0"/>
               <w:spacing w:before="0" w:line="240" w:lineRule="auto"/>
               <w:rPr>
-                <w:rFonts w:ascii="BRH Devanagari Extra" w:hAnsi="BRH Devanagari Extra" w:cs="BRH Devanagari Extra"/>
-                <w:color w:val="000000"/>
-                <w:sz w:val="40"/>
-                <w:szCs w:val="40"/>
-              </w:rPr>
-            </w:pPr>
+                <w:rFonts w:ascii="Latha" w:hAnsi="Latha" w:cs="Latha"/>
+                <w:sz w:val="28"/>
+                <w:szCs w:val="28"/>
+                <w:lang w:bidi="ta-IN"/>
+              </w:rPr>
+            </w:pPr>
+            <w:r>
+              <w:rPr>
+                <w:rFonts w:ascii="Latha" w:hAnsi="Latha" w:cs="Latha"/>
+                <w:sz w:val="28"/>
+                <w:szCs w:val="28"/>
+                <w:cs/>
+                <w:lang w:bidi="ta-IN"/>
+              </w:rPr>
+              <w:t>த</w:t>
+            </w:r>
+            <w:r>
+              <w:rPr>
+                <w:rFonts w:ascii="BRH Tamil Tab Extra" w:hAnsi="BRH Tamil Tab Extra" w:cs="Latha"/>
+                <w:b/>
+                <w:sz w:val="36"/>
+                <w:szCs w:val="28"/>
+                <w:lang w:bidi="ta-IN"/>
+              </w:rPr>
+              <w:t>…</w:t>
+            </w:r>
+            <w:r>
+              <w:rPr>
+                <w:rFonts w:ascii="Latha" w:hAnsi="Latha" w:cs="Latha"/>
+                <w:b/>
+                <w:bCs/>
+                <w:position w:val="-12"/>
+                <w:sz w:val="28"/>
+                <w:szCs w:val="28"/>
+                <w:cs/>
+                <w:lang w:bidi="ta-IN"/>
+              </w:rPr>
+              <w:t>3</w:t>
+            </w:r>
+            <w:r>
+              <w:rPr>
+                <w:rFonts w:ascii="Latha" w:hAnsi="Latha" w:cs="Latha"/>
+                <w:sz w:val="28"/>
+                <w:szCs w:val="28"/>
+                <w:cs/>
+                <w:lang w:bidi="ta-IN"/>
+              </w:rPr>
+              <w:t>தா</w:t>
+            </w:r>
+            <w:r>
+              <w:rPr>
+                <w:rFonts w:ascii="BRH Tamil Tab Extra" w:hAnsi="BRH Tamil Tab Extra" w:cs="Latha"/>
+                <w:b/>
+                <w:sz w:val="36"/>
+                <w:szCs w:val="28"/>
+                <w:lang w:bidi="ta-IN"/>
+              </w:rPr>
+              <w:t>…</w:t>
+            </w:r>
+            <w:r>
+              <w:rPr>
+                <w:rFonts w:ascii="Latha" w:hAnsi="Latha" w:cs="Latha"/>
+                <w:b/>
+                <w:bCs/>
+                <w:position w:val="-12"/>
+                <w:sz w:val="28"/>
+                <w:szCs w:val="28"/>
+                <w:cs/>
+                <w:lang w:bidi="ta-IN"/>
+              </w:rPr>
+              <w:t>3</w:t>
+            </w:r>
+            <w:r>
+              <w:rPr>
+                <w:rFonts w:ascii="Latha" w:hAnsi="Latha" w:cs="Latha"/>
+                <w:sz w:val="28"/>
+                <w:szCs w:val="28"/>
+                <w:cs/>
+                <w:lang w:bidi="ta-IN"/>
+              </w:rPr>
+              <w:t>ம்ய</w:t>
+            </w:r>
+            <w:r>
+              <w:rPr>
+                <w:rFonts w:ascii="Latha" w:hAnsi="Latha" w:cs="Latha"/>
+                <w:sz w:val="28"/>
+                <w:szCs w:val="28"/>
+                <w:highlight w:val="yellow"/>
+                <w:cs/>
+                <w:lang w:bidi="ta-IN"/>
+              </w:rPr>
+              <w:t>பி</w:t>
+            </w:r>
+            <w:r>
+              <w:rPr>
+                <w:rFonts w:ascii="BRH Tamil Tab Extra" w:hAnsi="BRH Tamil Tab Extra" w:cs="Latha"/>
+                <w:b/>
+                <w:sz w:val="36"/>
+                <w:szCs w:val="28"/>
+                <w:highlight w:val="yellow"/>
+                <w:lang w:bidi="ta-IN"/>
+              </w:rPr>
+              <w:t>†</w:t>
+            </w:r>
+            <w:r>
+              <w:rPr>
+                <w:rFonts w:ascii="Latha" w:hAnsi="Latha" w:cs="Latha"/>
+                <w:b/>
+                <w:bCs/>
+                <w:position w:val="-12"/>
+                <w:sz w:val="28"/>
+                <w:szCs w:val="28"/>
+                <w:highlight w:val="yellow"/>
+                <w:cs/>
+                <w:lang w:bidi="ta-IN"/>
+              </w:rPr>
+              <w:t>4</w:t>
+            </w:r>
+            <w:r>
+              <w:rPr>
+                <w:rFonts w:ascii="Latha" w:hAnsi="Latha" w:cs="Latha"/>
+                <w:sz w:val="28"/>
+                <w:szCs w:val="28"/>
+                <w:highlight w:val="yellow"/>
+                <w:cs/>
+                <w:lang w:bidi="ta-IN"/>
+              </w:rPr>
+              <w:t>த்யை</w:t>
+            </w:r>
+            <w:r>
+              <w:rPr>
+                <w:rFonts w:ascii="Latha" w:hAnsi="Latha" w:cs="Latha"/>
+                <w:sz w:val="28"/>
+                <w:szCs w:val="28"/>
+                <w:lang w:bidi="ta-IN"/>
+              </w:rPr>
+              <w:t xml:space="preserve"> | </w:t>
+            </w:r>
+            <w:r>
+              <w:rPr>
+                <w:rFonts w:ascii="Latha" w:hAnsi="Latha" w:cs="Latha"/>
+                <w:sz w:val="28"/>
+                <w:szCs w:val="28"/>
+                <w:lang w:bidi="ta-IN"/>
+              </w:rPr>
+              <w:br/>
+            </w:r>
+            <w:r>
+              <w:rPr>
+                <w:rFonts w:ascii="Latha" w:hAnsi="Latha" w:cs="Latha"/>
+                <w:sz w:val="28"/>
+                <w:szCs w:val="28"/>
+                <w:cs/>
+                <w:lang w:bidi="ta-IN"/>
+              </w:rPr>
+              <w:t>அபி</w:t>
+            </w:r>
+            <w:r>
+              <w:rPr>
+                <w:rFonts w:ascii="BRH Tamil Tab Extra" w:hAnsi="BRH Tamil Tab Extra" w:cs="Latha"/>
+                <w:b/>
+                <w:sz w:val="36"/>
+                <w:szCs w:val="28"/>
+                <w:lang w:bidi="ta-IN"/>
+              </w:rPr>
+              <w:t>†</w:t>
+            </w:r>
+            <w:r>
+              <w:rPr>
+                <w:rFonts w:ascii="Latha" w:hAnsi="Latha" w:cs="Latha"/>
+                <w:b/>
+                <w:bCs/>
+                <w:position w:val="-12"/>
+                <w:sz w:val="28"/>
+                <w:szCs w:val="28"/>
+                <w:cs/>
+                <w:lang w:bidi="ta-IN"/>
+              </w:rPr>
+              <w:t>4</w:t>
+            </w:r>
+            <w:r>
+              <w:rPr>
+                <w:rFonts w:ascii="Latha" w:hAnsi="Latha" w:cs="Latha"/>
+                <w:sz w:val="28"/>
+                <w:szCs w:val="28"/>
+                <w:highlight w:val="yellow"/>
+                <w:cs/>
+                <w:lang w:bidi="ta-IN"/>
+              </w:rPr>
+              <w:t>த்யா</w:t>
+            </w:r>
+            <w:r>
+              <w:rPr>
+                <w:rFonts w:ascii="BRH Tamil Tab Extra" w:hAnsi="BRH Tamil Tab Extra" w:cs="Latha"/>
+                <w:b/>
+                <w:sz w:val="36"/>
+                <w:szCs w:val="28"/>
+                <w:lang w:bidi="ta-IN"/>
+              </w:rPr>
+              <w:t>…</w:t>
+            </w:r>
+            <w:r>
+              <w:rPr>
+                <w:rFonts w:ascii="Latha" w:hAnsi="Latha" w:cs="Latha"/>
+                <w:sz w:val="28"/>
+                <w:szCs w:val="28"/>
+                <w:lang w:bidi="ta-IN"/>
+              </w:rPr>
+              <w:t xml:space="preserve"> </w:t>
+            </w:r>
+            <w:r>
+              <w:rPr>
+                <w:rFonts w:ascii="Latha" w:hAnsi="Latha" w:cs="Latha"/>
+                <w:sz w:val="28"/>
+                <w:szCs w:val="28"/>
+                <w:cs/>
+                <w:lang w:bidi="ta-IN"/>
+              </w:rPr>
+              <w:t>இத்யபி</w:t>
+            </w:r>
+            <w:r>
+              <w:rPr>
+                <w:rFonts w:ascii="BRH Tamil Tab Extra" w:hAnsi="BRH Tamil Tab Extra" w:cs="Latha"/>
+                <w:b/>
+                <w:sz w:val="36"/>
+                <w:szCs w:val="28"/>
+                <w:lang w:bidi="ta-IN"/>
+              </w:rPr>
+              <w:t>†</w:t>
+            </w:r>
+            <w:r>
+              <w:rPr>
+                <w:rFonts w:ascii="Latha" w:hAnsi="Latha" w:cs="Latha"/>
+                <w:b/>
+                <w:bCs/>
+                <w:position w:val="-12"/>
+                <w:sz w:val="28"/>
+                <w:szCs w:val="28"/>
+                <w:highlight w:val="yellow"/>
+                <w:cs/>
+                <w:lang w:bidi="ta-IN"/>
+              </w:rPr>
+              <w:t>4</w:t>
+            </w:r>
+            <w:r>
+              <w:rPr>
+                <w:rFonts w:ascii="Latha" w:hAnsi="Latha" w:cs="Latha"/>
+                <w:sz w:val="28"/>
+                <w:szCs w:val="28"/>
+                <w:highlight w:val="yellow"/>
+                <w:cs/>
+                <w:lang w:bidi="ta-IN"/>
+              </w:rPr>
+              <w:t>த்யை</w:t>
+            </w:r>
+            <w:r>
+              <w:rPr>
+                <w:rFonts w:ascii="Latha" w:hAnsi="Latha" w:cs="Latha"/>
+                <w:sz w:val="28"/>
+                <w:szCs w:val="28"/>
+                <w:lang w:bidi="ta-IN"/>
+              </w:rPr>
+              <w:t xml:space="preserve"> ||</w:t>
+            </w:r>
+          </w:p>
+          <w:p>
+            <w:pPr>
+              <w:widowControl w:val="0"/>
+              <w:autoSpaceDE w:val="0"/>
+              <w:autoSpaceDN w:val="0"/>
+              <w:adjustRightInd w:val="0"/>
+              <w:spacing w:before="0" w:line="240" w:lineRule="auto"/>
+              <w:rPr>
+                <w:rFonts w:ascii="BRH Devanagari Extra" w:hAnsi="BRH Devanagari Extra" w:cs="BRH Devanagari Extra"/>
+                <w:color w:val="000000"/>
+                <w:sz w:val="40"/>
+                <w:szCs w:val="40"/>
+              </w:rPr>
+            </w:pPr>
+            <w:r>
+              <w:rPr>
+                <w:rFonts w:ascii="BRH Devanagari Extra" w:hAnsi="BRH Devanagari Extra" w:cs="BRH Devanagari Extra"/>
+                <w:color w:val="000000"/>
+                <w:sz w:val="40"/>
+                <w:szCs w:val="40"/>
+              </w:rPr>
+              <w:t>S</w:t>
+            </w:r>
+            <w:r>
+              <w:rPr>
+                <w:rFonts w:ascii="BRH Malayalam Extra" w:hAnsi="BRH Malayalam Extra" w:cs="BRH Devanagari Extra"/>
+                <w:color w:val="000000"/>
+                <w:sz w:val="32"/>
+                <w:szCs w:val="40"/>
+              </w:rPr>
+              <w:t>–</w:t>
+            </w:r>
+            <w:r>
+              <w:rPr>
+                <w:rFonts w:ascii="BRH Devanagari Extra" w:hAnsi="BRH Devanagari Extra" w:cs="BRH Devanagari Extra"/>
+                <w:color w:val="000000"/>
+                <w:sz w:val="40"/>
+                <w:szCs w:val="40"/>
+              </w:rPr>
+              <w:t>SÉ</w:t>
+            </w:r>
+            <w:r>
+              <w:rPr>
+                <w:rFonts w:ascii="BRH Malayalam Extra" w:hAnsi="BRH Malayalam Extra" w:cs="BRH Devanagari Extra"/>
+                <w:color w:val="000000"/>
+                <w:sz w:val="32"/>
+                <w:szCs w:val="40"/>
+              </w:rPr>
+              <w:t>–</w:t>
+            </w:r>
+            <w:r>
+              <w:rPr>
+                <w:rFonts w:ascii="BRH Devanagari Extra" w:hAnsi="BRH Devanagari Extra" w:cs="BRH Devanagari Extra"/>
+                <w:color w:val="000000"/>
+                <w:sz w:val="40"/>
+                <w:szCs w:val="40"/>
+              </w:rPr>
+              <w:t>qrÉ</w:t>
+            </w:r>
+            <w:r>
+              <w:rPr>
+                <w:rFonts w:ascii="BRH Devanagari Extra" w:hAnsi="BRH Devanagari Extra" w:cs="BRH Devanagari Extra"/>
+                <w:color w:val="EE0000"/>
+                <w:sz w:val="40"/>
+                <w:szCs w:val="40"/>
+                <w:highlight w:val="yellow"/>
+              </w:rPr>
+              <w:t>ÍpÉþirÉæ</w:t>
+            </w:r>
+            <w:r>
+              <w:rPr>
+                <w:rFonts w:ascii="BRH Devanagari Extra" w:hAnsi="BRH Devanagari Extra" w:cs="BRH Devanagari Extra"/>
+                <w:color w:val="000000"/>
+                <w:sz w:val="40"/>
+                <w:szCs w:val="40"/>
+              </w:rPr>
+              <w:t xml:space="preserve"> | A</w:t>
+            </w:r>
+            <w:r>
+              <w:rPr>
+                <w:rFonts w:ascii="BRH Devanagari Extra" w:hAnsi="BRH Devanagari Extra" w:cs="BRH Devanagari Extra"/>
+                <w:sz w:val="40"/>
+                <w:szCs w:val="40"/>
+              </w:rPr>
+              <w:t>ÍpÉ</w:t>
+            </w:r>
+            <w:r>
+              <w:rPr>
+                <w:rFonts w:ascii="BRH Devanagari Extra" w:hAnsi="BRH Devanagari Extra" w:cs="BRH Devanagari Extra"/>
+                <w:color w:val="EE0000"/>
+                <w:sz w:val="40"/>
+                <w:szCs w:val="40"/>
+                <w:highlight w:val="yellow"/>
+              </w:rPr>
+              <w:t>þirÉÉ</w:t>
+            </w:r>
+            <w:r>
+              <w:rPr>
+                <w:rFonts w:ascii="BRH Malayalam Extra" w:hAnsi="BRH Malayalam Extra" w:cs="BRH Devanagari Extra"/>
+                <w:color w:val="EE0000"/>
+                <w:sz w:val="32"/>
+                <w:szCs w:val="40"/>
+                <w:highlight w:val="yellow"/>
+              </w:rPr>
+              <w:t>–</w:t>
+            </w:r>
+            <w:r>
+              <w:rPr>
+                <w:rFonts w:ascii="BRH Devanagari Extra" w:hAnsi="BRH Devanagari Extra" w:cs="BRH Devanagari Extra"/>
+                <w:color w:val="000000"/>
+                <w:sz w:val="40"/>
+                <w:szCs w:val="40"/>
+              </w:rPr>
+              <w:t xml:space="preserve"> CirÉÍpÉþ</w:t>
+            </w:r>
+            <w:r>
+              <w:rPr>
+                <w:rFonts w:ascii="BRH Devanagari Extra" w:hAnsi="BRH Devanagari Extra" w:cs="BRH Devanagari Extra"/>
+                <w:color w:val="EE0000"/>
+                <w:sz w:val="40"/>
+                <w:szCs w:val="40"/>
+                <w:highlight w:val="yellow"/>
+              </w:rPr>
+              <w:t>irÉæ</w:t>
+            </w:r>
+            <w:r>
+              <w:rPr>
+                <w:rFonts w:ascii="BRH Devanagari Extra" w:hAnsi="BRH Devanagari Extra" w:cs="BRH Devanagari Extra"/>
+                <w:color w:val="EE0000"/>
+                <w:sz w:val="40"/>
+                <w:szCs w:val="40"/>
+              </w:rPr>
+              <w:t xml:space="preserve"> </w:t>
+            </w:r>
+            <w:r>
+              <w:rPr>
+                <w:rFonts w:ascii="BRH Devanagari Extra" w:hAnsi="BRH Devanagari Extra" w:cs="BRH Devanagari Extra"/>
+                <w:color w:val="000000"/>
+                <w:sz w:val="40"/>
+                <w:szCs w:val="40"/>
+              </w:rPr>
+              <w:t>||</w:t>
+            </w:r>
           </w:p>
         </w:tc>
         <w:tc>
@@ -943,6 +1879,754 @@
               <w:adjustRightInd w:val="0"/>
               <w:spacing w:before="0" w:line="240" w:lineRule="auto"/>
               <w:rPr>
+                <w:rFonts w:ascii="Latha" w:hAnsi="Latha" w:cs="Latha"/>
+                <w:sz w:val="28"/>
+                <w:szCs w:val="28"/>
+                <w:lang w:bidi="ta-IN"/>
+              </w:rPr>
+            </w:pPr>
+            <w:r>
+              <w:rPr>
+                <w:rFonts w:ascii="Latha" w:hAnsi="Latha" w:cs="Latha"/>
+                <w:sz w:val="28"/>
+                <w:szCs w:val="28"/>
+                <w:cs/>
+                <w:lang w:bidi="ta-IN"/>
+              </w:rPr>
+              <w:t>த</w:t>
+            </w:r>
+            <w:r>
+              <w:rPr>
+                <w:rFonts w:ascii="BRH Tamil Tab Extra" w:hAnsi="BRH Tamil Tab Extra" w:cs="Latha"/>
+                <w:b/>
+                <w:sz w:val="36"/>
+                <w:szCs w:val="28"/>
+                <w:lang w:bidi="ta-IN"/>
+              </w:rPr>
+              <w:t>…</w:t>
+            </w:r>
+            <w:r>
+              <w:rPr>
+                <w:rFonts w:ascii="Latha" w:hAnsi="Latha" w:cs="Latha"/>
+                <w:b/>
+                <w:bCs/>
+                <w:position w:val="-12"/>
+                <w:sz w:val="28"/>
+                <w:szCs w:val="28"/>
+                <w:cs/>
+                <w:lang w:bidi="ta-IN"/>
+              </w:rPr>
+              <w:t>3</w:t>
+            </w:r>
+            <w:r>
+              <w:rPr>
+                <w:rFonts w:ascii="Latha" w:hAnsi="Latha" w:cs="Latha"/>
+                <w:sz w:val="28"/>
+                <w:szCs w:val="28"/>
+                <w:cs/>
+                <w:lang w:bidi="ta-IN"/>
+              </w:rPr>
+              <w:t>தா</w:t>
+            </w:r>
+            <w:r>
+              <w:rPr>
+                <w:rFonts w:ascii="BRH Tamil Tab Extra" w:hAnsi="BRH Tamil Tab Extra" w:cs="Latha"/>
+                <w:b/>
+                <w:sz w:val="36"/>
+                <w:szCs w:val="28"/>
+                <w:lang w:bidi="ta-IN"/>
+              </w:rPr>
+              <w:t>…</w:t>
+            </w:r>
+            <w:r>
+              <w:rPr>
+                <w:rFonts w:ascii="Latha" w:hAnsi="Latha" w:cs="Latha"/>
+                <w:b/>
+                <w:bCs/>
+                <w:position w:val="-12"/>
+                <w:sz w:val="28"/>
+                <w:szCs w:val="28"/>
+                <w:cs/>
+                <w:lang w:bidi="ta-IN"/>
+              </w:rPr>
+              <w:t>3</w:t>
+            </w:r>
+            <w:r>
+              <w:rPr>
+                <w:rFonts w:ascii="Latha" w:hAnsi="Latha" w:cs="Latha"/>
+                <w:sz w:val="28"/>
+                <w:szCs w:val="28"/>
+                <w:cs/>
+                <w:lang w:bidi="ta-IN"/>
+              </w:rPr>
+              <w:t>ம்ய</w:t>
+            </w:r>
+            <w:r>
+              <w:rPr>
+                <w:rFonts w:ascii="Latha" w:hAnsi="Latha" w:cs="Latha"/>
+                <w:sz w:val="28"/>
+                <w:szCs w:val="28"/>
+                <w:cs/>
+                <w:lang w:bidi="ta-IN"/>
+              </w:rPr>
+              <w:t>பி</w:t>
+            </w:r>
+            <w:r>
+              <w:rPr>
+                <w:rFonts w:ascii="BRH Tamil Tab Extra" w:hAnsi="BRH Tamil Tab Extra" w:cs="Latha"/>
+                <w:b/>
+                <w:sz w:val="36"/>
+                <w:szCs w:val="28"/>
+                <w:lang w:bidi="ta-IN"/>
+              </w:rPr>
+              <w:t>†</w:t>
+            </w:r>
+            <w:r>
+              <w:rPr>
+                <w:rFonts w:ascii="Latha" w:hAnsi="Latha" w:cs="Latha"/>
+                <w:b/>
+                <w:bCs/>
+                <w:position w:val="-12"/>
+                <w:sz w:val="28"/>
+                <w:szCs w:val="28"/>
+                <w:highlight w:val="green"/>
+                <w:cs/>
+                <w:lang w:bidi="ta-IN"/>
+              </w:rPr>
+              <w:t>4</w:t>
+            </w:r>
+            <w:r>
+              <w:rPr>
+                <w:rFonts w:ascii="Latha" w:hAnsi="Latha" w:cs="Latha"/>
+                <w:sz w:val="28"/>
+                <w:szCs w:val="28"/>
+                <w:highlight w:val="green"/>
+                <w:cs/>
+                <w:lang w:bidi="ta-IN"/>
+              </w:rPr>
+              <w:t>த்த்யை</w:t>
+            </w:r>
+            <w:r>
+              <w:rPr>
+                <w:rFonts w:ascii="Latha" w:hAnsi="Latha" w:cs="Latha"/>
+                <w:sz w:val="28"/>
+                <w:szCs w:val="28"/>
+                <w:lang w:bidi="ta-IN"/>
+              </w:rPr>
+              <w:t xml:space="preserve"> | </w:t>
+            </w:r>
+            <w:r>
+              <w:rPr>
+                <w:rFonts w:ascii="Latha" w:hAnsi="Latha" w:cs="Latha"/>
+                <w:sz w:val="28"/>
+                <w:szCs w:val="28"/>
+                <w:lang w:bidi="ta-IN"/>
+              </w:rPr>
+              <w:br/>
+            </w:r>
+            <w:r>
+              <w:rPr>
+                <w:rFonts w:ascii="Latha" w:hAnsi="Latha" w:cs="Latha"/>
+                <w:sz w:val="28"/>
+                <w:szCs w:val="28"/>
+                <w:cs/>
+                <w:lang w:bidi="ta-IN"/>
+              </w:rPr>
+              <w:t>அபி</w:t>
+            </w:r>
+            <w:r>
+              <w:rPr>
+                <w:rFonts w:ascii="BRH Tamil Tab Extra" w:hAnsi="BRH Tamil Tab Extra" w:cs="Latha"/>
+                <w:b/>
+                <w:sz w:val="36"/>
+                <w:szCs w:val="28"/>
+                <w:lang w:bidi="ta-IN"/>
+              </w:rPr>
+              <w:t>†</w:t>
+            </w:r>
+            <w:r>
+              <w:rPr>
+                <w:rFonts w:ascii="Latha" w:hAnsi="Latha" w:cs="Latha"/>
+                <w:b/>
+                <w:bCs/>
+                <w:position w:val="-12"/>
+                <w:sz w:val="28"/>
+                <w:szCs w:val="28"/>
+                <w:cs/>
+                <w:lang w:bidi="ta-IN"/>
+              </w:rPr>
+              <w:t>4</w:t>
+            </w:r>
+            <w:r>
+              <w:rPr>
+                <w:rFonts w:ascii="Latha" w:hAnsi="Latha" w:cs="Latha"/>
+                <w:sz w:val="28"/>
+                <w:szCs w:val="28"/>
+                <w:highlight w:val="green"/>
+                <w:cs/>
+                <w:lang w:bidi="ta-IN"/>
+              </w:rPr>
+              <w:t>த்</w:t>
+            </w:r>
+            <w:r>
+              <w:rPr>
+                <w:rFonts w:ascii="Latha" w:hAnsi="Latha" w:cs="Latha"/>
+                <w:sz w:val="28"/>
+                <w:szCs w:val="28"/>
+                <w:cs/>
+                <w:lang w:bidi="ta-IN"/>
+              </w:rPr>
+              <w:t>த்யா</w:t>
+            </w:r>
+            <w:r>
+              <w:rPr>
+                <w:rFonts w:ascii="BRH Tamil Tab Extra" w:hAnsi="BRH Tamil Tab Extra" w:cs="Latha"/>
+                <w:b/>
+                <w:sz w:val="36"/>
+                <w:szCs w:val="28"/>
+                <w:lang w:bidi="ta-IN"/>
+              </w:rPr>
+              <w:t>…</w:t>
+            </w:r>
+            <w:r>
+              <w:rPr>
+                <w:rFonts w:ascii="Latha" w:hAnsi="Latha" w:cs="Latha"/>
+                <w:sz w:val="28"/>
+                <w:szCs w:val="28"/>
+                <w:lang w:bidi="ta-IN"/>
+              </w:rPr>
+              <w:t xml:space="preserve"> </w:t>
+            </w:r>
+            <w:r>
+              <w:rPr>
+                <w:rFonts w:ascii="Latha" w:hAnsi="Latha" w:cs="Latha"/>
+                <w:sz w:val="28"/>
+                <w:szCs w:val="28"/>
+                <w:cs/>
+                <w:lang w:bidi="ta-IN"/>
+              </w:rPr>
+              <w:t>இத்யபி</w:t>
+            </w:r>
+            <w:r>
+              <w:rPr>
+                <w:rFonts w:ascii="BRH Tamil Tab Extra" w:hAnsi="BRH Tamil Tab Extra" w:cs="Latha"/>
+                <w:b/>
+                <w:sz w:val="36"/>
+                <w:szCs w:val="28"/>
+                <w:lang w:bidi="ta-IN"/>
+              </w:rPr>
+              <w:t>†</w:t>
+            </w:r>
+            <w:r>
+              <w:rPr>
+                <w:rFonts w:ascii="Latha" w:hAnsi="Latha" w:cs="Latha"/>
+                <w:b/>
+                <w:bCs/>
+                <w:position w:val="-12"/>
+                <w:sz w:val="28"/>
+                <w:szCs w:val="28"/>
+                <w:cs/>
+                <w:lang w:bidi="ta-IN"/>
+              </w:rPr>
+              <w:t>4</w:t>
+            </w:r>
+            <w:r>
+              <w:rPr>
+                <w:rFonts w:ascii="Latha" w:hAnsi="Latha" w:cs="Latha"/>
+                <w:sz w:val="28"/>
+                <w:szCs w:val="28"/>
+                <w:cs/>
+                <w:lang w:bidi="ta-IN"/>
+              </w:rPr>
+              <w:t>த்</w:t>
+            </w:r>
+            <w:r>
+              <w:rPr>
+                <w:rFonts w:ascii="Latha" w:hAnsi="Latha" w:cs="Latha"/>
+                <w:sz w:val="28"/>
+                <w:szCs w:val="28"/>
+                <w:highlight w:val="green"/>
+                <w:cs/>
+                <w:lang w:bidi="ta-IN"/>
+              </w:rPr>
+              <w:t>த்</w:t>
+            </w:r>
+            <w:r>
+              <w:rPr>
+                <w:rFonts w:ascii="Latha" w:hAnsi="Latha" w:cs="Latha"/>
+                <w:sz w:val="28"/>
+                <w:szCs w:val="28"/>
+                <w:cs/>
+                <w:lang w:bidi="ta-IN"/>
+              </w:rPr>
+              <w:t>யை</w:t>
+            </w:r>
+            <w:r>
+              <w:rPr>
+                <w:rFonts w:ascii="Latha" w:hAnsi="Latha" w:cs="Latha"/>
+                <w:sz w:val="28"/>
+                <w:szCs w:val="28"/>
+                <w:lang w:bidi="ta-IN"/>
+              </w:rPr>
+              <w:t xml:space="preserve"> ||</w:t>
+            </w:r>
+          </w:p>
+          <w:p>
+            <w:pPr>
+              <w:widowControl w:val="0"/>
+              <w:autoSpaceDE w:val="0"/>
+              <w:autoSpaceDN w:val="0"/>
+              <w:adjustRightInd w:val="0"/>
+              <w:spacing w:before="0" w:line="240" w:lineRule="auto"/>
+              <w:rPr>
+                <w:rFonts w:ascii="BRH Devanagari Extra" w:hAnsi="BRH Devanagari Extra" w:cs="BRH Devanagari Extra"/>
+                <w:color w:val="000000"/>
+                <w:sz w:val="40"/>
+                <w:szCs w:val="40"/>
+              </w:rPr>
+            </w:pPr>
+            <w:r>
+              <w:rPr>
+                <w:rFonts w:ascii="Latha" w:hAnsi="Latha" w:cs="Latha"/>
+                <w:color w:val="000000"/>
+                <w:sz w:val="28"/>
+                <w:szCs w:val="28"/>
+                <w:highlight w:val="green"/>
+                <w:lang w:bidi="ta-IN"/>
+              </w:rPr>
+              <w:t>(add extra t)</w:t>
+            </w:r>
+          </w:p>
+        </w:tc>
+      </w:tr>
+      <w:tr>
+        <w:trPr>
+          <w:trHeight w:val="962"/>
+        </w:trPr>
+        <w:tc>
+          <w:tcPr>
+            <w:tcW w:w="3999" w:type="dxa"/>
+            <w:tcBorders>
+              <w:top w:val="single" w:sz="4" w:space="0" w:color="000000"/>
+              <w:left w:val="single" w:sz="4" w:space="0" w:color="000000"/>
+              <w:bottom w:val="single" w:sz="4" w:space="0" w:color="000000"/>
+              <w:right w:val="single" w:sz="4" w:space="0" w:color="000000"/>
+            </w:tcBorders>
+          </w:tcPr>
+          <w:p>
+            <w:pPr>
+              <w:widowControl w:val="0"/>
+              <w:tabs>
+                <w:tab w:val="left" w:pos="993"/>
+              </w:tabs>
+              <w:autoSpaceDE w:val="0"/>
+              <w:autoSpaceDN w:val="0"/>
+              <w:adjustRightInd w:val="0"/>
+              <w:spacing w:before="0" w:line="252" w:lineRule="auto"/>
+              <w:ind w:right="297"/>
+              <w:rPr>
+                <w:rFonts w:cs="Arial"/>
+                <w:b/>
+                <w:sz w:val="28"/>
+                <w:szCs w:val="32"/>
+              </w:rPr>
+            </w:pPr>
+            <w:r>
+              <w:rPr>
+                <w:rFonts w:cs="Arial"/>
+                <w:b/>
+                <w:sz w:val="28"/>
+                <w:szCs w:val="32"/>
+              </w:rPr>
+              <w:t>T.S.4.1.</w:t>
+            </w:r>
+            <w:r>
+              <w:rPr>
+                <w:rFonts w:cs="Arial"/>
+                <w:b/>
+                <w:sz w:val="28"/>
+                <w:szCs w:val="32"/>
+              </w:rPr>
+              <w:t>8.4</w:t>
+            </w:r>
+            <w:r>
+              <w:rPr>
+                <w:rFonts w:cs="Arial"/>
+                <w:b/>
+                <w:sz w:val="28"/>
+                <w:szCs w:val="32"/>
+              </w:rPr>
+              <w:t xml:space="preserve"> – Kramam</w:t>
+            </w:r>
+          </w:p>
+          <w:p>
+            <w:pPr>
+              <w:widowControl w:val="0"/>
+              <w:tabs>
+                <w:tab w:val="left" w:pos="993"/>
+              </w:tabs>
+              <w:autoSpaceDE w:val="0"/>
+              <w:autoSpaceDN w:val="0"/>
+              <w:adjustRightInd w:val="0"/>
+              <w:spacing w:before="0" w:line="252" w:lineRule="auto"/>
+              <w:ind w:right="297"/>
+              <w:rPr>
+                <w:rFonts w:cs="Arial"/>
+                <w:b/>
+                <w:sz w:val="28"/>
+                <w:szCs w:val="32"/>
+                <w:lang w:val="en-IN"/>
+              </w:rPr>
+            </w:pPr>
+            <w:r>
+              <w:rPr>
+                <w:rFonts w:cs="Arial"/>
+                <w:b/>
+                <w:sz w:val="28"/>
+                <w:szCs w:val="32"/>
+                <w:lang w:val="en-IN"/>
+              </w:rPr>
+              <w:t xml:space="preserve">Krama Vaakyam No. - </w:t>
+            </w:r>
+            <w:r>
+              <w:rPr>
+                <w:rFonts w:cs="Arial"/>
+                <w:b/>
+                <w:sz w:val="28"/>
+                <w:szCs w:val="32"/>
+                <w:lang w:val="en-IN"/>
+              </w:rPr>
+              <w:t>6</w:t>
+            </w:r>
+          </w:p>
+          <w:p>
+            <w:pPr>
+              <w:widowControl w:val="0"/>
+              <w:tabs>
+                <w:tab w:val="left" w:pos="993"/>
+              </w:tabs>
+              <w:autoSpaceDE w:val="0"/>
+              <w:autoSpaceDN w:val="0"/>
+              <w:adjustRightInd w:val="0"/>
+              <w:spacing w:before="0" w:line="252" w:lineRule="auto"/>
+              <w:ind w:right="297"/>
+              <w:rPr>
+                <w:rFonts w:cs="Arial"/>
+                <w:b/>
+                <w:sz w:val="28"/>
+                <w:szCs w:val="32"/>
+              </w:rPr>
+            </w:pPr>
+            <w:r>
+              <w:rPr>
+                <w:rFonts w:cs="Arial"/>
+                <w:b/>
+                <w:sz w:val="28"/>
+                <w:szCs w:val="32"/>
+                <w:lang w:val="it-IT"/>
+              </w:rPr>
+              <w:t>Panchaati No</w:t>
+            </w:r>
+            <w:r>
+              <w:rPr>
+                <w:rFonts w:cs="Arial"/>
+                <w:b/>
+                <w:szCs w:val="32"/>
+                <w:lang w:val="it-IT"/>
+              </w:rPr>
+              <w:t xml:space="preserve">. - </w:t>
+            </w:r>
+            <w:r>
+              <w:rPr>
+                <w:rFonts w:cs="Arial"/>
+                <w:b/>
+                <w:sz w:val="28"/>
+                <w:szCs w:val="32"/>
+                <w:lang w:val="it-IT"/>
+              </w:rPr>
+              <w:t>32</w:t>
+            </w:r>
+          </w:p>
+        </w:tc>
+        <w:tc>
+          <w:tcPr>
+            <w:tcW w:w="5103" w:type="dxa"/>
+            <w:tcBorders>
+              <w:top w:val="single" w:sz="4" w:space="0" w:color="000000"/>
+              <w:left w:val="single" w:sz="4" w:space="0" w:color="000000"/>
+              <w:bottom w:val="single" w:sz="4" w:space="0" w:color="000000"/>
+              <w:right w:val="single" w:sz="4" w:space="0" w:color="000000"/>
+            </w:tcBorders>
+          </w:tcPr>
+          <w:p>
+            <w:pPr>
+              <w:widowControl w:val="0"/>
+              <w:autoSpaceDE w:val="0"/>
+              <w:autoSpaceDN w:val="0"/>
+              <w:adjustRightInd w:val="0"/>
+              <w:spacing w:before="0" w:line="240" w:lineRule="auto"/>
+              <w:rPr>
+                <w:rFonts w:ascii="BRH Malayalam Extra" w:eastAsia="Times New Roman" w:hAnsi="BRH Malayalam Extra" w:cs="BRH Malayalam Extra"/>
+                <w:color w:val="000000"/>
+                <w:sz w:val="40"/>
+                <w:szCs w:val="40"/>
+                <w:lang w:val="en-IN" w:eastAsia="en-IN" w:bidi="ml-IN"/>
+              </w:rPr>
+            </w:pPr>
+            <w:r>
+              <w:rPr>
+                <w:rFonts w:ascii="BRH Devanagari Extra" w:hAnsi="BRH Devanagari Extra" w:cs="BRH Devanagari Extra"/>
+                <w:color w:val="000000"/>
+                <w:sz w:val="40"/>
+                <w:szCs w:val="40"/>
+              </w:rPr>
+              <w:t>Wû</w:t>
+            </w:r>
+            <w:r>
+              <w:rPr>
+                <w:rFonts w:ascii="BRH Malayalam Extra" w:hAnsi="BRH Malayalam Extra" w:cs="BRH Devanagari Extra"/>
+                <w:color w:val="000000"/>
+                <w:sz w:val="32"/>
+                <w:szCs w:val="40"/>
+              </w:rPr>
+              <w:t>–</w:t>
+            </w:r>
+            <w:r>
+              <w:rPr>
+                <w:rFonts w:ascii="BRH Devanagari Extra" w:hAnsi="BRH Devanagari Extra" w:cs="BRH Devanagari Extra"/>
+                <w:color w:val="000000"/>
+                <w:sz w:val="40"/>
+                <w:szCs w:val="40"/>
+              </w:rPr>
+              <w:t>ÌuÉwÉÉþ ÌuÉkÉåqÉ | ÌuÉ</w:t>
+            </w:r>
+            <w:r>
+              <w:rPr>
+                <w:rFonts w:ascii="BRH Malayalam Extra" w:hAnsi="BRH Malayalam Extra" w:cs="BRH Devanagari Extra"/>
+                <w:color w:val="000000"/>
+                <w:sz w:val="32"/>
+                <w:szCs w:val="40"/>
+              </w:rPr>
+              <w:t>–</w:t>
+            </w:r>
+            <w:r>
+              <w:rPr>
+                <w:rFonts w:ascii="BRH Devanagari Extra" w:hAnsi="BRH Devanagari Extra" w:cs="BRH Devanagari Extra"/>
+                <w:color w:val="000000"/>
+                <w:sz w:val="40"/>
+                <w:szCs w:val="40"/>
+              </w:rPr>
+              <w:t>kÉå</w:t>
+            </w:r>
+            <w:r>
+              <w:rPr>
+                <w:rFonts w:ascii="BRH Malayalam Extra" w:hAnsi="BRH Malayalam Extra" w:cs="BRH Devanagari Extra"/>
+                <w:color w:val="000000"/>
+                <w:sz w:val="32"/>
+                <w:szCs w:val="40"/>
+              </w:rPr>
+              <w:t>–</w:t>
+            </w:r>
+            <w:r>
+              <w:rPr>
+                <w:rFonts w:ascii="BRH Devanagari Extra" w:hAnsi="BRH Devanagari Extra" w:cs="BRH Devanagari Extra"/>
+                <w:color w:val="000000"/>
+                <w:sz w:val="40"/>
+                <w:szCs w:val="40"/>
+                <w:highlight w:val="yellow"/>
+              </w:rPr>
+              <w:t>qÉ</w:t>
+            </w:r>
+            <w:r>
+              <w:rPr>
+                <w:rFonts w:ascii="BRH Devanagari Extra" w:hAnsi="BRH Devanagari Extra" w:cs="BRH Devanagari Extra"/>
+                <w:color w:val="000000"/>
+                <w:sz w:val="40"/>
+                <w:szCs w:val="40"/>
+              </w:rPr>
+              <w:t>ÌiÉþ ÌuÉkÉåqÉ ||</w:t>
+            </w:r>
+          </w:p>
+        </w:tc>
+        <w:tc>
+          <w:tcPr>
+            <w:tcW w:w="5386" w:type="dxa"/>
+            <w:tcBorders>
+              <w:top w:val="single" w:sz="4" w:space="0" w:color="000000"/>
+              <w:left w:val="single" w:sz="4" w:space="0" w:color="000000"/>
+              <w:bottom w:val="single" w:sz="4" w:space="0" w:color="000000"/>
+              <w:right w:val="single" w:sz="4" w:space="0" w:color="000000"/>
+            </w:tcBorders>
+          </w:tcPr>
+          <w:p>
+            <w:pPr>
+              <w:widowControl w:val="0"/>
+              <w:autoSpaceDE w:val="0"/>
+              <w:autoSpaceDN w:val="0"/>
+              <w:adjustRightInd w:val="0"/>
+              <w:spacing w:before="0" w:line="240" w:lineRule="auto"/>
+              <w:rPr>
+                <w:rFonts w:ascii="BRH Malayalam Extra" w:eastAsia="Times New Roman" w:hAnsi="BRH Malayalam Extra" w:cs="BRH Malayalam Extra"/>
+                <w:color w:val="000000"/>
+                <w:sz w:val="40"/>
+                <w:szCs w:val="40"/>
+                <w:lang w:val="en-IN" w:eastAsia="en-IN" w:bidi="ml-IN"/>
+              </w:rPr>
+            </w:pPr>
+            <w:r>
+              <w:rPr>
+                <w:rFonts w:ascii="BRH Devanagari Extra" w:hAnsi="BRH Devanagari Extra" w:cs="BRH Devanagari Extra"/>
+                <w:color w:val="000000"/>
+                <w:sz w:val="40"/>
+                <w:szCs w:val="40"/>
+              </w:rPr>
+              <w:t>Wû</w:t>
+            </w:r>
+            <w:r>
+              <w:rPr>
+                <w:rFonts w:ascii="BRH Malayalam Extra" w:hAnsi="BRH Malayalam Extra" w:cs="BRH Devanagari Extra"/>
+                <w:color w:val="000000"/>
+                <w:sz w:val="32"/>
+                <w:szCs w:val="40"/>
+              </w:rPr>
+              <w:t>–</w:t>
+            </w:r>
+            <w:r>
+              <w:rPr>
+                <w:rFonts w:ascii="BRH Devanagari Extra" w:hAnsi="BRH Devanagari Extra" w:cs="BRH Devanagari Extra"/>
+                <w:color w:val="000000"/>
+                <w:sz w:val="40"/>
+                <w:szCs w:val="40"/>
+              </w:rPr>
+              <w:t>ÌuÉwÉÉþ ÌuÉkÉåqÉ | ÌuÉ</w:t>
+            </w:r>
+            <w:r>
+              <w:rPr>
+                <w:rFonts w:ascii="BRH Malayalam Extra" w:hAnsi="BRH Malayalam Extra" w:cs="BRH Devanagari Extra"/>
+                <w:color w:val="000000"/>
+                <w:sz w:val="32"/>
+                <w:szCs w:val="40"/>
+              </w:rPr>
+              <w:t>–</w:t>
+            </w:r>
+            <w:r>
+              <w:rPr>
+                <w:rFonts w:ascii="BRH Devanagari Extra" w:hAnsi="BRH Devanagari Extra" w:cs="BRH Devanagari Extra"/>
+                <w:color w:val="000000"/>
+                <w:sz w:val="40"/>
+                <w:szCs w:val="40"/>
+              </w:rPr>
+              <w:t>kÉå</w:t>
+            </w:r>
+            <w:r>
+              <w:rPr>
+                <w:rFonts w:ascii="BRH Malayalam Extra" w:hAnsi="BRH Malayalam Extra" w:cs="BRH Devanagari Extra"/>
+                <w:color w:val="000000"/>
+                <w:sz w:val="32"/>
+                <w:szCs w:val="40"/>
+              </w:rPr>
+              <w:t>–</w:t>
+            </w:r>
+            <w:r>
+              <w:rPr>
+                <w:rFonts w:ascii="BRH Devanagari Extra" w:hAnsi="BRH Devanagari Extra" w:cs="BRH Devanagari Extra"/>
+                <w:color w:val="000000"/>
+                <w:sz w:val="40"/>
+                <w:szCs w:val="40"/>
+                <w:highlight w:val="green"/>
+              </w:rPr>
+              <w:t>qÉ</w:t>
+            </w:r>
+            <w:r>
+              <w:rPr>
+                <w:rFonts w:ascii="BRH Devanagari Extra" w:hAnsi="BRH Devanagari Extra" w:cs="BRH Devanagari Extra"/>
+                <w:color w:val="000000"/>
+                <w:sz w:val="40"/>
+                <w:szCs w:val="40"/>
+              </w:rPr>
+              <w:t>åÌiÉþ ÌuÉkÉåqÉ ||</w:t>
+            </w:r>
+          </w:p>
+        </w:tc>
+      </w:tr>
+      <w:tr>
+        <w:trPr>
+          <w:trHeight w:val="962"/>
+        </w:trPr>
+        <w:tc>
+          <w:tcPr>
+            <w:tcW w:w="3999" w:type="dxa"/>
+            <w:tcBorders>
+              <w:top w:val="single" w:sz="4" w:space="0" w:color="000000"/>
+              <w:left w:val="single" w:sz="4" w:space="0" w:color="000000"/>
+              <w:bottom w:val="single" w:sz="4" w:space="0" w:color="000000"/>
+              <w:right w:val="single" w:sz="4" w:space="0" w:color="000000"/>
+            </w:tcBorders>
+          </w:tcPr>
+          <w:p>
+            <w:pPr>
+              <w:widowControl w:val="0"/>
+              <w:tabs>
+                <w:tab w:val="left" w:pos="993"/>
+              </w:tabs>
+              <w:autoSpaceDE w:val="0"/>
+              <w:autoSpaceDN w:val="0"/>
+              <w:adjustRightInd w:val="0"/>
+              <w:spacing w:before="0" w:line="252" w:lineRule="auto"/>
+              <w:ind w:right="297"/>
+              <w:rPr>
+                <w:rFonts w:cs="Arial"/>
+                <w:b/>
+                <w:sz w:val="28"/>
+                <w:szCs w:val="32"/>
+              </w:rPr>
+            </w:pPr>
+          </w:p>
+        </w:tc>
+        <w:tc>
+          <w:tcPr>
+            <w:tcW w:w="5103" w:type="dxa"/>
+            <w:tcBorders>
+              <w:top w:val="single" w:sz="4" w:space="0" w:color="000000"/>
+              <w:left w:val="single" w:sz="4" w:space="0" w:color="000000"/>
+              <w:bottom w:val="single" w:sz="4" w:space="0" w:color="000000"/>
+              <w:right w:val="single" w:sz="4" w:space="0" w:color="000000"/>
+            </w:tcBorders>
+          </w:tcPr>
+          <w:p>
+            <w:pPr>
+              <w:widowControl w:val="0"/>
+              <w:autoSpaceDE w:val="0"/>
+              <w:autoSpaceDN w:val="0"/>
+              <w:adjustRightInd w:val="0"/>
+              <w:spacing w:before="0" w:line="240" w:lineRule="auto"/>
+              <w:rPr>
+                <w:rFonts w:ascii="BRH Devanagari Extra" w:hAnsi="BRH Devanagari Extra" w:cs="BRH Devanagari Extra"/>
+                <w:color w:val="000000"/>
+                <w:sz w:val="40"/>
+                <w:szCs w:val="40"/>
+              </w:rPr>
+            </w:pPr>
+          </w:p>
+        </w:tc>
+        <w:tc>
+          <w:tcPr>
+            <w:tcW w:w="5386" w:type="dxa"/>
+            <w:tcBorders>
+              <w:top w:val="single" w:sz="4" w:space="0" w:color="000000"/>
+              <w:left w:val="single" w:sz="4" w:space="0" w:color="000000"/>
+              <w:bottom w:val="single" w:sz="4" w:space="0" w:color="000000"/>
+              <w:right w:val="single" w:sz="4" w:space="0" w:color="000000"/>
+            </w:tcBorders>
+          </w:tcPr>
+          <w:p>
+            <w:pPr>
+              <w:widowControl w:val="0"/>
+              <w:autoSpaceDE w:val="0"/>
+              <w:autoSpaceDN w:val="0"/>
+              <w:adjustRightInd w:val="0"/>
+              <w:spacing w:before="0" w:line="240" w:lineRule="auto"/>
+              <w:rPr>
                 <w:rFonts w:ascii="BRH Devanagari Extra" w:hAnsi="BRH Devanagari Extra" w:cs="BRH Devanagari Extra"/>
                 <w:color w:val="000000"/>
                 <w:sz w:val="40"/>
@@ -953,30 +2637,6 @@
         </w:tc>
       </w:tr>
     </w:tbl>
-    <w:p>
-      <w:pPr>
-        <w:jc w:val="center"/>
-        <w:rPr>
-          <w:b/>
-          <w:bCs/>
-          <w:sz w:val="32"/>
-          <w:szCs w:val="32"/>
-          <w:u w:val="single"/>
-        </w:rPr>
-      </w:pPr>
-    </w:p>
-    <w:p>
-      <w:pPr>
-        <w:jc w:val="center"/>
-        <w:rPr>
-          <w:b/>
-          <w:bCs/>
-          <w:sz w:val="32"/>
-          <w:szCs w:val="32"/>
-          <w:u w:val="single"/>
-        </w:rPr>
-      </w:pPr>
-    </w:p>
     <w:p>
       <w:pPr>
         <w:jc w:val="center"/>
@@ -996,6 +2656,7 @@
           <w:szCs w:val="32"/>
           <w:u w:val="single"/>
         </w:rPr>
+        <w:lastRenderedPageBreak/>
         <w:t xml:space="preserve">TS </w:t>
       </w:r>
       <w:r>
@@ -1601,7 +3262,6 @@
                 <w:sz w:val="28"/>
                 <w:szCs w:val="32"/>
               </w:rPr>
-              <w:lastRenderedPageBreak/>
               <w:t>T.S.4.1.</w:t>
             </w:r>
             <w:r>
@@ -3204,6 +4864,7 @@
           <w:szCs w:val="32"/>
           <w:u w:val="single"/>
         </w:rPr>
+        <w:lastRenderedPageBreak/>
         <w:t xml:space="preserve">TS </w:t>
       </w:r>
       <w:r>
@@ -3791,7 +5452,6 @@
                 <w:sz w:val="28"/>
                 <w:szCs w:val="32"/>
               </w:rPr>
-              <w:lastRenderedPageBreak/>
               <w:t>T.S.4.1.2.4 – Kramam</w:t>
             </w:r>
           </w:p>
@@ -5149,6 +6809,7 @@
                 <w:sz w:val="28"/>
                 <w:szCs w:val="32"/>
               </w:rPr>
+              <w:lastRenderedPageBreak/>
               <w:t>T.S.4.1.8.6 – Kramam</w:t>
             </w:r>
           </w:p>
@@ -5926,7 +7587,6 @@
                 <w:sz w:val="28"/>
                 <w:szCs w:val="32"/>
               </w:rPr>
-              <w:lastRenderedPageBreak/>
               <w:t>T.S.4.1.9.2 – Kramam</w:t>
             </w:r>
           </w:p>
@@ -6842,6 +8502,7 @@
           <w:szCs w:val="32"/>
           <w:u w:val="single"/>
         </w:rPr>
+        <w:lastRenderedPageBreak/>
         <w:t xml:space="preserve">TS </w:t>
       </w:r>
       <w:r>
@@ -7350,7 +9011,6 @@
                 <w:sz w:val="40"/>
                 <w:szCs w:val="40"/>
               </w:rPr>
-              <w:lastRenderedPageBreak/>
               <w:t>AÉ lÉÉMüÿqÉç |</w:t>
             </w:r>
           </w:p>
@@ -7382,7 +9042,6 @@
                 <w:szCs w:val="40"/>
                 <w:highlight w:val="green"/>
               </w:rPr>
-              <w:lastRenderedPageBreak/>
               <w:t>qÉ</w:t>
             </w:r>
             <w:r>
@@ -7476,7 +9135,6 @@
                 <w:sz w:val="40"/>
                 <w:szCs w:val="40"/>
               </w:rPr>
-              <w:lastRenderedPageBreak/>
               <w:t>qÉ</w:t>
             </w:r>
             <w:r>
@@ -7661,7 +9319,6 @@
           <w:b/>
           <w:sz w:val="28"/>
         </w:rPr>
-        <w:lastRenderedPageBreak/>
         <w:t>===========================</w:t>
       </w:r>
     </w:p>
@@ -7670,6 +9327,8 @@
       <w:headerReference w:type="default" r:id="rId8"/>
       <w:footerReference w:type="even" r:id="rId9"/>
       <w:footerReference w:type="default" r:id="rId10"/>
+      <w:headerReference w:type="first" r:id="rId11"/>
+      <w:footerReference w:type="first" r:id="rId12"/>
       <w:pgSz w:w="15840" w:h="12240" w:orient="landscape"/>
       <w:pgMar w:top="1440" w:right="1440" w:bottom="1440" w:left="1440" w:header="720" w:footer="720" w:gutter="0"/>
       <w:cols w:space="720"/>
@@ -7680,7 +9339,7 @@
 </file>
 
 <file path=word/endnotes.xml><?xml version="1.0" encoding="utf-8"?>
-<w:endnotes xmlns:wpc="http://schemas.microsoft.com/office/word/2010/wordprocessingCanvas" xmlns:cx="http://schemas.microsoft.com/office/drawing/2014/chartex" xmlns:cx1="http://schemas.microsoft.com/office/drawing/2015/9/8/chartex" xmlns:cx2="http://schemas.microsoft.com/office/drawing/2015/10/21/chartex" xmlns:cx3="http://schemas.microsoft.com/office/drawing/2016/5/9/chartex" xmlns:cx4="http://schemas.microsoft.com/office/drawing/2016/5/10/chartex" xmlns:cx5="http://schemas.microsoft.com/office/drawing/2016/5/11/chartex" xmlns:cx6="http://schemas.microsoft.com/office/drawing/2016/5/12/chartex" xmlns:cx7="http://schemas.microsoft.com/office/drawing/2016/5/13/chartex" xmlns:cx8="http://schemas.microsoft.com/office/drawing/2016/5/14/chartex" xmlns:mc="http://schemas.openxmlformats.org/markup-compatibility/2006" xmlns:aink="http://schemas.microsoft.com/office/drawing/2016/ink" xmlns:am3d="http://schemas.microsoft.com/office/drawing/2017/model3d" xmlns:o="urn:schemas-microsoft-com:office:office" xmlns:oel="http://schemas.microsoft.com/office/2019/extlst" xmlns:r="http://schemas.openxmlformats.org/officeDocument/2006/relationships" xmlns:m="http://schemas.openxmlformats.org/officeDocument/2006/math" xmlns:v="urn:schemas-microsoft-com:vml" xmlns:wp14="http://schemas.microsoft.com/office/word/2010/wordprocessingDrawing" xmlns:wp="http://schemas.openxmlformats.org/drawingml/2006/wordprocessingDrawing" xmlns:w10="urn:schemas-microsoft-com:office:word" xmlns:w="http://schemas.openxmlformats.org/wordprocessingml/2006/main" xmlns:w14="http://schemas.microsoft.com/office/word/2010/wordml" xmlns:w15="http://schemas.microsoft.com/office/word/2012/wordml" xmlns:w16cex="http://schemas.microsoft.com/office/word/2018/wordml/cex" xmlns:w16cid="http://schemas.microsoft.com/office/word/2016/wordml/cid" xmlns:w16="http://schemas.microsoft.com/office/word/2018/wordml" xmlns:w16du="http://schemas.microsoft.com/office/word/2023/wordml/word16du" xmlns:w16sdtdh="http://schemas.microsoft.com/office/word/2020/wordml/sdtdatahash" xmlns:w16sdtfl="http://schemas.microsoft.com/office/word/2024/wordml/sdtformatlock" xmlns:w16se="http://schemas.microsoft.com/office/word/2015/wordml/symex" xmlns:wpg="http://schemas.microsoft.com/office/word/2010/wordprocessingGroup" xmlns:wpi="http://schemas.microsoft.com/office/word/2010/wordprocessingInk" xmlns:wne="http://schemas.microsoft.com/office/word/2006/wordml" xmlns:wps="http://schemas.microsoft.com/office/word/2010/wordprocessingShape" mc:Ignorable="w14 w15 w16se w16cid w16 w16cex w16sdtdh w16sdtfl w16du wp14">
+<w:endnotes xmlns:wpc="http://schemas.microsoft.com/office/word/2010/wordprocessingCanvas" xmlns:cx="http://schemas.microsoft.com/office/drawing/2014/chartex" xmlns:cx1="http://schemas.microsoft.com/office/drawing/2015/9/8/chartex" xmlns:cx2="http://schemas.microsoft.com/office/drawing/2015/10/21/chartex" xmlns:cx3="http://schemas.microsoft.com/office/drawing/2016/5/9/chartex" xmlns:cx4="http://schemas.microsoft.com/office/drawing/2016/5/10/chartex" xmlns:cx5="http://schemas.microsoft.com/office/drawing/2016/5/11/chartex" xmlns:cx6="http://schemas.microsoft.com/office/drawing/2016/5/12/chartex" xmlns:cx7="http://schemas.microsoft.com/office/drawing/2016/5/13/chartex" xmlns:cx8="http://schemas.microsoft.com/office/drawing/2016/5/14/chartex" xmlns:mc="http://schemas.openxmlformats.org/markup-compatibility/2006" xmlns:aink="http://schemas.microsoft.com/office/drawing/2016/ink" xmlns:am3d="http://schemas.microsoft.com/office/drawing/2017/model3d" xmlns:o="urn:schemas-microsoft-com:office:office" xmlns:oel="http://schemas.microsoft.com/office/2019/extlst" xmlns:r="http://schemas.openxmlformats.org/officeDocument/2006/relationships" xmlns:m="http://schemas.openxmlformats.org/officeDocument/2006/math" xmlns:v="urn:schemas-microsoft-com:vml" xmlns:wp14="http://schemas.microsoft.com/office/word/2010/wordprocessingDrawing" xmlns:wp="http://schemas.openxmlformats.org/drawingml/2006/wordprocessingDrawing" xmlns:w10="urn:schemas-microsoft-com:office:word" xmlns:w="http://schemas.openxmlformats.org/wordprocessingml/2006/main" xmlns:w14="http://schemas.microsoft.com/office/word/2010/wordml" xmlns:w15="http://schemas.microsoft.com/office/word/2012/wordml" xmlns:w16cei="http://schemas.microsoft.com/office/word/2026/wordml/cei" xmlns:w16cex="http://schemas.microsoft.com/office/word/2018/wordml/cex" xmlns:w16cid="http://schemas.microsoft.com/office/word/2016/wordml/cid" xmlns:w16="http://schemas.microsoft.com/office/word/2018/wordml" xmlns:w16du="http://schemas.microsoft.com/office/word/2023/wordml/word16du" xmlns:w16sdtdh="http://schemas.microsoft.com/office/word/2020/wordml/sdtdatahash" xmlns:w16sdtfl="http://schemas.microsoft.com/office/word/2024/wordml/sdtformatlock" xmlns:w16se="http://schemas.microsoft.com/office/word/2015/wordml/symex" xmlns:wpg="http://schemas.microsoft.com/office/word/2010/wordprocessingGroup" xmlns:wpi="http://schemas.microsoft.com/office/word/2010/wordprocessingInk" xmlns:wne="http://schemas.microsoft.com/office/word/2006/wordml" xmlns:wps="http://schemas.microsoft.com/office/word/2010/wordprocessingShape" mc:Ignorable="w14 w15 w16se w16cid w16 w16cex w16sdtdh w16sdtfl w16du wp14">
   <w:endnote w:type="separator" w:id="-1">
     <w:p>
       <w:pPr>
@@ -7705,7 +9364,7 @@
 </file>
 
 <file path=word/footer1.xml><?xml version="1.0" encoding="utf-8"?>
-<w:ftr xmlns:wpc="http://schemas.microsoft.com/office/word/2010/wordprocessingCanvas" xmlns:cx="http://schemas.microsoft.com/office/drawing/2014/chartex" xmlns:cx1="http://schemas.microsoft.com/office/drawing/2015/9/8/chartex" xmlns:cx2="http://schemas.microsoft.com/office/drawing/2015/10/21/chartex" xmlns:cx3="http://schemas.microsoft.com/office/drawing/2016/5/9/chartex" xmlns:cx4="http://schemas.microsoft.com/office/drawing/2016/5/10/chartex" xmlns:cx5="http://schemas.microsoft.com/office/drawing/2016/5/11/chartex" xmlns:cx6="http://schemas.microsoft.com/office/drawing/2016/5/12/chartex" xmlns:cx7="http://schemas.microsoft.com/office/drawing/2016/5/13/chartex" xmlns:cx8="http://schemas.microsoft.com/office/drawing/2016/5/14/chartex" xmlns:mc="http://schemas.openxmlformats.org/markup-compatibility/2006" xmlns:aink="http://schemas.microsoft.com/office/drawing/2016/ink" xmlns:am3d="http://schemas.microsoft.com/office/drawing/2017/model3d" xmlns:o="urn:schemas-microsoft-com:office:office" xmlns:oel="http://schemas.microsoft.com/office/2019/extlst" xmlns:r="http://schemas.openxmlformats.org/officeDocument/2006/relationships" xmlns:m="http://schemas.openxmlformats.org/officeDocument/2006/math" xmlns:v="urn:schemas-microsoft-com:vml" xmlns:wp14="http://schemas.microsoft.com/office/word/2010/wordprocessingDrawing" xmlns:wp="http://schemas.openxmlformats.org/drawingml/2006/wordprocessingDrawing" xmlns:w10="urn:schemas-microsoft-com:office:word" xmlns:w="http://schemas.openxmlformats.org/wordprocessingml/2006/main" xmlns:w14="http://schemas.microsoft.com/office/word/2010/wordml" xmlns:w15="http://schemas.microsoft.com/office/word/2012/wordml" xmlns:w16cex="http://schemas.microsoft.com/office/word/2018/wordml/cex" xmlns:w16cid="http://schemas.microsoft.com/office/word/2016/wordml/cid" xmlns:w16="http://schemas.microsoft.com/office/word/2018/wordml" xmlns:w16du="http://schemas.microsoft.com/office/word/2023/wordml/word16du" xmlns:w16sdtdh="http://schemas.microsoft.com/office/word/2020/wordml/sdtdatahash" xmlns:w16sdtfl="http://schemas.microsoft.com/office/word/2024/wordml/sdtformatlock" xmlns:w16se="http://schemas.microsoft.com/office/word/2015/wordml/symex" xmlns:wpg="http://schemas.microsoft.com/office/word/2010/wordprocessingGroup" xmlns:wpi="http://schemas.microsoft.com/office/word/2010/wordprocessingInk" xmlns:wne="http://schemas.microsoft.com/office/word/2006/wordml" xmlns:wps="http://schemas.microsoft.com/office/word/2010/wordprocessingShape" mc:Ignorable="w14 w15 w16se w16cid w16 w16cex w16sdtdh w16sdtfl w16du wp14">
+<w:ftr xmlns:wpc="http://schemas.microsoft.com/office/word/2010/wordprocessingCanvas" xmlns:cx="http://schemas.microsoft.com/office/drawing/2014/chartex" xmlns:cx1="http://schemas.microsoft.com/office/drawing/2015/9/8/chartex" xmlns:cx2="http://schemas.microsoft.com/office/drawing/2015/10/21/chartex" xmlns:cx3="http://schemas.microsoft.com/office/drawing/2016/5/9/chartex" xmlns:cx4="http://schemas.microsoft.com/office/drawing/2016/5/10/chartex" xmlns:cx5="http://schemas.microsoft.com/office/drawing/2016/5/11/chartex" xmlns:cx6="http://schemas.microsoft.com/office/drawing/2016/5/12/chartex" xmlns:cx7="http://schemas.microsoft.com/office/drawing/2016/5/13/chartex" xmlns:cx8="http://schemas.microsoft.com/office/drawing/2016/5/14/chartex" xmlns:mc="http://schemas.openxmlformats.org/markup-compatibility/2006" xmlns:aink="http://schemas.microsoft.com/office/drawing/2016/ink" xmlns:am3d="http://schemas.microsoft.com/office/drawing/2017/model3d" xmlns:o="urn:schemas-microsoft-com:office:office" xmlns:oel="http://schemas.microsoft.com/office/2019/extlst" xmlns:r="http://schemas.openxmlformats.org/officeDocument/2006/relationships" xmlns:m="http://schemas.openxmlformats.org/officeDocument/2006/math" xmlns:v="urn:schemas-microsoft-com:vml" xmlns:wp14="http://schemas.microsoft.com/office/word/2010/wordprocessingDrawing" xmlns:wp="http://schemas.openxmlformats.org/drawingml/2006/wordprocessingDrawing" xmlns:w10="urn:schemas-microsoft-com:office:word" xmlns:w="http://schemas.openxmlformats.org/wordprocessingml/2006/main" xmlns:w14="http://schemas.microsoft.com/office/word/2010/wordml" xmlns:w15="http://schemas.microsoft.com/office/word/2012/wordml" xmlns:w16cei="http://schemas.microsoft.com/office/word/2026/wordml/cei" xmlns:w16cex="http://schemas.microsoft.com/office/word/2018/wordml/cex" xmlns:w16cid="http://schemas.microsoft.com/office/word/2016/wordml/cid" xmlns:w16="http://schemas.microsoft.com/office/word/2018/wordml" xmlns:w16du="http://schemas.microsoft.com/office/word/2023/wordml/word16du" xmlns:w16sdtdh="http://schemas.microsoft.com/office/word/2020/wordml/sdtdatahash" xmlns:w16sdtfl="http://schemas.microsoft.com/office/word/2024/wordml/sdtformatlock" xmlns:w16se="http://schemas.microsoft.com/office/word/2015/wordml/symex" xmlns:wpg="http://schemas.microsoft.com/office/word/2010/wordprocessingGroup" xmlns:wpi="http://schemas.microsoft.com/office/word/2010/wordprocessingInk" xmlns:wne="http://schemas.microsoft.com/office/word/2006/wordml" xmlns:wps="http://schemas.microsoft.com/office/word/2010/wordprocessingShape" mc:Ignorable="w14 w15 w16se w16cid w16 w16cex w16sdtdh w16sdtfl w16du wp14">
   <w:p>
     <w:pPr>
       <w:pBdr>
@@ -7758,14 +9417,21 @@
         <w:bCs/>
       </w:rPr>
       <w:tab/>
-      <w:t xml:space="preserve">              v</w:t>
+      <w:t xml:space="preserve">             </w:t>
     </w:r>
     <w:r>
       <w:rPr>
         <w:b/>
         <w:bCs/>
       </w:rPr>
-      <w:t>edavms@gmail.com</w:t>
+      <w:t>www.vedavms.in</w:t>
+    </w:r>
+    <w:r>
+      <w:rPr>
+        <w:b/>
+        <w:bCs/>
+      </w:rPr>
+      <w:t xml:space="preserve">   </w:t>
     </w:r>
     <w:r>
       <w:rPr>
@@ -7887,7 +9553,7 @@
 </file>
 
 <file path=word/footer2.xml><?xml version="1.0" encoding="utf-8"?>
-<w:ftr xmlns:wpc="http://schemas.microsoft.com/office/word/2010/wordprocessingCanvas" xmlns:cx="http://schemas.microsoft.com/office/drawing/2014/chartex" xmlns:cx1="http://schemas.microsoft.com/office/drawing/2015/9/8/chartex" xmlns:cx2="http://schemas.microsoft.com/office/drawing/2015/10/21/chartex" xmlns:cx3="http://schemas.microsoft.com/office/drawing/2016/5/9/chartex" xmlns:cx4="http://schemas.microsoft.com/office/drawing/2016/5/10/chartex" xmlns:cx5="http://schemas.microsoft.com/office/drawing/2016/5/11/chartex" xmlns:cx6="http://schemas.microsoft.com/office/drawing/2016/5/12/chartex" xmlns:cx7="http://schemas.microsoft.com/office/drawing/2016/5/13/chartex" xmlns:cx8="http://schemas.microsoft.com/office/drawing/2016/5/14/chartex" xmlns:mc="http://schemas.openxmlformats.org/markup-compatibility/2006" xmlns:aink="http://schemas.microsoft.com/office/drawing/2016/ink" xmlns:am3d="http://schemas.microsoft.com/office/drawing/2017/model3d" xmlns:o="urn:schemas-microsoft-com:office:office" xmlns:oel="http://schemas.microsoft.com/office/2019/extlst" xmlns:r="http://schemas.openxmlformats.org/officeDocument/2006/relationships" xmlns:m="http://schemas.openxmlformats.org/officeDocument/2006/math" xmlns:v="urn:schemas-microsoft-com:vml" xmlns:wp14="http://schemas.microsoft.com/office/word/2010/wordprocessingDrawing" xmlns:wp="http://schemas.openxmlformats.org/drawingml/2006/wordprocessingDrawing" xmlns:w10="urn:schemas-microsoft-com:office:word" xmlns:w="http://schemas.openxmlformats.org/wordprocessingml/2006/main" xmlns:w14="http://schemas.microsoft.com/office/word/2010/wordml" xmlns:w15="http://schemas.microsoft.com/office/word/2012/wordml" xmlns:w16cex="http://schemas.microsoft.com/office/word/2018/wordml/cex" xmlns:w16cid="http://schemas.microsoft.com/office/word/2016/wordml/cid" xmlns:w16="http://schemas.microsoft.com/office/word/2018/wordml" xmlns:w16du="http://schemas.microsoft.com/office/word/2023/wordml/word16du" xmlns:w16sdtdh="http://schemas.microsoft.com/office/word/2020/wordml/sdtdatahash" xmlns:w16sdtfl="http://schemas.microsoft.com/office/word/2024/wordml/sdtformatlock" xmlns:w16se="http://schemas.microsoft.com/office/word/2015/wordml/symex" xmlns:wpg="http://schemas.microsoft.com/office/word/2010/wordprocessingGroup" xmlns:wpi="http://schemas.microsoft.com/office/word/2010/wordprocessingInk" xmlns:wne="http://schemas.microsoft.com/office/word/2006/wordml" xmlns:wps="http://schemas.microsoft.com/office/word/2010/wordprocessingShape" mc:Ignorable="w14 w15 w16se w16cid w16 w16cex w16sdtdh w16sdtfl w16du wp14">
+<w:ftr xmlns:wpc="http://schemas.microsoft.com/office/word/2010/wordprocessingCanvas" xmlns:cx="http://schemas.microsoft.com/office/drawing/2014/chartex" xmlns:cx1="http://schemas.microsoft.com/office/drawing/2015/9/8/chartex" xmlns:cx2="http://schemas.microsoft.com/office/drawing/2015/10/21/chartex" xmlns:cx3="http://schemas.microsoft.com/office/drawing/2016/5/9/chartex" xmlns:cx4="http://schemas.microsoft.com/office/drawing/2016/5/10/chartex" xmlns:cx5="http://schemas.microsoft.com/office/drawing/2016/5/11/chartex" xmlns:cx6="http://schemas.microsoft.com/office/drawing/2016/5/12/chartex" xmlns:cx7="http://schemas.microsoft.com/office/drawing/2016/5/13/chartex" xmlns:cx8="http://schemas.microsoft.com/office/drawing/2016/5/14/chartex" xmlns:mc="http://schemas.openxmlformats.org/markup-compatibility/2006" xmlns:aink="http://schemas.microsoft.com/office/drawing/2016/ink" xmlns:am3d="http://schemas.microsoft.com/office/drawing/2017/model3d" xmlns:o="urn:schemas-microsoft-com:office:office" xmlns:oel="http://schemas.microsoft.com/office/2019/extlst" xmlns:r="http://schemas.openxmlformats.org/officeDocument/2006/relationships" xmlns:m="http://schemas.openxmlformats.org/officeDocument/2006/math" xmlns:v="urn:schemas-microsoft-com:vml" xmlns:wp14="http://schemas.microsoft.com/office/word/2010/wordprocessingDrawing" xmlns:wp="http://schemas.openxmlformats.org/drawingml/2006/wordprocessingDrawing" xmlns:w10="urn:schemas-microsoft-com:office:word" xmlns:w="http://schemas.openxmlformats.org/wordprocessingml/2006/main" xmlns:w14="http://schemas.microsoft.com/office/word/2010/wordml" xmlns:w15="http://schemas.microsoft.com/office/word/2012/wordml" xmlns:w16cei="http://schemas.microsoft.com/office/word/2026/wordml/cei" xmlns:w16cex="http://schemas.microsoft.com/office/word/2018/wordml/cex" xmlns:w16cid="http://schemas.microsoft.com/office/word/2016/wordml/cid" xmlns:w16="http://schemas.microsoft.com/office/word/2018/wordml" xmlns:w16du="http://schemas.microsoft.com/office/word/2023/wordml/word16du" xmlns:w16sdtdh="http://schemas.microsoft.com/office/word/2020/wordml/sdtdatahash" xmlns:w16sdtfl="http://schemas.microsoft.com/office/word/2024/wordml/sdtformatlock" xmlns:w16se="http://schemas.microsoft.com/office/word/2015/wordml/symex" xmlns:wpg="http://schemas.microsoft.com/office/word/2010/wordprocessingGroup" xmlns:wpi="http://schemas.microsoft.com/office/word/2010/wordprocessingInk" xmlns:wne="http://schemas.microsoft.com/office/word/2006/wordml" xmlns:wps="http://schemas.microsoft.com/office/word/2010/wordprocessingShape" mc:Ignorable="w14 w15 w16se w16cid w16 w16cex w16sdtdh w16sdtfl w16du wp14">
   <w:p>
     <w:pPr>
       <w:pBdr>
@@ -8089,8 +9755,18 @@
 </w:ftr>
 </file>
 
+<file path=word/footer3.xml><?xml version="1.0" encoding="utf-8"?>
+<w:ftr xmlns:wpc="http://schemas.microsoft.com/office/word/2010/wordprocessingCanvas" xmlns:cx="http://schemas.microsoft.com/office/drawing/2014/chartex" xmlns:cx1="http://schemas.microsoft.com/office/drawing/2015/9/8/chartex" xmlns:cx2="http://schemas.microsoft.com/office/drawing/2015/10/21/chartex" xmlns:cx3="http://schemas.microsoft.com/office/drawing/2016/5/9/chartex" xmlns:cx4="http://schemas.microsoft.com/office/drawing/2016/5/10/chartex" xmlns:cx5="http://schemas.microsoft.com/office/drawing/2016/5/11/chartex" xmlns:cx6="http://schemas.microsoft.com/office/drawing/2016/5/12/chartex" xmlns:cx7="http://schemas.microsoft.com/office/drawing/2016/5/13/chartex" xmlns:cx8="http://schemas.microsoft.com/office/drawing/2016/5/14/chartex" xmlns:mc="http://schemas.openxmlformats.org/markup-compatibility/2006" xmlns:aink="http://schemas.microsoft.com/office/drawing/2016/ink" xmlns:am3d="http://schemas.microsoft.com/office/drawing/2017/model3d" xmlns:o="urn:schemas-microsoft-com:office:office" xmlns:oel="http://schemas.microsoft.com/office/2019/extlst" xmlns:r="http://schemas.openxmlformats.org/officeDocument/2006/relationships" xmlns:m="http://schemas.openxmlformats.org/officeDocument/2006/math" xmlns:v="urn:schemas-microsoft-com:vml" xmlns:wp14="http://schemas.microsoft.com/office/word/2010/wordprocessingDrawing" xmlns:wp="http://schemas.openxmlformats.org/drawingml/2006/wordprocessingDrawing" xmlns:w10="urn:schemas-microsoft-com:office:word" xmlns:w="http://schemas.openxmlformats.org/wordprocessingml/2006/main" xmlns:w14="http://schemas.microsoft.com/office/word/2010/wordml" xmlns:w15="http://schemas.microsoft.com/office/word/2012/wordml" xmlns:w16cei="http://schemas.microsoft.com/office/word/2026/wordml/cei" xmlns:w16cex="http://schemas.microsoft.com/office/word/2018/wordml/cex" xmlns:w16cid="http://schemas.microsoft.com/office/word/2016/wordml/cid" xmlns:w16="http://schemas.microsoft.com/office/word/2018/wordml" xmlns:w16du="http://schemas.microsoft.com/office/word/2023/wordml/word16du" xmlns:w16sdtdh="http://schemas.microsoft.com/office/word/2020/wordml/sdtdatahash" xmlns:w16sdtfl="http://schemas.microsoft.com/office/word/2024/wordml/sdtformatlock" xmlns:w16se="http://schemas.microsoft.com/office/word/2015/wordml/symex" xmlns:wpg="http://schemas.microsoft.com/office/word/2010/wordprocessingGroup" xmlns:wpi="http://schemas.microsoft.com/office/word/2010/wordprocessingInk" xmlns:wne="http://schemas.microsoft.com/office/word/2006/wordml" xmlns:wps="http://schemas.microsoft.com/office/word/2010/wordprocessingShape" mc:Ignorable="w14 w15 w16se w16cid w16 w16cex w16sdtdh w16sdtfl w16du wp14">
+  <w:p>
+    <w:pPr>
+      <w:pStyle w:val="Footer"/>
+    </w:pPr>
+  </w:p>
+</w:ftr>
+</file>
+
 <file path=word/footnotes.xml><?xml version="1.0" encoding="utf-8"?>
-<w:footnotes xmlns:wpc="http://schemas.microsoft.com/office/word/2010/wordprocessingCanvas" xmlns:cx="http://schemas.microsoft.com/office/drawing/2014/chartex" xmlns:cx1="http://schemas.microsoft.com/office/drawing/2015/9/8/chartex" xmlns:cx2="http://schemas.microsoft.com/office/drawing/2015/10/21/chartex" xmlns:cx3="http://schemas.microsoft.com/office/drawing/2016/5/9/chartex" xmlns:cx4="http://schemas.microsoft.com/office/drawing/2016/5/10/chartex" xmlns:cx5="http://schemas.microsoft.com/office/drawing/2016/5/11/chartex" xmlns:cx6="http://schemas.microsoft.com/office/drawing/2016/5/12/chartex" xmlns:cx7="http://schemas.microsoft.com/office/drawing/2016/5/13/chartex" xmlns:cx8="http://schemas.microsoft.com/office/drawing/2016/5/14/chartex" xmlns:mc="http://schemas.openxmlformats.org/markup-compatibility/2006" xmlns:aink="http://schemas.microsoft.com/office/drawing/2016/ink" xmlns:am3d="http://schemas.microsoft.com/office/drawing/2017/model3d" xmlns:o="urn:schemas-microsoft-com:office:office" xmlns:oel="http://schemas.microsoft.com/office/2019/extlst" xmlns:r="http://schemas.openxmlformats.org/officeDocument/2006/relationships" xmlns:m="http://schemas.openxmlformats.org/officeDocument/2006/math" xmlns:v="urn:schemas-microsoft-com:vml" xmlns:wp14="http://schemas.microsoft.com/office/word/2010/wordprocessingDrawing" xmlns:wp="http://schemas.openxmlformats.org/drawingml/2006/wordprocessingDrawing" xmlns:w10="urn:schemas-microsoft-com:office:word" xmlns:w="http://schemas.openxmlformats.org/wordprocessingml/2006/main" xmlns:w14="http://schemas.microsoft.com/office/word/2010/wordml" xmlns:w15="http://schemas.microsoft.com/office/word/2012/wordml" xmlns:w16cex="http://schemas.microsoft.com/office/word/2018/wordml/cex" xmlns:w16cid="http://schemas.microsoft.com/office/word/2016/wordml/cid" xmlns:w16="http://schemas.microsoft.com/office/word/2018/wordml" xmlns:w16du="http://schemas.microsoft.com/office/word/2023/wordml/word16du" xmlns:w16sdtdh="http://schemas.microsoft.com/office/word/2020/wordml/sdtdatahash" xmlns:w16sdtfl="http://schemas.microsoft.com/office/word/2024/wordml/sdtformatlock" xmlns:w16se="http://schemas.microsoft.com/office/word/2015/wordml/symex" xmlns:wpg="http://schemas.microsoft.com/office/word/2010/wordprocessingGroup" xmlns:wpi="http://schemas.microsoft.com/office/word/2010/wordprocessingInk" xmlns:wne="http://schemas.microsoft.com/office/word/2006/wordml" xmlns:wps="http://schemas.microsoft.com/office/word/2010/wordprocessingShape" mc:Ignorable="w14 w15 w16se w16cid w16 w16cex w16sdtdh w16sdtfl w16du wp14">
+<w:footnotes xmlns:wpc="http://schemas.microsoft.com/office/word/2010/wordprocessingCanvas" xmlns:cx="http://schemas.microsoft.com/office/drawing/2014/chartex" xmlns:cx1="http://schemas.microsoft.com/office/drawing/2015/9/8/chartex" xmlns:cx2="http://schemas.microsoft.com/office/drawing/2015/10/21/chartex" xmlns:cx3="http://schemas.microsoft.com/office/drawing/2016/5/9/chartex" xmlns:cx4="http://schemas.microsoft.com/office/drawing/2016/5/10/chartex" xmlns:cx5="http://schemas.microsoft.com/office/drawing/2016/5/11/chartex" xmlns:cx6="http://schemas.microsoft.com/office/drawing/2016/5/12/chartex" xmlns:cx7="http://schemas.microsoft.com/office/drawing/2016/5/13/chartex" xmlns:cx8="http://schemas.microsoft.com/office/drawing/2016/5/14/chartex" xmlns:mc="http://schemas.openxmlformats.org/markup-compatibility/2006" xmlns:aink="http://schemas.microsoft.com/office/drawing/2016/ink" xmlns:am3d="http://schemas.microsoft.com/office/drawing/2017/model3d" xmlns:o="urn:schemas-microsoft-com:office:office" xmlns:oel="http://schemas.microsoft.com/office/2019/extlst" xmlns:r="http://schemas.openxmlformats.org/officeDocument/2006/relationships" xmlns:m="http://schemas.openxmlformats.org/officeDocument/2006/math" xmlns:v="urn:schemas-microsoft-com:vml" xmlns:wp14="http://schemas.microsoft.com/office/word/2010/wordprocessingDrawing" xmlns:wp="http://schemas.openxmlformats.org/drawingml/2006/wordprocessingDrawing" xmlns:w10="urn:schemas-microsoft-com:office:word" xmlns:w="http://schemas.openxmlformats.org/wordprocessingml/2006/main" xmlns:w14="http://schemas.microsoft.com/office/word/2010/wordml" xmlns:w15="http://schemas.microsoft.com/office/word/2012/wordml" xmlns:w16cei="http://schemas.microsoft.com/office/word/2026/wordml/cei" xmlns:w16cex="http://schemas.microsoft.com/office/word/2018/wordml/cex" xmlns:w16cid="http://schemas.microsoft.com/office/word/2016/wordml/cid" xmlns:w16="http://schemas.microsoft.com/office/word/2018/wordml" xmlns:w16du="http://schemas.microsoft.com/office/word/2023/wordml/word16du" xmlns:w16sdtdh="http://schemas.microsoft.com/office/word/2020/wordml/sdtdatahash" xmlns:w16sdtfl="http://schemas.microsoft.com/office/word/2024/wordml/sdtformatlock" xmlns:w16se="http://schemas.microsoft.com/office/word/2015/wordml/symex" xmlns:wpg="http://schemas.microsoft.com/office/word/2010/wordprocessingGroup" xmlns:wpi="http://schemas.microsoft.com/office/word/2010/wordprocessingInk" xmlns:wne="http://schemas.microsoft.com/office/word/2006/wordml" xmlns:wps="http://schemas.microsoft.com/office/word/2010/wordprocessingShape" mc:Ignorable="w14 w15 w16se w16cid w16 w16cex w16sdtdh w16sdtfl w16du wp14">
   <w:footnote w:type="separator" w:id="-1">
     <w:p>
       <w:pPr>
@@ -8115,7 +9791,7 @@
 </file>
 
 <file path=word/header1.xml><?xml version="1.0" encoding="utf-8"?>
-<w:hdr xmlns:wpc="http://schemas.microsoft.com/office/word/2010/wordprocessingCanvas" xmlns:cx="http://schemas.microsoft.com/office/drawing/2014/chartex" xmlns:cx1="http://schemas.microsoft.com/office/drawing/2015/9/8/chartex" xmlns:cx2="http://schemas.microsoft.com/office/drawing/2015/10/21/chartex" xmlns:cx3="http://schemas.microsoft.com/office/drawing/2016/5/9/chartex" xmlns:cx4="http://schemas.microsoft.com/office/drawing/2016/5/10/chartex" xmlns:cx5="http://schemas.microsoft.com/office/drawing/2016/5/11/chartex" xmlns:cx6="http://schemas.microsoft.com/office/drawing/2016/5/12/chartex" xmlns:cx7="http://schemas.microsoft.com/office/drawing/2016/5/13/chartex" xmlns:cx8="http://schemas.microsoft.com/office/drawing/2016/5/14/chartex" xmlns:mc="http://schemas.openxmlformats.org/markup-compatibility/2006" xmlns:aink="http://schemas.microsoft.com/office/drawing/2016/ink" xmlns:am3d="http://schemas.microsoft.com/office/drawing/2017/model3d" xmlns:o="urn:schemas-microsoft-com:office:office" xmlns:oel="http://schemas.microsoft.com/office/2019/extlst" xmlns:r="http://schemas.openxmlformats.org/officeDocument/2006/relationships" xmlns:m="http://schemas.openxmlformats.org/officeDocument/2006/math" xmlns:v="urn:schemas-microsoft-com:vml" xmlns:wp14="http://schemas.microsoft.com/office/word/2010/wordprocessingDrawing" xmlns:wp="http://schemas.openxmlformats.org/drawingml/2006/wordprocessingDrawing" xmlns:w10="urn:schemas-microsoft-com:office:word" xmlns:w="http://schemas.openxmlformats.org/wordprocessingml/2006/main" xmlns:w14="http://schemas.microsoft.com/office/word/2010/wordml" xmlns:w15="http://schemas.microsoft.com/office/word/2012/wordml" xmlns:w16cex="http://schemas.microsoft.com/office/word/2018/wordml/cex" xmlns:w16cid="http://schemas.microsoft.com/office/word/2016/wordml/cid" xmlns:w16="http://schemas.microsoft.com/office/word/2018/wordml" xmlns:w16du="http://schemas.microsoft.com/office/word/2023/wordml/word16du" xmlns:w16sdtdh="http://schemas.microsoft.com/office/word/2020/wordml/sdtdatahash" xmlns:w16sdtfl="http://schemas.microsoft.com/office/word/2024/wordml/sdtformatlock" xmlns:w16se="http://schemas.microsoft.com/office/word/2015/wordml/symex" xmlns:wpg="http://schemas.microsoft.com/office/word/2010/wordprocessingGroup" xmlns:wpi="http://schemas.microsoft.com/office/word/2010/wordprocessingInk" xmlns:wne="http://schemas.microsoft.com/office/word/2006/wordml" xmlns:wps="http://schemas.microsoft.com/office/word/2010/wordprocessingShape" mc:Ignorable="w14 w15 w16se w16cid w16 w16cex w16sdtdh w16sdtfl w16du wp14">
+<w:hdr xmlns:wpc="http://schemas.microsoft.com/office/word/2010/wordprocessingCanvas" xmlns:cx="http://schemas.microsoft.com/office/drawing/2014/chartex" xmlns:cx1="http://schemas.microsoft.com/office/drawing/2015/9/8/chartex" xmlns:cx2="http://schemas.microsoft.com/office/drawing/2015/10/21/chartex" xmlns:cx3="http://schemas.microsoft.com/office/drawing/2016/5/9/chartex" xmlns:cx4="http://schemas.microsoft.com/office/drawing/2016/5/10/chartex" xmlns:cx5="http://schemas.microsoft.com/office/drawing/2016/5/11/chartex" xmlns:cx6="http://schemas.microsoft.com/office/drawing/2016/5/12/chartex" xmlns:cx7="http://schemas.microsoft.com/office/drawing/2016/5/13/chartex" xmlns:cx8="http://schemas.microsoft.com/office/drawing/2016/5/14/chartex" xmlns:mc="http://schemas.openxmlformats.org/markup-compatibility/2006" xmlns:aink="http://schemas.microsoft.com/office/drawing/2016/ink" xmlns:am3d="http://schemas.microsoft.com/office/drawing/2017/model3d" xmlns:o="urn:schemas-microsoft-com:office:office" xmlns:oel="http://schemas.microsoft.com/office/2019/extlst" xmlns:r="http://schemas.openxmlformats.org/officeDocument/2006/relationships" xmlns:m="http://schemas.openxmlformats.org/officeDocument/2006/math" xmlns:v="urn:schemas-microsoft-com:vml" xmlns:wp14="http://schemas.microsoft.com/office/word/2010/wordprocessingDrawing" xmlns:wp="http://schemas.openxmlformats.org/drawingml/2006/wordprocessingDrawing" xmlns:w10="urn:schemas-microsoft-com:office:word" xmlns:w="http://schemas.openxmlformats.org/wordprocessingml/2006/main" xmlns:w14="http://schemas.microsoft.com/office/word/2010/wordml" xmlns:w15="http://schemas.microsoft.com/office/word/2012/wordml" xmlns:w16cei="http://schemas.microsoft.com/office/word/2026/wordml/cei" xmlns:w16cex="http://schemas.microsoft.com/office/word/2018/wordml/cex" xmlns:w16cid="http://schemas.microsoft.com/office/word/2016/wordml/cid" xmlns:w16="http://schemas.microsoft.com/office/word/2018/wordml" xmlns:w16du="http://schemas.microsoft.com/office/word/2023/wordml/word16du" xmlns:w16sdtdh="http://schemas.microsoft.com/office/word/2020/wordml/sdtdatahash" xmlns:w16sdtfl="http://schemas.microsoft.com/office/word/2024/wordml/sdtformatlock" xmlns:w16se="http://schemas.microsoft.com/office/word/2015/wordml/symex" xmlns:wpg="http://schemas.microsoft.com/office/word/2010/wordprocessingGroup" xmlns:wpi="http://schemas.microsoft.com/office/word/2010/wordprocessingInk" xmlns:wne="http://schemas.microsoft.com/office/word/2006/wordml" xmlns:wps="http://schemas.microsoft.com/office/word/2010/wordprocessingShape" mc:Ignorable="w14 w15 w16se w16cid w16 w16cex w16sdtdh w16sdtfl w16du wp14">
   <w:p>
     <w:pPr>
       <w:pStyle w:val="Header"/>
@@ -8128,13 +9804,23 @@
 </file>
 
 <file path=word/header2.xml><?xml version="1.0" encoding="utf-8"?>
-<w:hdr xmlns:wpc="http://schemas.microsoft.com/office/word/2010/wordprocessingCanvas" xmlns:cx="http://schemas.microsoft.com/office/drawing/2014/chartex" xmlns:cx1="http://schemas.microsoft.com/office/drawing/2015/9/8/chartex" xmlns:cx2="http://schemas.microsoft.com/office/drawing/2015/10/21/chartex" xmlns:cx3="http://schemas.microsoft.com/office/drawing/2016/5/9/chartex" xmlns:cx4="http://schemas.microsoft.com/office/drawing/2016/5/10/chartex" xmlns:cx5="http://schemas.microsoft.com/office/drawing/2016/5/11/chartex" xmlns:cx6="http://schemas.microsoft.com/office/drawing/2016/5/12/chartex" xmlns:cx7="http://schemas.microsoft.com/office/drawing/2016/5/13/chartex" xmlns:cx8="http://schemas.microsoft.com/office/drawing/2016/5/14/chartex" xmlns:mc="http://schemas.openxmlformats.org/markup-compatibility/2006" xmlns:aink="http://schemas.microsoft.com/office/drawing/2016/ink" xmlns:am3d="http://schemas.microsoft.com/office/drawing/2017/model3d" xmlns:o="urn:schemas-microsoft-com:office:office" xmlns:oel="http://schemas.microsoft.com/office/2019/extlst" xmlns:r="http://schemas.openxmlformats.org/officeDocument/2006/relationships" xmlns:m="http://schemas.openxmlformats.org/officeDocument/2006/math" xmlns:v="urn:schemas-microsoft-com:vml" xmlns:wp14="http://schemas.microsoft.com/office/word/2010/wordprocessingDrawing" xmlns:wp="http://schemas.openxmlformats.org/drawingml/2006/wordprocessingDrawing" xmlns:w10="urn:schemas-microsoft-com:office:word" xmlns:w="http://schemas.openxmlformats.org/wordprocessingml/2006/main" xmlns:w14="http://schemas.microsoft.com/office/word/2010/wordml" xmlns:w15="http://schemas.microsoft.com/office/word/2012/wordml" xmlns:w16cex="http://schemas.microsoft.com/office/word/2018/wordml/cex" xmlns:w16cid="http://schemas.microsoft.com/office/word/2016/wordml/cid" xmlns:w16="http://schemas.microsoft.com/office/word/2018/wordml" xmlns:w16du="http://schemas.microsoft.com/office/word/2023/wordml/word16du" xmlns:w16sdtdh="http://schemas.microsoft.com/office/word/2020/wordml/sdtdatahash" xmlns:w16sdtfl="http://schemas.microsoft.com/office/word/2024/wordml/sdtformatlock" xmlns:w16se="http://schemas.microsoft.com/office/word/2015/wordml/symex" xmlns:wpg="http://schemas.microsoft.com/office/word/2010/wordprocessingGroup" xmlns:wpi="http://schemas.microsoft.com/office/word/2010/wordprocessingInk" xmlns:wne="http://schemas.microsoft.com/office/word/2006/wordml" xmlns:wps="http://schemas.microsoft.com/office/word/2010/wordprocessingShape" mc:Ignorable="w14 w15 w16se w16cid w16 w16cex w16sdtdh w16sdtfl w16du wp14">
+<w:hdr xmlns:wpc="http://schemas.microsoft.com/office/word/2010/wordprocessingCanvas" xmlns:cx="http://schemas.microsoft.com/office/drawing/2014/chartex" xmlns:cx1="http://schemas.microsoft.com/office/drawing/2015/9/8/chartex" xmlns:cx2="http://schemas.microsoft.com/office/drawing/2015/10/21/chartex" xmlns:cx3="http://schemas.microsoft.com/office/drawing/2016/5/9/chartex" xmlns:cx4="http://schemas.microsoft.com/office/drawing/2016/5/10/chartex" xmlns:cx5="http://schemas.microsoft.com/office/drawing/2016/5/11/chartex" xmlns:cx6="http://schemas.microsoft.com/office/drawing/2016/5/12/chartex" xmlns:cx7="http://schemas.microsoft.com/office/drawing/2016/5/13/chartex" xmlns:cx8="http://schemas.microsoft.com/office/drawing/2016/5/14/chartex" xmlns:mc="http://schemas.openxmlformats.org/markup-compatibility/2006" xmlns:aink="http://schemas.microsoft.com/office/drawing/2016/ink" xmlns:am3d="http://schemas.microsoft.com/office/drawing/2017/model3d" xmlns:o="urn:schemas-microsoft-com:office:office" xmlns:oel="http://schemas.microsoft.com/office/2019/extlst" xmlns:r="http://schemas.openxmlformats.org/officeDocument/2006/relationships" xmlns:m="http://schemas.openxmlformats.org/officeDocument/2006/math" xmlns:v="urn:schemas-microsoft-com:vml" xmlns:wp14="http://schemas.microsoft.com/office/word/2010/wordprocessingDrawing" xmlns:wp="http://schemas.openxmlformats.org/drawingml/2006/wordprocessingDrawing" xmlns:w10="urn:schemas-microsoft-com:office:word" xmlns:w="http://schemas.openxmlformats.org/wordprocessingml/2006/main" xmlns:w14="http://schemas.microsoft.com/office/word/2010/wordml" xmlns:w15="http://schemas.microsoft.com/office/word/2012/wordml" xmlns:w16cei="http://schemas.microsoft.com/office/word/2026/wordml/cei" xmlns:w16cex="http://schemas.microsoft.com/office/word/2018/wordml/cex" xmlns:w16cid="http://schemas.microsoft.com/office/word/2016/wordml/cid" xmlns:w16="http://schemas.microsoft.com/office/word/2018/wordml" xmlns:w16du="http://schemas.microsoft.com/office/word/2023/wordml/word16du" xmlns:w16sdtdh="http://schemas.microsoft.com/office/word/2020/wordml/sdtdatahash" xmlns:w16sdtfl="http://schemas.microsoft.com/office/word/2024/wordml/sdtformatlock" xmlns:w16se="http://schemas.microsoft.com/office/word/2015/wordml/symex" xmlns:wpg="http://schemas.microsoft.com/office/word/2010/wordprocessingGroup" xmlns:wpi="http://schemas.microsoft.com/office/word/2010/wordprocessingInk" xmlns:wne="http://schemas.microsoft.com/office/word/2006/wordml" xmlns:wps="http://schemas.microsoft.com/office/word/2010/wordprocessingShape" mc:Ignorable="w14 w15 w16se w16cid w16 w16cex w16sdtdh w16sdtfl w16du wp14">
   <w:p>
     <w:pPr>
       <w:pStyle w:val="Header"/>
       <w:pBdr>
         <w:bottom w:val="single" w:sz="4" w:space="1" w:color="auto"/>
       </w:pBdr>
+    </w:pPr>
+  </w:p>
+</w:hdr>
+</file>
+
+<file path=word/header3.xml><?xml version="1.0" encoding="utf-8"?>
+<w:hdr xmlns:wpc="http://schemas.microsoft.com/office/word/2010/wordprocessingCanvas" xmlns:cx="http://schemas.microsoft.com/office/drawing/2014/chartex" xmlns:cx1="http://schemas.microsoft.com/office/drawing/2015/9/8/chartex" xmlns:cx2="http://schemas.microsoft.com/office/drawing/2015/10/21/chartex" xmlns:cx3="http://schemas.microsoft.com/office/drawing/2016/5/9/chartex" xmlns:cx4="http://schemas.microsoft.com/office/drawing/2016/5/10/chartex" xmlns:cx5="http://schemas.microsoft.com/office/drawing/2016/5/11/chartex" xmlns:cx6="http://schemas.microsoft.com/office/drawing/2016/5/12/chartex" xmlns:cx7="http://schemas.microsoft.com/office/drawing/2016/5/13/chartex" xmlns:cx8="http://schemas.microsoft.com/office/drawing/2016/5/14/chartex" xmlns:mc="http://schemas.openxmlformats.org/markup-compatibility/2006" xmlns:aink="http://schemas.microsoft.com/office/drawing/2016/ink" xmlns:am3d="http://schemas.microsoft.com/office/drawing/2017/model3d" xmlns:o="urn:schemas-microsoft-com:office:office" xmlns:oel="http://schemas.microsoft.com/office/2019/extlst" xmlns:r="http://schemas.openxmlformats.org/officeDocument/2006/relationships" xmlns:m="http://schemas.openxmlformats.org/officeDocument/2006/math" xmlns:v="urn:schemas-microsoft-com:vml" xmlns:wp14="http://schemas.microsoft.com/office/word/2010/wordprocessingDrawing" xmlns:wp="http://schemas.openxmlformats.org/drawingml/2006/wordprocessingDrawing" xmlns:w10="urn:schemas-microsoft-com:office:word" xmlns:w="http://schemas.openxmlformats.org/wordprocessingml/2006/main" xmlns:w14="http://schemas.microsoft.com/office/word/2010/wordml" xmlns:w15="http://schemas.microsoft.com/office/word/2012/wordml" xmlns:w16cei="http://schemas.microsoft.com/office/word/2026/wordml/cei" xmlns:w16cex="http://schemas.microsoft.com/office/word/2018/wordml/cex" xmlns:w16cid="http://schemas.microsoft.com/office/word/2016/wordml/cid" xmlns:w16="http://schemas.microsoft.com/office/word/2018/wordml" xmlns:w16du="http://schemas.microsoft.com/office/word/2023/wordml/word16du" xmlns:w16sdtdh="http://schemas.microsoft.com/office/word/2020/wordml/sdtdatahash" xmlns:w16sdtfl="http://schemas.microsoft.com/office/word/2024/wordml/sdtformatlock" xmlns:w16se="http://schemas.microsoft.com/office/word/2015/wordml/symex" xmlns:wpg="http://schemas.microsoft.com/office/word/2010/wordprocessingGroup" xmlns:wpi="http://schemas.microsoft.com/office/word/2010/wordprocessingInk" xmlns:wne="http://schemas.microsoft.com/office/word/2006/wordml" xmlns:wps="http://schemas.microsoft.com/office/word/2010/wordprocessingShape" mc:Ignorable="w14 w15 w16se w16cid w16 w16cex w16sdtdh w16sdtfl w16du wp14">
+  <w:p>
+    <w:pPr>
+      <w:pStyle w:val="Header"/>
     </w:pPr>
   </w:p>
 </w:hdr>
@@ -8644,6 +10330,29 @@
       <w:lang w:bidi="ar-SA"/>
     </w:rPr>
   </w:style>
+  <w:style w:type="character" w:styleId="Hyperlink">
+    <w:name w:val="Hyperlink"/>
+    <w:basedOn w:val="DefaultParagraphFont"/>
+    <w:uiPriority w:val="99"/>
+    <w:unhideWhenUsed/>
+    <w:rsid w:val="000C6C8C"/>
+    <w:rPr>
+      <w:color w:val="0563C1" w:themeColor="hyperlink"/>
+      <w:u w:val="single"/>
+    </w:rPr>
+  </w:style>
+  <w:style w:type="character" w:styleId="UnresolvedMention">
+    <w:name w:val="Unresolved Mention"/>
+    <w:basedOn w:val="DefaultParagraphFont"/>
+    <w:uiPriority w:val="99"/>
+    <w:semiHidden/>
+    <w:unhideWhenUsed/>
+    <w:rsid w:val="000C6C8C"/>
+    <w:rPr>
+      <w:color w:val="605E5C"/>
+      <w:shd w:val="clear" w:color="auto" w:fill="E1DFDD"/>
+    </w:rPr>
+  </w:style>
 </w:styles>
 </file>
 

</xml_diff>

<commit_message>
nmv 20 06 2026
</commit_message>
<xml_diff>
--- a/TS-Kramam/TS-4.1/TS 4.1 Sanskrit Krama Paatam Corrections.docx
+++ b/TS-Kramam/TS-4.1/TS 4.1 Sanskrit Krama Paatam Corrections.docx
@@ -81,7 +81,18 @@
           <w:szCs w:val="32"/>
           <w:u w:val="single"/>
         </w:rPr>
-        <w:t xml:space="preserve">Observed till </w:t>
+        <w:t xml:space="preserve">Observed </w:t>
+      </w:r>
+      <w:proofErr w:type="gramStart"/>
+      <w:r>
+        <w:rPr>
+          <w:b/>
+          <w:bCs/>
+          <w:sz w:val="32"/>
+          <w:szCs w:val="32"/>
+          <w:u w:val="single"/>
+        </w:rPr>
+        <w:t xml:space="preserve">till </w:t>
       </w:r>
       <w:r>
         <w:rPr>
@@ -94,6 +105,7 @@
         </w:rPr>
         <w:t>????</w:t>
       </w:r>
+      <w:proofErr w:type="gramEnd"/>
     </w:p>
     <w:p>
       <w:pPr>
@@ -272,25 +284,7 @@
                 <w:sz w:val="28"/>
                 <w:szCs w:val="32"/>
               </w:rPr>
-              <w:t>T.S.4.1.</w:t>
-            </w:r>
-            <w:r>
-              <w:rPr>
-                <w:rFonts w:cs="Arial"/>
-                <w:b/>
-                <w:sz w:val="28"/>
-                <w:szCs w:val="32"/>
-              </w:rPr>
-              <w:t>4.2</w:t>
-            </w:r>
-            <w:r>
-              <w:rPr>
-                <w:rFonts w:cs="Arial"/>
-                <w:b/>
-                <w:sz w:val="28"/>
-                <w:szCs w:val="32"/>
-              </w:rPr>
-              <w:t xml:space="preserve"> – Kramam</w:t>
+              <w:t>T.S.4.1.4.2 – Kramam</w:t>
             </w:r>
           </w:p>
           <w:p>
@@ -320,17 +314,7 @@
                 <w:szCs w:val="32"/>
                 <w:lang w:val="en-IN"/>
               </w:rPr>
-              <w:t xml:space="preserve">Krama Vaakyam No. - </w:t>
-            </w:r>
-            <w:r>
-              <w:rPr>
-                <w:rFonts w:cs="Arial"/>
-                <w:b/>
-                <w:sz w:val="28"/>
-                <w:szCs w:val="32"/>
-                <w:lang w:val="en-IN"/>
-              </w:rPr>
-              <w:t>10</w:t>
+              <w:t>Krama Vaakyam No. - 10</w:t>
             </w:r>
           </w:p>
           <w:p>
@@ -398,245 +382,17 @@
               <w:autoSpaceDE w:val="0"/>
               <w:autoSpaceDN w:val="0"/>
               <w:adjustRightInd w:val="0"/>
-              <w:spacing w:before="0" w:line="240" w:lineRule="auto"/>
-              <w:rPr>
-                <w:rFonts w:ascii="Latha" w:hAnsi="Latha" w:cs="Latha"/>
-                <w:sz w:val="28"/>
-                <w:szCs w:val="28"/>
-                <w:lang w:bidi="ta-IN"/>
-              </w:rPr>
-            </w:pPr>
-            <w:r>
-              <w:rPr>
-                <w:rFonts w:ascii="Latha" w:hAnsi="Latha" w:cs="Latha"/>
-                <w:sz w:val="28"/>
-                <w:szCs w:val="28"/>
-                <w:highlight w:val="yellow"/>
-                <w:cs/>
-                <w:lang w:bidi="ta-IN"/>
-              </w:rPr>
-              <w:t>ஊ</w:t>
-            </w:r>
-            <w:r>
-              <w:rPr>
-                <w:rFonts w:ascii="BRH Tamil Tab Extra" w:hAnsi="BRH Tamil Tab Extra" w:cs="Latha"/>
-                <w:b/>
-                <w:sz w:val="36"/>
-                <w:szCs w:val="28"/>
-                <w:highlight w:val="yellow"/>
-                <w:lang w:bidi="ta-IN"/>
-              </w:rPr>
-              <w:t>…</w:t>
-            </w:r>
-            <w:r>
-              <w:rPr>
-                <w:rFonts w:ascii="Latha" w:hAnsi="Latha" w:cs="Latha"/>
-                <w:sz w:val="28"/>
-                <w:szCs w:val="28"/>
-                <w:highlight w:val="yellow"/>
-                <w:cs/>
-                <w:lang w:bidi="ta-IN"/>
-              </w:rPr>
-              <w:t>ர்த்</w:t>
-            </w:r>
-            <w:r>
-              <w:rPr>
-                <w:rFonts w:ascii="Latha" w:hAnsi="Latha" w:cs="Latha"/>
-                <w:b/>
-                <w:bCs/>
-                <w:position w:val="-12"/>
-                <w:sz w:val="28"/>
-                <w:szCs w:val="28"/>
-                <w:highlight w:val="yellow"/>
-                <w:cs/>
-                <w:lang w:bidi="ta-IN"/>
-              </w:rPr>
-              <w:t>3</w:t>
-            </w:r>
-            <w:r>
-              <w:rPr>
-                <w:rFonts w:ascii="Latha" w:hAnsi="Latha" w:cs="Latha"/>
-                <w:sz w:val="28"/>
-                <w:szCs w:val="28"/>
-                <w:highlight w:val="yellow"/>
-                <w:cs/>
-                <w:lang w:bidi="ta-IN"/>
-              </w:rPr>
-              <w:t>தோ</w:t>
-            </w:r>
-            <w:r>
-              <w:rPr>
-                <w:rFonts w:ascii="Latha" w:hAnsi="Latha" w:cs="Latha"/>
-                <w:b/>
-                <w:bCs/>
-                <w:position w:val="-12"/>
-                <w:sz w:val="28"/>
-                <w:szCs w:val="28"/>
-                <w:highlight w:val="yellow"/>
-                <w:cs/>
-                <w:lang w:bidi="ta-IN"/>
-              </w:rPr>
-              <w:t>4</w:t>
-            </w:r>
-            <w:r>
-              <w:rPr>
-                <w:rFonts w:ascii="Latha" w:hAnsi="Latha" w:cs="Latha"/>
-                <w:b/>
-                <w:bCs/>
-                <w:position w:val="-12"/>
-                <w:sz w:val="28"/>
-                <w:szCs w:val="28"/>
-                <w:lang w:bidi="ta-IN"/>
-              </w:rPr>
-              <w:t xml:space="preserve"> </w:t>
-            </w:r>
-            <w:r>
-              <w:rPr>
-                <w:rFonts w:ascii="Latha" w:hAnsi="Latha" w:cs="Latha"/>
-                <w:sz w:val="28"/>
-                <w:szCs w:val="28"/>
-                <w:cs/>
-                <w:lang w:bidi="ta-IN"/>
-              </w:rPr>
-              <w:t>வாஜ</w:t>
-            </w:r>
-            <w:r>
-              <w:rPr>
-                <w:rFonts w:ascii="BRH Tamil Tab Extra" w:hAnsi="BRH Tamil Tab Extra" w:cs="Latha"/>
-                <w:b/>
-                <w:sz w:val="36"/>
-                <w:szCs w:val="28"/>
-                <w:lang w:bidi="ta-IN"/>
-              </w:rPr>
-              <w:t>†</w:t>
-            </w:r>
-            <w:r>
-              <w:rPr>
-                <w:rFonts w:ascii="Latha" w:hAnsi="Latha" w:cs="Latha"/>
-                <w:sz w:val="28"/>
-                <w:szCs w:val="28"/>
-                <w:cs/>
-                <w:lang w:bidi="ta-IN"/>
-              </w:rPr>
-              <w:t>ஸ்ய</w:t>
-            </w:r>
-            <w:r>
-              <w:rPr>
-                <w:rFonts w:ascii="Latha" w:hAnsi="Latha" w:cs="Latha"/>
-                <w:sz w:val="28"/>
-                <w:szCs w:val="28"/>
-                <w:lang w:bidi="ta-IN"/>
-              </w:rPr>
-              <w:t xml:space="preserve"> | </w:t>
-            </w:r>
-            <w:r>
-              <w:rPr>
-                <w:rFonts w:ascii="Latha" w:hAnsi="Latha" w:cs="Latha"/>
-                <w:sz w:val="28"/>
-                <w:szCs w:val="28"/>
-                <w:cs/>
-                <w:lang w:bidi="ta-IN"/>
-              </w:rPr>
-              <w:t>வாஜ</w:t>
-            </w:r>
-            <w:r>
-              <w:rPr>
-                <w:rFonts w:ascii="BRH Tamil Tab Extra" w:hAnsi="BRH Tamil Tab Extra" w:cs="Latha"/>
-                <w:b/>
-                <w:sz w:val="36"/>
-                <w:szCs w:val="28"/>
-                <w:lang w:bidi="ta-IN"/>
-              </w:rPr>
-              <w:t>†</w:t>
-            </w:r>
-            <w:r>
-              <w:rPr>
-                <w:rFonts w:ascii="Latha" w:hAnsi="Latha" w:cs="Latha"/>
-                <w:sz w:val="28"/>
-                <w:szCs w:val="28"/>
-                <w:cs/>
-                <w:lang w:bidi="ta-IN"/>
-              </w:rPr>
-              <w:t>ஸ்ய</w:t>
-            </w:r>
-            <w:r>
-              <w:rPr>
-                <w:rFonts w:ascii="BRH Tamil Tab Extra" w:hAnsi="BRH Tamil Tab Extra" w:cs="Latha"/>
-                <w:b/>
-                <w:sz w:val="36"/>
-                <w:szCs w:val="28"/>
-                <w:lang w:bidi="ta-IN"/>
-              </w:rPr>
-              <w:t>…</w:t>
-            </w:r>
-            <w:r>
-              <w:rPr>
-                <w:rFonts w:ascii="Latha" w:hAnsi="Latha" w:cs="Latha"/>
-                <w:sz w:val="28"/>
-                <w:szCs w:val="28"/>
-                <w:lang w:bidi="ta-IN"/>
-              </w:rPr>
-              <w:t xml:space="preserve"> </w:t>
-            </w:r>
-            <w:r>
-              <w:rPr>
-                <w:rFonts w:ascii="Latha" w:hAnsi="Latha" w:cs="Latha"/>
-                <w:sz w:val="28"/>
-                <w:szCs w:val="28"/>
-                <w:cs/>
-                <w:lang w:bidi="ta-IN"/>
-              </w:rPr>
-              <w:t>ஸனி</w:t>
-            </w:r>
-            <w:r>
-              <w:rPr>
-                <w:rFonts w:ascii="BRH Tamil Tab Extra" w:hAnsi="BRH Tamil Tab Extra" w:cs="Latha"/>
-                <w:b/>
-                <w:sz w:val="36"/>
-                <w:szCs w:val="28"/>
-                <w:lang w:bidi="ta-IN"/>
-              </w:rPr>
-              <w:t>†</w:t>
-            </w:r>
-            <w:r>
-              <w:rPr>
-                <w:rFonts w:ascii="Latha" w:hAnsi="Latha" w:cs="Latha"/>
-                <w:sz w:val="28"/>
-                <w:szCs w:val="28"/>
-                <w:cs/>
-                <w:lang w:bidi="ta-IN"/>
-              </w:rPr>
-              <w:t>தா</w:t>
-            </w:r>
-            <w:r>
-              <w:rPr>
-                <w:rFonts w:ascii="Latha" w:hAnsi="Latha" w:cs="Latha"/>
-                <w:sz w:val="28"/>
-                <w:szCs w:val="28"/>
-                <w:lang w:bidi="ta-IN"/>
-              </w:rPr>
-              <w:t xml:space="preserve"> </w:t>
-            </w:r>
-          </w:p>
-          <w:p>
-            <w:pPr>
-              <w:widowControl w:val="0"/>
-              <w:autoSpaceDE w:val="0"/>
-              <w:autoSpaceDN w:val="0"/>
-              <w:adjustRightInd w:val="0"/>
               <w:spacing w:line="252" w:lineRule="auto"/>
               <w:ind w:right="-279"/>
               <w:rPr>
                 <w:rFonts w:ascii="BRH Devanagari Extra" w:hAnsi="BRH Devanagari Extra" w:cs="BRH Devanagari Extra"/>
-                <w:color w:val="000000"/>
-                <w:sz w:val="40"/>
-                <w:szCs w:val="40"/>
-              </w:rPr>
-            </w:pPr>
-            <w:r>
-              <w:rPr>
-                <w:rFonts w:ascii="BRH Devanagari Extra" w:hAnsi="BRH Devanagari Extra" w:cs="BRH Devanagari Extra"/>
-                <w:color w:val="000000"/>
+                <w:sz w:val="40"/>
+                <w:szCs w:val="40"/>
+              </w:rPr>
+            </w:pPr>
+            <w:r>
+              <w:rPr>
+                <w:rFonts w:ascii="BRH Devanagari Extra" w:hAnsi="BRH Devanagari Extra" w:cs="BRH Devanagari Extra"/>
                 <w:sz w:val="40"/>
                 <w:szCs w:val="40"/>
               </w:rPr>
@@ -645,7 +401,6 @@
             <w:r>
               <w:rPr>
                 <w:rFonts w:ascii="BRH Malayalam Extra" w:hAnsi="BRH Malayalam Extra" w:cs="BRH Devanagari Extra"/>
-                <w:color w:val="EE0000"/>
                 <w:sz w:val="32"/>
                 <w:szCs w:val="40"/>
                 <w:highlight w:val="yellow"/>
@@ -655,7 +410,6 @@
             <w:r>
               <w:rPr>
                 <w:rFonts w:ascii="BRH Devanagari Extra" w:hAnsi="BRH Devanagari Extra" w:cs="BRH Devanagari Extra"/>
-                <w:color w:val="EE0000"/>
                 <w:sz w:val="40"/>
                 <w:szCs w:val="40"/>
                 <w:highlight w:val="yellow"/>
@@ -665,43 +419,22 @@
             <w:r>
               <w:rPr>
                 <w:rFonts w:ascii="BRH Devanagari Extra" w:hAnsi="BRH Devanagari Extra" w:cs="BRH Devanagari Extra"/>
-                <w:color w:val="000000"/>
-                <w:sz w:val="40"/>
-                <w:szCs w:val="40"/>
-              </w:rPr>
-              <w:t xml:space="preserve"> uÉÉeÉþxrÉ |</w:t>
-            </w:r>
-            <w:r>
-              <w:rPr>
-                <w:rFonts w:ascii="BRH Devanagari Extra" w:hAnsi="BRH Devanagari Extra" w:cs="BRH Devanagari Extra"/>
-                <w:color w:val="000000"/>
-                <w:sz w:val="40"/>
-                <w:szCs w:val="40"/>
-              </w:rPr>
-              <w:t xml:space="preserve"> </w:t>
-            </w:r>
-            <w:r>
-              <w:rPr>
-                <w:rFonts w:ascii="BRH Devanagari Extra" w:hAnsi="BRH Devanagari Extra" w:cs="BRH Devanagari Extra"/>
-                <w:color w:val="000000"/>
-                <w:sz w:val="40"/>
-                <w:szCs w:val="40"/>
-              </w:rPr>
-              <w:t>uÉÉeÉþxrÉ</w:t>
-            </w:r>
-            <w:r>
-              <w:rPr>
-                <w:rFonts w:ascii="BRH Malayalam Extra" w:hAnsi="BRH Malayalam Extra" w:cs="BRH Devanagari Extra"/>
-                <w:color w:val="000000"/>
-                <w:sz w:val="32"/>
-                <w:szCs w:val="40"/>
-              </w:rPr>
-              <w:t>–</w:t>
-            </w:r>
-            <w:r>
-              <w:rPr>
-                <w:rFonts w:ascii="BRH Devanagari Extra" w:hAnsi="BRH Devanagari Extra" w:cs="BRH Devanagari Extra"/>
-                <w:color w:val="000000"/>
+                <w:sz w:val="40"/>
+                <w:szCs w:val="40"/>
+              </w:rPr>
+              <w:t xml:space="preserve"> uÉÉeÉþxrÉ | uÉÉeÉþxrÉ</w:t>
+            </w:r>
+            <w:r>
+              <w:rPr>
+                <w:rFonts w:ascii="BRH Malayalam Extra" w:hAnsi="BRH Malayalam Extra" w:cs="BRH Devanagari Extra"/>
+                <w:sz w:val="32"/>
+                <w:szCs w:val="40"/>
+              </w:rPr>
+              <w:t>–</w:t>
+            </w:r>
+            <w:r>
+              <w:rPr>
+                <w:rFonts w:ascii="BRH Devanagari Extra" w:hAnsi="BRH Devanagari Extra" w:cs="BRH Devanagari Extra"/>
                 <w:sz w:val="40"/>
                 <w:szCs w:val="40"/>
               </w:rPr>
@@ -728,230 +461,59 @@
               <w:spacing w:before="0" w:line="240" w:lineRule="auto"/>
               <w:rPr>
                 <w:rFonts w:ascii="BRH Devanagari Extra" w:hAnsi="BRH Devanagari Extra" w:cs="BRH Devanagari Extra"/>
-                <w:color w:val="000000"/>
-                <w:sz w:val="40"/>
-                <w:szCs w:val="40"/>
-              </w:rPr>
-            </w:pPr>
-            <w:r>
-              <w:rPr>
-                <w:rFonts w:ascii="Latha" w:hAnsi="Latha" w:cs="Latha"/>
-                <w:sz w:val="28"/>
-                <w:szCs w:val="28"/>
+                <w:sz w:val="40"/>
+                <w:szCs w:val="40"/>
+              </w:rPr>
+            </w:pPr>
+            <w:r>
+              <w:rPr>
+                <w:rFonts w:ascii="BRH Devanagari Extra" w:hAnsi="BRH Devanagari Extra" w:cs="BRH Devanagari Extra"/>
+                <w:sz w:val="40"/>
+                <w:szCs w:val="40"/>
+              </w:rPr>
+              <w:t>F</w:t>
+            </w:r>
+            <w:r>
+              <w:rPr>
+                <w:rFonts w:ascii="BRH Malayalam Extra" w:hAnsi="BRH Malayalam Extra" w:cs="BRH Devanagari Extra"/>
+                <w:sz w:val="32"/>
+                <w:szCs w:val="40"/>
                 <w:highlight w:val="green"/>
-                <w:cs/>
-                <w:lang w:bidi="ta-IN"/>
-              </w:rPr>
-              <w:t>ஊ</w:t>
-            </w:r>
-            <w:r>
-              <w:rPr>
-                <w:rFonts w:ascii="BRH Tamil Tab Extra" w:hAnsi="BRH Tamil Tab Extra" w:cs="Latha"/>
-                <w:b/>
-                <w:bCs/>
-                <w:sz w:val="28"/>
-                <w:szCs w:val="28"/>
+              </w:rPr>
+              <w:t>–</w:t>
+            </w:r>
+            <w:r>
+              <w:rPr>
+                <w:rFonts w:ascii="BRH Devanagari Extra" w:hAnsi="BRH Devanagari Extra" w:cs="BRH Devanagari Extra"/>
+                <w:sz w:val="40"/>
+                <w:szCs w:val="40"/>
                 <w:highlight w:val="green"/>
-                <w:lang w:bidi="ta-IN"/>
-              </w:rPr>
-              <w:t>…</w:t>
-            </w:r>
-            <w:r>
-              <w:rPr>
-                <w:rFonts w:ascii="Latha" w:hAnsi="Latha" w:cs="Latha"/>
-                <w:sz w:val="28"/>
-                <w:szCs w:val="28"/>
-                <w:highlight w:val="green"/>
-                <w:cs/>
-                <w:lang w:bidi="ta-IN"/>
-              </w:rPr>
-              <w:t>ர்த்</w:t>
-            </w:r>
-            <w:r>
-              <w:rPr>
-                <w:rFonts w:ascii="Latha" w:hAnsi="Latha" w:cs="Latha"/>
-                <w:b/>
-                <w:bCs/>
-                <w:position w:val="-12"/>
-                <w:sz w:val="28"/>
-                <w:szCs w:val="28"/>
-                <w:highlight w:val="green"/>
-                <w:cs/>
-                <w:lang w:bidi="ta-IN"/>
-              </w:rPr>
-              <w:t>3</w:t>
-            </w:r>
-            <w:r>
-              <w:rPr>
-                <w:rFonts w:ascii="Latha" w:hAnsi="Latha" w:cs="Latha"/>
-                <w:sz w:val="28"/>
-                <w:szCs w:val="28"/>
-                <w:highlight w:val="green"/>
-                <w:cs/>
-                <w:lang w:bidi="ta-IN"/>
-              </w:rPr>
-              <w:t>த்</w:t>
-            </w:r>
-            <w:r>
-              <w:rPr>
-                <w:rFonts w:ascii="Latha" w:hAnsi="Latha" w:cs="Latha"/>
-                <w:b/>
-                <w:bCs/>
-                <w:position w:val="-12"/>
-                <w:sz w:val="28"/>
-                <w:szCs w:val="28"/>
-                <w:highlight w:val="green"/>
-                <w:cs/>
-                <w:lang w:bidi="ta-IN"/>
-              </w:rPr>
-              <w:t>4</w:t>
-            </w:r>
-            <w:r>
-              <w:rPr>
-                <w:rFonts w:ascii="Latha" w:hAnsi="Latha" w:cs="Latha"/>
-                <w:sz w:val="28"/>
-                <w:szCs w:val="28"/>
-                <w:highlight w:val="green"/>
-                <w:cs/>
-                <w:lang w:bidi="ta-IN"/>
-              </w:rPr>
-              <w:t>வோ</w:t>
-            </w:r>
-            <w:r>
-              <w:rPr>
-                <w:rFonts w:ascii="Latha" w:hAnsi="Latha" w:cs="Latha"/>
-                <w:sz w:val="28"/>
-                <w:szCs w:val="28"/>
-                <w:lang w:bidi="ta-IN"/>
-              </w:rPr>
-              <w:t xml:space="preserve"> </w:t>
-            </w:r>
-            <w:r>
-              <w:rPr>
-                <w:rFonts w:ascii="Latha" w:hAnsi="Latha" w:cs="Latha"/>
-                <w:sz w:val="28"/>
-                <w:szCs w:val="28"/>
-                <w:cs/>
-                <w:lang w:bidi="ta-IN"/>
-              </w:rPr>
-              <w:t>வாஜ</w:t>
-            </w:r>
-            <w:r>
-              <w:rPr>
-                <w:rFonts w:ascii="BRH Tamil Tab Extra" w:hAnsi="BRH Tamil Tab Extra" w:cs="Latha"/>
-                <w:b/>
-                <w:sz w:val="36"/>
-                <w:szCs w:val="28"/>
-                <w:lang w:bidi="ta-IN"/>
-              </w:rPr>
-              <w:t>†</w:t>
-            </w:r>
-            <w:r>
-              <w:rPr>
-                <w:rFonts w:ascii="Latha" w:hAnsi="Latha" w:cs="Latha"/>
-                <w:sz w:val="28"/>
-                <w:szCs w:val="28"/>
-                <w:cs/>
-                <w:lang w:bidi="ta-IN"/>
-              </w:rPr>
-              <w:t>ஸ்ய</w:t>
-            </w:r>
-            <w:r>
-              <w:rPr>
-                <w:rFonts w:ascii="Latha" w:hAnsi="Latha" w:cs="Latha"/>
-                <w:sz w:val="28"/>
-                <w:szCs w:val="28"/>
-                <w:lang w:bidi="ta-IN"/>
-              </w:rPr>
-              <w:t xml:space="preserve"> | </w:t>
-            </w:r>
-            <w:r>
-              <w:rPr>
-                <w:rFonts w:ascii="Latha" w:hAnsi="Latha" w:cs="Latha"/>
-                <w:sz w:val="28"/>
-                <w:szCs w:val="28"/>
-                <w:cs/>
-                <w:lang w:bidi="ta-IN"/>
-              </w:rPr>
-              <w:t>வாஜ</w:t>
-            </w:r>
-            <w:r>
-              <w:rPr>
-                <w:rFonts w:ascii="BRH Tamil Tab Extra" w:hAnsi="BRH Tamil Tab Extra" w:cs="Latha"/>
-                <w:b/>
-                <w:sz w:val="36"/>
-                <w:szCs w:val="28"/>
-                <w:lang w:bidi="ta-IN"/>
-              </w:rPr>
-              <w:t>†</w:t>
-            </w:r>
-            <w:r>
-              <w:rPr>
-                <w:rFonts w:ascii="Latha" w:hAnsi="Latha" w:cs="Latha"/>
-                <w:sz w:val="28"/>
-                <w:szCs w:val="28"/>
-                <w:cs/>
-                <w:lang w:bidi="ta-IN"/>
-              </w:rPr>
-              <w:t>ஸ்ய</w:t>
-            </w:r>
-            <w:r>
-              <w:rPr>
-                <w:rFonts w:ascii="BRH Tamil Tab Extra" w:hAnsi="BRH Tamil Tab Extra" w:cs="Latha"/>
-                <w:b/>
-                <w:sz w:val="36"/>
-                <w:szCs w:val="28"/>
-                <w:lang w:bidi="ta-IN"/>
-              </w:rPr>
-              <w:t>…</w:t>
-            </w:r>
-            <w:r>
-              <w:rPr>
-                <w:rFonts w:ascii="Latha" w:hAnsi="Latha" w:cs="Latha"/>
-                <w:sz w:val="28"/>
-                <w:szCs w:val="28"/>
-                <w:lang w:bidi="ta-IN"/>
-              </w:rPr>
-              <w:t xml:space="preserve"> </w:t>
-            </w:r>
-            <w:r>
-              <w:rPr>
-                <w:rFonts w:ascii="Latha" w:hAnsi="Latha" w:cs="Latha"/>
-                <w:sz w:val="28"/>
-                <w:szCs w:val="28"/>
-                <w:cs/>
-                <w:lang w:bidi="ta-IN"/>
-              </w:rPr>
-              <w:t>ஸனி</w:t>
-            </w:r>
-            <w:r>
-              <w:rPr>
-                <w:rFonts w:ascii="BRH Tamil Tab Extra" w:hAnsi="BRH Tamil Tab Extra" w:cs="Latha"/>
-                <w:b/>
-                <w:sz w:val="36"/>
-                <w:szCs w:val="28"/>
-                <w:lang w:bidi="ta-IN"/>
-              </w:rPr>
-              <w:t>†</w:t>
-            </w:r>
-            <w:r>
-              <w:rPr>
-                <w:rFonts w:ascii="Latha" w:hAnsi="Latha" w:cs="Latha"/>
-                <w:sz w:val="28"/>
-                <w:szCs w:val="28"/>
-                <w:cs/>
-                <w:lang w:bidi="ta-IN"/>
-              </w:rPr>
-              <w:t>தா</w:t>
-            </w:r>
-            <w:r>
-              <w:rPr>
-                <w:rFonts w:ascii="Latha" w:hAnsi="Latha" w:cs="Latha"/>
-                <w:sz w:val="28"/>
-                <w:szCs w:val="28"/>
-                <w:lang w:bidi="ta-IN"/>
-              </w:rPr>
-              <w:t xml:space="preserve"> |</w:t>
+              </w:rPr>
+              <w:t>SïèkuÉÉå</w:t>
+            </w:r>
+            <w:r>
+              <w:rPr>
+                <w:rFonts w:ascii="BRH Devanagari Extra" w:hAnsi="BRH Devanagari Extra" w:cs="BRH Devanagari Extra"/>
+                <w:sz w:val="40"/>
+                <w:szCs w:val="40"/>
+              </w:rPr>
+              <w:t xml:space="preserve"> uÉÉeÉþxrÉ | uÉÉeÉþxrÉ</w:t>
+            </w:r>
+            <w:r>
+              <w:rPr>
+                <w:rFonts w:ascii="BRH Malayalam Extra" w:hAnsi="BRH Malayalam Extra" w:cs="BRH Devanagari Extra"/>
+                <w:sz w:val="32"/>
+                <w:szCs w:val="40"/>
+              </w:rPr>
+              <w:t>–</w:t>
+            </w:r>
+            <w:r>
+              <w:rPr>
+                <w:rFonts w:ascii="BRH Devanagari Extra" w:hAnsi="BRH Devanagari Extra" w:cs="BRH Devanagari Extra"/>
+                <w:sz w:val="40"/>
+                <w:szCs w:val="40"/>
+              </w:rPr>
+              <w:t xml:space="preserve"> xÉÌlÉþiÉÉ |</w:t>
             </w:r>
           </w:p>
         </w:tc>
@@ -995,25 +557,7 @@
                 <w:sz w:val="28"/>
                 <w:szCs w:val="32"/>
               </w:rPr>
-              <w:t>T.S.4.1.</w:t>
-            </w:r>
-            <w:r>
-              <w:rPr>
-                <w:rFonts w:cs="Arial"/>
-                <w:b/>
-                <w:sz w:val="28"/>
-                <w:szCs w:val="32"/>
-              </w:rPr>
-              <w:t>6.2</w:t>
-            </w:r>
-            <w:r>
-              <w:rPr>
-                <w:rFonts w:cs="Arial"/>
-                <w:b/>
-                <w:sz w:val="28"/>
-                <w:szCs w:val="32"/>
-              </w:rPr>
-              <w:t xml:space="preserve"> – Kramam</w:t>
+              <w:t>T.S.4.1.6.2 – Kramam</w:t>
             </w:r>
           </w:p>
           <w:p>
@@ -1092,17 +636,7 @@
                 <w:szCs w:val="32"/>
                 <w:lang w:val="it-IT"/>
               </w:rPr>
-              <w:t>2</w:t>
-            </w:r>
-            <w:r>
-              <w:rPr>
-                <w:rFonts w:cs="Arial"/>
-                <w:b/>
-                <w:sz w:val="28"/>
-                <w:szCs w:val="32"/>
-                <w:lang w:val="it-IT"/>
-              </w:rPr>
-              <w:t>3</w:t>
+              <w:t>23</w:t>
             </w:r>
           </w:p>
         </w:tc>
@@ -1125,7 +659,6 @@
               <w:spacing w:before="0" w:line="240" w:lineRule="auto"/>
               <w:rPr>
                 <w:rFonts w:ascii="BRH Malayalam Extra" w:eastAsia="Times New Roman" w:hAnsi="BRH Malayalam Extra" w:cs="BRH Malayalam Extra"/>
-                <w:color w:val="000000"/>
                 <w:sz w:val="40"/>
                 <w:szCs w:val="40"/>
                 <w:lang w:val="en-IN" w:eastAsia="en-IN" w:bidi="ml-IN"/>
@@ -1134,7 +667,6 @@
             <w:r>
               <w:rPr>
                 <w:rFonts w:ascii="BRH Devanagari Extra" w:hAnsi="BRH Devanagari Extra" w:cs="BRH Devanagari Extra"/>
-                <w:color w:val="000000"/>
                 <w:sz w:val="40"/>
                 <w:szCs w:val="40"/>
               </w:rPr>
@@ -1143,16 +675,14 @@
             <w:r>
               <w:rPr>
                 <w:rFonts w:ascii="BRH Malayalam Extra" w:hAnsi="BRH Malayalam Extra" w:cs="BRH Devanagari Extra"/>
-                <w:color w:val="000000"/>
-                <w:sz w:val="32"/>
-                <w:szCs w:val="40"/>
-              </w:rPr>
-              <w:t>–</w:t>
-            </w:r>
-            <w:r>
-              <w:rPr>
-                <w:rFonts w:ascii="BRH Devanagari Extra" w:hAnsi="BRH Devanagari Extra" w:cs="BRH Devanagari Extra"/>
-                <w:color w:val="000000"/>
+                <w:sz w:val="32"/>
+                <w:szCs w:val="40"/>
+              </w:rPr>
+              <w:t>–</w:t>
+            </w:r>
+            <w:r>
+              <w:rPr>
+                <w:rFonts w:ascii="BRH Devanagari Extra" w:hAnsi="BRH Devanagari Extra" w:cs="BRH Devanagari Extra"/>
                 <w:sz w:val="40"/>
                 <w:szCs w:val="40"/>
                 <w:highlight w:val="yellow"/>
@@ -1162,7 +692,6 @@
             <w:r>
               <w:rPr>
                 <w:rFonts w:ascii="BRH Malayalam Extra" w:hAnsi="BRH Malayalam Extra" w:cs="BRH Devanagari Extra"/>
-                <w:color w:val="000000"/>
                 <w:sz w:val="32"/>
                 <w:szCs w:val="40"/>
                 <w:highlight w:val="yellow"/>
@@ -1172,7 +701,6 @@
             <w:r>
               <w:rPr>
                 <w:rFonts w:ascii="BRH Devanagari Extra" w:hAnsi="BRH Devanagari Extra" w:cs="BRH Devanagari Extra"/>
-                <w:color w:val="000000"/>
                 <w:sz w:val="40"/>
                 <w:szCs w:val="40"/>
               </w:rPr>
@@ -1199,7 +727,6 @@
               <w:spacing w:before="0" w:line="240" w:lineRule="auto"/>
               <w:rPr>
                 <w:rFonts w:ascii="BRH Malayalam Extra" w:eastAsia="Times New Roman" w:hAnsi="BRH Malayalam Extra" w:cs="BRH Malayalam Extra"/>
-                <w:color w:val="000000"/>
                 <w:sz w:val="40"/>
                 <w:szCs w:val="40"/>
                 <w:lang w:val="en-IN" w:eastAsia="en-IN" w:bidi="ml-IN"/>
@@ -1208,7 +735,6 @@
             <w:r>
               <w:rPr>
                 <w:rFonts w:ascii="BRH Devanagari Extra" w:hAnsi="BRH Devanagari Extra" w:cs="BRH Devanagari Extra"/>
-                <w:color w:val="000000"/>
                 <w:sz w:val="40"/>
                 <w:szCs w:val="40"/>
               </w:rPr>
@@ -1217,16 +743,14 @@
             <w:r>
               <w:rPr>
                 <w:rFonts w:ascii="BRH Malayalam Extra" w:hAnsi="BRH Malayalam Extra" w:cs="BRH Devanagari Extra"/>
-                <w:color w:val="000000"/>
-                <w:sz w:val="32"/>
-                <w:szCs w:val="40"/>
-              </w:rPr>
-              <w:t>–</w:t>
-            </w:r>
-            <w:r>
-              <w:rPr>
-                <w:rFonts w:ascii="BRH Devanagari Extra" w:hAnsi="BRH Devanagari Extra" w:cs="BRH Devanagari Extra"/>
-                <w:color w:val="000000"/>
+                <w:sz w:val="32"/>
+                <w:szCs w:val="40"/>
+              </w:rPr>
+              <w:t>–</w:t>
+            </w:r>
+            <w:r>
+              <w:rPr>
+                <w:rFonts w:ascii="BRH Devanagari Extra" w:hAnsi="BRH Devanagari Extra" w:cs="BRH Devanagari Extra"/>
                 <w:sz w:val="40"/>
                 <w:szCs w:val="40"/>
                 <w:highlight w:val="green"/>
@@ -1236,16 +760,14 @@
             <w:r>
               <w:rPr>
                 <w:rFonts w:ascii="BRH Malayalam Extra" w:hAnsi="BRH Malayalam Extra" w:cs="BRH Devanagari Extra"/>
-                <w:color w:val="000000"/>
-                <w:sz w:val="32"/>
-                <w:szCs w:val="40"/>
-              </w:rPr>
-              <w:t>–</w:t>
-            </w:r>
-            <w:r>
-              <w:rPr>
-                <w:rFonts w:ascii="BRH Devanagari Extra" w:hAnsi="BRH Devanagari Extra" w:cs="BRH Devanagari Extra"/>
-                <w:color w:val="000000"/>
+                <w:sz w:val="32"/>
+                <w:szCs w:val="40"/>
+              </w:rPr>
+              <w:t>–</w:t>
+            </w:r>
+            <w:r>
+              <w:rPr>
+                <w:rFonts w:ascii="BRH Devanagari Extra" w:hAnsi="BRH Devanagari Extra" w:cs="BRH Devanagari Extra"/>
                 <w:sz w:val="40"/>
                 <w:szCs w:val="40"/>
               </w:rPr>
@@ -1293,25 +815,7 @@
                 <w:sz w:val="28"/>
                 <w:szCs w:val="32"/>
               </w:rPr>
-              <w:t>T.S.4.1.</w:t>
-            </w:r>
-            <w:r>
-              <w:rPr>
-                <w:rFonts w:cs="Arial"/>
-                <w:b/>
-                <w:sz w:val="28"/>
-                <w:szCs w:val="32"/>
-              </w:rPr>
-              <w:t>6.2</w:t>
-            </w:r>
-            <w:r>
-              <w:rPr>
-                <w:rFonts w:cs="Arial"/>
-                <w:b/>
-                <w:sz w:val="28"/>
-                <w:szCs w:val="32"/>
-              </w:rPr>
-              <w:t xml:space="preserve"> – Kramam</w:t>
+              <w:t>T.S.4.1.6.2 – Kramam</w:t>
             </w:r>
           </w:p>
           <w:p>
@@ -1328,8 +832,7 @@
               <w:rPr>
                 <w:rFonts w:cs="Arial"/>
                 <w:b/>
-                <w:sz w:val="28"/>
-                <w:szCs w:val="32"/>
+                <w:szCs w:val="28"/>
                 <w:lang w:val="en-IN"/>
               </w:rPr>
             </w:pPr>
@@ -1337,41 +840,28 @@
               <w:rPr>
                 <w:rFonts w:cs="Arial"/>
                 <w:b/>
-                <w:sz w:val="28"/>
-                <w:szCs w:val="32"/>
+                <w:szCs w:val="28"/>
                 <w:lang w:val="en-IN"/>
               </w:rPr>
-              <w:t xml:space="preserve">Krama Vaakyam No. </w:t>
-            </w:r>
-            <w:r>
-              <w:rPr>
-                <w:rFonts w:cs="Arial"/>
-                <w:b/>
-                <w:sz w:val="28"/>
-                <w:szCs w:val="32"/>
+              <w:t xml:space="preserve">Krama Vaakyam No. 55 </w:t>
+            </w:r>
+            <w:r>
+              <w:rPr>
+                <w:rFonts w:cs="Arial"/>
+                <w:b/>
+                <w:szCs w:val="28"/>
                 <w:lang w:val="en-IN"/>
               </w:rPr>
-              <w:t>–</w:t>
-            </w:r>
-            <w:r>
-              <w:rPr>
-                <w:rFonts w:cs="Arial"/>
-                <w:b/>
-                <w:sz w:val="28"/>
-                <w:szCs w:val="32"/>
+              <w:t>,</w:t>
+            </w:r>
+            <w:r>
+              <w:rPr>
+                <w:rFonts w:cs="Arial"/>
+                <w:b/>
+                <w:szCs w:val="28"/>
                 <w:lang w:val="en-IN"/>
               </w:rPr>
-              <w:t xml:space="preserve"> </w:t>
-            </w:r>
-            <w:r>
-              <w:rPr>
-                <w:rFonts w:cs="Arial"/>
-                <w:b/>
-                <w:sz w:val="28"/>
-                <w:szCs w:val="32"/>
-                <w:lang w:val="en-IN"/>
-              </w:rPr>
-              <w:t>55 and 56</w:t>
+              <w:t>56</w:t>
             </w:r>
           </w:p>
           <w:p>
@@ -1419,17 +909,7 @@
                 <w:szCs w:val="32"/>
                 <w:lang w:val="it-IT"/>
               </w:rPr>
-              <w:t>2</w:t>
-            </w:r>
-            <w:r>
-              <w:rPr>
-                <w:rFonts w:cs="Arial"/>
-                <w:b/>
-                <w:sz w:val="28"/>
-                <w:szCs w:val="32"/>
-                <w:lang w:val="it-IT"/>
-              </w:rPr>
-              <w:t>3</w:t>
+              <w:t>23</w:t>
             </w:r>
           </w:p>
         </w:tc>
@@ -1451,413 +931,110 @@
               <w:adjustRightInd w:val="0"/>
               <w:spacing w:before="0" w:line="240" w:lineRule="auto"/>
               <w:rPr>
-                <w:rFonts w:ascii="Latha" w:hAnsi="Latha" w:cs="Latha"/>
-                <w:sz w:val="28"/>
-                <w:szCs w:val="28"/>
-                <w:lang w:bidi="ta-IN"/>
-              </w:rPr>
-            </w:pPr>
-            <w:r>
-              <w:rPr>
-                <w:rFonts w:ascii="Latha" w:hAnsi="Latha" w:cs="Latha"/>
-                <w:sz w:val="28"/>
-                <w:szCs w:val="28"/>
-                <w:cs/>
-                <w:lang w:bidi="ta-IN"/>
-              </w:rPr>
-              <w:t>த</w:t>
-            </w:r>
-            <w:r>
-              <w:rPr>
-                <w:rFonts w:ascii="BRH Tamil Tab Extra" w:hAnsi="BRH Tamil Tab Extra" w:cs="Latha"/>
-                <w:b/>
-                <w:sz w:val="36"/>
-                <w:szCs w:val="28"/>
-                <w:lang w:bidi="ta-IN"/>
-              </w:rPr>
-              <w:t>…</w:t>
-            </w:r>
-            <w:r>
-              <w:rPr>
-                <w:rFonts w:ascii="Latha" w:hAnsi="Latha" w:cs="Latha"/>
-                <w:b/>
-                <w:bCs/>
-                <w:position w:val="-12"/>
-                <w:sz w:val="28"/>
-                <w:szCs w:val="28"/>
-                <w:cs/>
-                <w:lang w:bidi="ta-IN"/>
-              </w:rPr>
-              <w:t>3</w:t>
-            </w:r>
-            <w:r>
-              <w:rPr>
-                <w:rFonts w:ascii="Latha" w:hAnsi="Latha" w:cs="Latha"/>
-                <w:sz w:val="28"/>
-                <w:szCs w:val="28"/>
-                <w:cs/>
-                <w:lang w:bidi="ta-IN"/>
-              </w:rPr>
-              <w:t>தா</w:t>
-            </w:r>
-            <w:r>
-              <w:rPr>
-                <w:rFonts w:ascii="BRH Tamil Tab Extra" w:hAnsi="BRH Tamil Tab Extra" w:cs="Latha"/>
-                <w:b/>
-                <w:sz w:val="36"/>
-                <w:szCs w:val="28"/>
-                <w:lang w:bidi="ta-IN"/>
-              </w:rPr>
-              <w:t>…</w:t>
-            </w:r>
-            <w:r>
-              <w:rPr>
-                <w:rFonts w:ascii="Latha" w:hAnsi="Latha" w:cs="Latha"/>
-                <w:b/>
-                <w:bCs/>
-                <w:position w:val="-12"/>
-                <w:sz w:val="28"/>
-                <w:szCs w:val="28"/>
-                <w:cs/>
-                <w:lang w:bidi="ta-IN"/>
-              </w:rPr>
-              <w:t>3</w:t>
-            </w:r>
-            <w:r>
-              <w:rPr>
-                <w:rFonts w:ascii="Latha" w:hAnsi="Latha" w:cs="Latha"/>
-                <w:sz w:val="28"/>
-                <w:szCs w:val="28"/>
-                <w:cs/>
-                <w:lang w:bidi="ta-IN"/>
-              </w:rPr>
-              <w:t>ம்ய</w:t>
-            </w:r>
-            <w:r>
-              <w:rPr>
-                <w:rFonts w:ascii="Latha" w:hAnsi="Latha" w:cs="Latha"/>
-                <w:sz w:val="28"/>
-                <w:szCs w:val="28"/>
+                <w:rFonts w:ascii="BRH Devanagari Extra" w:hAnsi="BRH Devanagari Extra" w:cs="BRH Devanagari Extra"/>
+                <w:sz w:val="40"/>
+                <w:szCs w:val="40"/>
+              </w:rPr>
+            </w:pPr>
+            <w:r>
+              <w:rPr>
+                <w:rFonts w:ascii="BRH Devanagari Extra" w:hAnsi="BRH Devanagari Extra" w:cs="BRH Devanagari Extra"/>
+                <w:sz w:val="40"/>
+                <w:szCs w:val="40"/>
+              </w:rPr>
+              <w:t>S</w:t>
+            </w:r>
+            <w:r>
+              <w:rPr>
+                <w:rFonts w:ascii="BRH Malayalam Extra" w:hAnsi="BRH Malayalam Extra" w:cs="BRH Devanagari Extra"/>
+                <w:sz w:val="32"/>
+                <w:szCs w:val="40"/>
+              </w:rPr>
+              <w:t>–</w:t>
+            </w:r>
+            <w:r>
+              <w:rPr>
+                <w:rFonts w:ascii="BRH Devanagari Extra" w:hAnsi="BRH Devanagari Extra" w:cs="BRH Devanagari Extra"/>
+                <w:sz w:val="40"/>
+                <w:szCs w:val="40"/>
+              </w:rPr>
+              <w:t>SÉ</w:t>
+            </w:r>
+            <w:r>
+              <w:rPr>
+                <w:rFonts w:ascii="BRH Malayalam Extra" w:hAnsi="BRH Malayalam Extra" w:cs="BRH Devanagari Extra"/>
+                <w:sz w:val="32"/>
+                <w:szCs w:val="40"/>
+              </w:rPr>
+              <w:t>–</w:t>
+            </w:r>
+            <w:r>
+              <w:rPr>
+                <w:rFonts w:ascii="BRH Devanagari Extra" w:hAnsi="BRH Devanagari Extra" w:cs="BRH Devanagari Extra"/>
+                <w:sz w:val="40"/>
+                <w:szCs w:val="40"/>
+              </w:rPr>
+              <w:t>qrÉ</w:t>
+            </w:r>
+            <w:r>
+              <w:rPr>
+                <w:rFonts w:ascii="BRH Devanagari Extra" w:hAnsi="BRH Devanagari Extra" w:cs="BRH Devanagari Extra"/>
+                <w:sz w:val="40"/>
+                <w:szCs w:val="40"/>
                 <w:highlight w:val="yellow"/>
-                <w:cs/>
-                <w:lang w:bidi="ta-IN"/>
-              </w:rPr>
-              <w:t>பி</w:t>
-            </w:r>
-            <w:r>
-              <w:rPr>
-                <w:rFonts w:ascii="BRH Tamil Tab Extra" w:hAnsi="BRH Tamil Tab Extra" w:cs="Latha"/>
-                <w:b/>
-                <w:sz w:val="36"/>
-                <w:szCs w:val="28"/>
+              </w:rPr>
+              <w:t>ÍpÉþirÉæ</w:t>
+            </w:r>
+            <w:r>
+              <w:rPr>
+                <w:rFonts w:ascii="BRH Devanagari Extra" w:hAnsi="BRH Devanagari Extra" w:cs="BRH Devanagari Extra"/>
+                <w:sz w:val="40"/>
+                <w:szCs w:val="40"/>
+              </w:rPr>
+              <w:t xml:space="preserve"> | AÍpÉ</w:t>
+            </w:r>
+            <w:r>
+              <w:rPr>
+                <w:rFonts w:ascii="BRH Devanagari Extra" w:hAnsi="BRH Devanagari Extra" w:cs="BRH Devanagari Extra"/>
+                <w:sz w:val="40"/>
+                <w:szCs w:val="40"/>
                 <w:highlight w:val="yellow"/>
-                <w:lang w:bidi="ta-IN"/>
-              </w:rPr>
-              <w:t>†</w:t>
-            </w:r>
-            <w:r>
-              <w:rPr>
-                <w:rFonts w:ascii="Latha" w:hAnsi="Latha" w:cs="Latha"/>
-                <w:b/>
-                <w:bCs/>
-                <w:position w:val="-12"/>
-                <w:sz w:val="28"/>
-                <w:szCs w:val="28"/>
+              </w:rPr>
+              <w:t>þirÉÉ</w:t>
+            </w:r>
+            <w:r>
+              <w:rPr>
+                <w:rFonts w:ascii="BRH Malayalam Extra" w:hAnsi="BRH Malayalam Extra" w:cs="BRH Devanagari Extra"/>
+                <w:sz w:val="32"/>
+                <w:szCs w:val="40"/>
                 <w:highlight w:val="yellow"/>
-                <w:cs/>
-                <w:lang w:bidi="ta-IN"/>
-              </w:rPr>
-              <w:t>4</w:t>
-            </w:r>
-            <w:r>
-              <w:rPr>
-                <w:rFonts w:ascii="Latha" w:hAnsi="Latha" w:cs="Latha"/>
-                <w:sz w:val="28"/>
-                <w:szCs w:val="28"/>
+              </w:rPr>
+              <w:t>–</w:t>
+            </w:r>
+            <w:r>
+              <w:rPr>
+                <w:rFonts w:ascii="BRH Devanagari Extra" w:hAnsi="BRH Devanagari Extra" w:cs="BRH Devanagari Extra"/>
+                <w:sz w:val="40"/>
+                <w:szCs w:val="40"/>
+              </w:rPr>
+              <w:t xml:space="preserve"> CirÉÍpÉþ</w:t>
+            </w:r>
+            <w:r>
+              <w:rPr>
+                <w:rFonts w:ascii="BRH Devanagari Extra" w:hAnsi="BRH Devanagari Extra" w:cs="BRH Devanagari Extra"/>
+                <w:sz w:val="40"/>
+                <w:szCs w:val="40"/>
                 <w:highlight w:val="yellow"/>
-                <w:cs/>
-                <w:lang w:bidi="ta-IN"/>
-              </w:rPr>
-              <w:t>த்யை</w:t>
-            </w:r>
-            <w:r>
-              <w:rPr>
-                <w:rFonts w:ascii="Latha" w:hAnsi="Latha" w:cs="Latha"/>
-                <w:sz w:val="28"/>
-                <w:szCs w:val="28"/>
-                <w:lang w:bidi="ta-IN"/>
-              </w:rPr>
-              <w:t xml:space="preserve"> | </w:t>
-            </w:r>
-            <w:r>
-              <w:rPr>
-                <w:rFonts w:ascii="Latha" w:hAnsi="Latha" w:cs="Latha"/>
-                <w:sz w:val="28"/>
-                <w:szCs w:val="28"/>
-                <w:lang w:bidi="ta-IN"/>
-              </w:rPr>
-              <w:br/>
-            </w:r>
-            <w:r>
-              <w:rPr>
-                <w:rFonts w:ascii="Latha" w:hAnsi="Latha" w:cs="Latha"/>
-                <w:sz w:val="28"/>
-                <w:szCs w:val="28"/>
-                <w:cs/>
-                <w:lang w:bidi="ta-IN"/>
-              </w:rPr>
-              <w:t>அபி</w:t>
-            </w:r>
-            <w:r>
-              <w:rPr>
-                <w:rFonts w:ascii="BRH Tamil Tab Extra" w:hAnsi="BRH Tamil Tab Extra" w:cs="Latha"/>
-                <w:b/>
-                <w:sz w:val="36"/>
-                <w:szCs w:val="28"/>
-                <w:lang w:bidi="ta-IN"/>
-              </w:rPr>
-              <w:t>†</w:t>
-            </w:r>
-            <w:r>
-              <w:rPr>
-                <w:rFonts w:ascii="Latha" w:hAnsi="Latha" w:cs="Latha"/>
-                <w:b/>
-                <w:bCs/>
-                <w:position w:val="-12"/>
-                <w:sz w:val="28"/>
-                <w:szCs w:val="28"/>
-                <w:cs/>
-                <w:lang w:bidi="ta-IN"/>
-              </w:rPr>
-              <w:t>4</w:t>
-            </w:r>
-            <w:r>
-              <w:rPr>
-                <w:rFonts w:ascii="Latha" w:hAnsi="Latha" w:cs="Latha"/>
-                <w:sz w:val="28"/>
-                <w:szCs w:val="28"/>
-                <w:highlight w:val="yellow"/>
-                <w:cs/>
-                <w:lang w:bidi="ta-IN"/>
-              </w:rPr>
-              <w:t>த்யா</w:t>
-            </w:r>
-            <w:r>
-              <w:rPr>
-                <w:rFonts w:ascii="BRH Tamil Tab Extra" w:hAnsi="BRH Tamil Tab Extra" w:cs="Latha"/>
-                <w:b/>
-                <w:sz w:val="36"/>
-                <w:szCs w:val="28"/>
-                <w:lang w:bidi="ta-IN"/>
-              </w:rPr>
-              <w:t>…</w:t>
-            </w:r>
-            <w:r>
-              <w:rPr>
-                <w:rFonts w:ascii="Latha" w:hAnsi="Latha" w:cs="Latha"/>
-                <w:sz w:val="28"/>
-                <w:szCs w:val="28"/>
-                <w:lang w:bidi="ta-IN"/>
-              </w:rPr>
-              <w:t xml:space="preserve"> </w:t>
-            </w:r>
-            <w:r>
-              <w:rPr>
-                <w:rFonts w:ascii="Latha" w:hAnsi="Latha" w:cs="Latha"/>
-                <w:sz w:val="28"/>
-                <w:szCs w:val="28"/>
-                <w:cs/>
-                <w:lang w:bidi="ta-IN"/>
-              </w:rPr>
-              <w:t>இத்யபி</w:t>
-            </w:r>
-            <w:r>
-              <w:rPr>
-                <w:rFonts w:ascii="BRH Tamil Tab Extra" w:hAnsi="BRH Tamil Tab Extra" w:cs="Latha"/>
-                <w:b/>
-                <w:sz w:val="36"/>
-                <w:szCs w:val="28"/>
-                <w:lang w:bidi="ta-IN"/>
-              </w:rPr>
-              <w:t>†</w:t>
-            </w:r>
-            <w:r>
-              <w:rPr>
-                <w:rFonts w:ascii="Latha" w:hAnsi="Latha" w:cs="Latha"/>
-                <w:b/>
-                <w:bCs/>
-                <w:position w:val="-12"/>
-                <w:sz w:val="28"/>
-                <w:szCs w:val="28"/>
-                <w:highlight w:val="yellow"/>
-                <w:cs/>
-                <w:lang w:bidi="ta-IN"/>
-              </w:rPr>
-              <w:t>4</w:t>
-            </w:r>
-            <w:r>
-              <w:rPr>
-                <w:rFonts w:ascii="Latha" w:hAnsi="Latha" w:cs="Latha"/>
-                <w:sz w:val="28"/>
-                <w:szCs w:val="28"/>
-                <w:highlight w:val="yellow"/>
-                <w:cs/>
-                <w:lang w:bidi="ta-IN"/>
-              </w:rPr>
-              <w:t>த்யை</w:t>
-            </w:r>
-            <w:r>
-              <w:rPr>
-                <w:rFonts w:ascii="Latha" w:hAnsi="Latha" w:cs="Latha"/>
-                <w:sz w:val="28"/>
-                <w:szCs w:val="28"/>
-                <w:lang w:bidi="ta-IN"/>
+              </w:rPr>
+              <w:t>irÉæ</w:t>
+            </w:r>
+            <w:r>
+              <w:rPr>
+                <w:rFonts w:ascii="BRH Devanagari Extra" w:hAnsi="BRH Devanagari Extra" w:cs="BRH Devanagari Extra"/>
+                <w:sz w:val="40"/>
+                <w:szCs w:val="40"/>
               </w:rPr>
               <w:t xml:space="preserve"> ||</w:t>
-            </w:r>
-          </w:p>
-          <w:p>
-            <w:pPr>
-              <w:widowControl w:val="0"/>
-              <w:autoSpaceDE w:val="0"/>
-              <w:autoSpaceDN w:val="0"/>
-              <w:adjustRightInd w:val="0"/>
-              <w:spacing w:before="0" w:line="240" w:lineRule="auto"/>
-              <w:rPr>
-                <w:rFonts w:ascii="BRH Devanagari Extra" w:hAnsi="BRH Devanagari Extra" w:cs="BRH Devanagari Extra"/>
-                <w:color w:val="000000"/>
-                <w:sz w:val="40"/>
-                <w:szCs w:val="40"/>
-              </w:rPr>
-            </w:pPr>
-            <w:r>
-              <w:rPr>
-                <w:rFonts w:ascii="BRH Devanagari Extra" w:hAnsi="BRH Devanagari Extra" w:cs="BRH Devanagari Extra"/>
-                <w:color w:val="000000"/>
-                <w:sz w:val="40"/>
-                <w:szCs w:val="40"/>
-              </w:rPr>
-              <w:t>S</w:t>
-            </w:r>
-            <w:r>
-              <w:rPr>
-                <w:rFonts w:ascii="BRH Malayalam Extra" w:hAnsi="BRH Malayalam Extra" w:cs="BRH Devanagari Extra"/>
-                <w:color w:val="000000"/>
-                <w:sz w:val="32"/>
-                <w:szCs w:val="40"/>
-              </w:rPr>
-              <w:t>–</w:t>
-            </w:r>
-            <w:r>
-              <w:rPr>
-                <w:rFonts w:ascii="BRH Devanagari Extra" w:hAnsi="BRH Devanagari Extra" w:cs="BRH Devanagari Extra"/>
-                <w:color w:val="000000"/>
-                <w:sz w:val="40"/>
-                <w:szCs w:val="40"/>
-              </w:rPr>
-              <w:t>SÉ</w:t>
-            </w:r>
-            <w:r>
-              <w:rPr>
-                <w:rFonts w:ascii="BRH Malayalam Extra" w:hAnsi="BRH Malayalam Extra" w:cs="BRH Devanagari Extra"/>
-                <w:color w:val="000000"/>
-                <w:sz w:val="32"/>
-                <w:szCs w:val="40"/>
-              </w:rPr>
-              <w:t>–</w:t>
-            </w:r>
-            <w:r>
-              <w:rPr>
-                <w:rFonts w:ascii="BRH Devanagari Extra" w:hAnsi="BRH Devanagari Extra" w:cs="BRH Devanagari Extra"/>
-                <w:color w:val="000000"/>
-                <w:sz w:val="40"/>
-                <w:szCs w:val="40"/>
-              </w:rPr>
-              <w:t>qrÉ</w:t>
-            </w:r>
-            <w:r>
-              <w:rPr>
-                <w:rFonts w:ascii="BRH Devanagari Extra" w:hAnsi="BRH Devanagari Extra" w:cs="BRH Devanagari Extra"/>
-                <w:color w:val="EE0000"/>
-                <w:sz w:val="40"/>
-                <w:szCs w:val="40"/>
-                <w:highlight w:val="yellow"/>
-              </w:rPr>
-              <w:t>ÍpÉþirÉæ</w:t>
-            </w:r>
-            <w:r>
-              <w:rPr>
-                <w:rFonts w:ascii="BRH Devanagari Extra" w:hAnsi="BRH Devanagari Extra" w:cs="BRH Devanagari Extra"/>
-                <w:color w:val="000000"/>
-                <w:sz w:val="40"/>
-                <w:szCs w:val="40"/>
-              </w:rPr>
-              <w:t xml:space="preserve"> | A</w:t>
-            </w:r>
-            <w:r>
-              <w:rPr>
-                <w:rFonts w:ascii="BRH Devanagari Extra" w:hAnsi="BRH Devanagari Extra" w:cs="BRH Devanagari Extra"/>
-                <w:sz w:val="40"/>
-                <w:szCs w:val="40"/>
-              </w:rPr>
-              <w:t>ÍpÉ</w:t>
-            </w:r>
-            <w:r>
-              <w:rPr>
-                <w:rFonts w:ascii="BRH Devanagari Extra" w:hAnsi="BRH Devanagari Extra" w:cs="BRH Devanagari Extra"/>
-                <w:color w:val="EE0000"/>
-                <w:sz w:val="40"/>
-                <w:szCs w:val="40"/>
-                <w:highlight w:val="yellow"/>
-              </w:rPr>
-              <w:t>þirÉÉ</w:t>
-            </w:r>
-            <w:r>
-              <w:rPr>
-                <w:rFonts w:ascii="BRH Malayalam Extra" w:hAnsi="BRH Malayalam Extra" w:cs="BRH Devanagari Extra"/>
-                <w:color w:val="EE0000"/>
-                <w:sz w:val="32"/>
-                <w:szCs w:val="40"/>
-                <w:highlight w:val="yellow"/>
-              </w:rPr>
-              <w:t>–</w:t>
-            </w:r>
-            <w:r>
-              <w:rPr>
-                <w:rFonts w:ascii="BRH Devanagari Extra" w:hAnsi="BRH Devanagari Extra" w:cs="BRH Devanagari Extra"/>
-                <w:color w:val="000000"/>
-                <w:sz w:val="40"/>
-                <w:szCs w:val="40"/>
-              </w:rPr>
-              <w:t xml:space="preserve"> CirÉÍpÉþ</w:t>
-            </w:r>
-            <w:r>
-              <w:rPr>
-                <w:rFonts w:ascii="BRH Devanagari Extra" w:hAnsi="BRH Devanagari Extra" w:cs="BRH Devanagari Extra"/>
-                <w:color w:val="EE0000"/>
-                <w:sz w:val="40"/>
-                <w:szCs w:val="40"/>
-                <w:highlight w:val="yellow"/>
-              </w:rPr>
-              <w:t>irÉæ</w:t>
-            </w:r>
-            <w:r>
-              <w:rPr>
-                <w:rFonts w:ascii="BRH Devanagari Extra" w:hAnsi="BRH Devanagari Extra" w:cs="BRH Devanagari Extra"/>
-                <w:color w:val="EE0000"/>
-                <w:sz w:val="40"/>
-                <w:szCs w:val="40"/>
-              </w:rPr>
-              <w:t xml:space="preserve"> </w:t>
-            </w:r>
-            <w:r>
-              <w:rPr>
-                <w:rFonts w:ascii="BRH Devanagari Extra" w:hAnsi="BRH Devanagari Extra" w:cs="BRH Devanagari Extra"/>
-                <w:color w:val="000000"/>
-                <w:sz w:val="40"/>
-                <w:szCs w:val="40"/>
-              </w:rPr>
-              <w:t>||</w:t>
             </w:r>
           </w:p>
         </w:tc>
@@ -1877,324 +1054,119 @@
               <w:autoSpaceDE w:val="0"/>
               <w:autoSpaceDN w:val="0"/>
               <w:adjustRightInd w:val="0"/>
-              <w:spacing w:before="0" w:line="240" w:lineRule="auto"/>
-              <w:rPr>
-                <w:rFonts w:ascii="Latha" w:hAnsi="Latha" w:cs="Latha"/>
-                <w:sz w:val="28"/>
-                <w:szCs w:val="28"/>
-                <w:lang w:bidi="ta-IN"/>
-              </w:rPr>
-            </w:pPr>
-            <w:r>
-              <w:rPr>
-                <w:rFonts w:ascii="Latha" w:hAnsi="Latha" w:cs="Latha"/>
-                <w:sz w:val="28"/>
-                <w:szCs w:val="28"/>
-                <w:cs/>
-                <w:lang w:bidi="ta-IN"/>
-              </w:rPr>
-              <w:t>த</w:t>
-            </w:r>
-            <w:r>
-              <w:rPr>
-                <w:rFonts w:ascii="BRH Tamil Tab Extra" w:hAnsi="BRH Tamil Tab Extra" w:cs="Latha"/>
-                <w:b/>
-                <w:sz w:val="36"/>
-                <w:szCs w:val="28"/>
-                <w:lang w:bidi="ta-IN"/>
-              </w:rPr>
-              <w:t>…</w:t>
-            </w:r>
-            <w:r>
-              <w:rPr>
-                <w:rFonts w:ascii="Latha" w:hAnsi="Latha" w:cs="Latha"/>
-                <w:b/>
-                <w:bCs/>
-                <w:position w:val="-12"/>
-                <w:sz w:val="28"/>
-                <w:szCs w:val="28"/>
-                <w:cs/>
-                <w:lang w:bidi="ta-IN"/>
-              </w:rPr>
-              <w:t>3</w:t>
-            </w:r>
-            <w:r>
-              <w:rPr>
-                <w:rFonts w:ascii="Latha" w:hAnsi="Latha" w:cs="Latha"/>
-                <w:sz w:val="28"/>
-                <w:szCs w:val="28"/>
-                <w:cs/>
-                <w:lang w:bidi="ta-IN"/>
-              </w:rPr>
-              <w:t>தா</w:t>
-            </w:r>
-            <w:r>
-              <w:rPr>
-                <w:rFonts w:ascii="BRH Tamil Tab Extra" w:hAnsi="BRH Tamil Tab Extra" w:cs="Latha"/>
-                <w:b/>
-                <w:sz w:val="36"/>
-                <w:szCs w:val="28"/>
-                <w:lang w:bidi="ta-IN"/>
-              </w:rPr>
-              <w:t>…</w:t>
-            </w:r>
-            <w:r>
-              <w:rPr>
-                <w:rFonts w:ascii="Latha" w:hAnsi="Latha" w:cs="Latha"/>
-                <w:b/>
-                <w:bCs/>
-                <w:position w:val="-12"/>
-                <w:sz w:val="28"/>
-                <w:szCs w:val="28"/>
-                <w:cs/>
-                <w:lang w:bidi="ta-IN"/>
-              </w:rPr>
-              <w:t>3</w:t>
-            </w:r>
-            <w:r>
-              <w:rPr>
-                <w:rFonts w:ascii="Latha" w:hAnsi="Latha" w:cs="Latha"/>
-                <w:sz w:val="28"/>
-                <w:szCs w:val="28"/>
-                <w:cs/>
-                <w:lang w:bidi="ta-IN"/>
-              </w:rPr>
-              <w:t>ம்ய</w:t>
-            </w:r>
-            <w:r>
-              <w:rPr>
-                <w:rFonts w:ascii="Latha" w:hAnsi="Latha" w:cs="Latha"/>
-                <w:sz w:val="28"/>
-                <w:szCs w:val="28"/>
-                <w:cs/>
-                <w:lang w:bidi="ta-IN"/>
-              </w:rPr>
-              <w:t>பி</w:t>
-            </w:r>
-            <w:r>
-              <w:rPr>
-                <w:rFonts w:ascii="BRH Tamil Tab Extra" w:hAnsi="BRH Tamil Tab Extra" w:cs="Latha"/>
-                <w:b/>
-                <w:sz w:val="36"/>
-                <w:szCs w:val="28"/>
-                <w:lang w:bidi="ta-IN"/>
-              </w:rPr>
-              <w:t>†</w:t>
-            </w:r>
-            <w:r>
-              <w:rPr>
-                <w:rFonts w:ascii="Latha" w:hAnsi="Latha" w:cs="Latha"/>
-                <w:b/>
-                <w:bCs/>
-                <w:position w:val="-12"/>
-                <w:sz w:val="28"/>
-                <w:szCs w:val="28"/>
+              <w:spacing w:line="252" w:lineRule="auto"/>
+              <w:rPr>
+                <w:rFonts w:ascii="BRH Devanagari Extra" w:hAnsi="BRH Devanagari Extra" w:cs="BRH Devanagari Extra"/>
+                <w:sz w:val="40"/>
+                <w:szCs w:val="40"/>
+              </w:rPr>
+            </w:pPr>
+            <w:r>
+              <w:rPr>
+                <w:rFonts w:ascii="BRH Devanagari Extra" w:hAnsi="BRH Devanagari Extra" w:cs="BRH Devanagari Extra"/>
+                <w:sz w:val="40"/>
+                <w:szCs w:val="40"/>
+              </w:rPr>
+              <w:t>S</w:t>
+            </w:r>
+            <w:r>
+              <w:rPr>
+                <w:rFonts w:ascii="BRH Malayalam Extra" w:hAnsi="BRH Malayalam Extra" w:cs="BRH Devanagari Extra"/>
+                <w:sz w:val="32"/>
+                <w:szCs w:val="40"/>
+              </w:rPr>
+              <w:t>–</w:t>
+            </w:r>
+            <w:r>
+              <w:rPr>
+                <w:rFonts w:ascii="BRH Devanagari Extra" w:hAnsi="BRH Devanagari Extra" w:cs="BRH Devanagari Extra"/>
+                <w:sz w:val="40"/>
+                <w:szCs w:val="40"/>
+              </w:rPr>
+              <w:t>SÉ</w:t>
+            </w:r>
+            <w:r>
+              <w:rPr>
+                <w:rFonts w:ascii="BRH Malayalam Extra" w:hAnsi="BRH Malayalam Extra" w:cs="BRH Devanagari Extra"/>
+                <w:sz w:val="32"/>
+                <w:szCs w:val="40"/>
+              </w:rPr>
+              <w:t>–</w:t>
+            </w:r>
+            <w:r>
+              <w:rPr>
+                <w:rFonts w:ascii="BRH Devanagari Extra" w:hAnsi="BRH Devanagari Extra" w:cs="BRH Devanagari Extra"/>
+                <w:sz w:val="40"/>
+                <w:szCs w:val="40"/>
+              </w:rPr>
+              <w:t>qrÉÍpÉþ</w:t>
+            </w:r>
+            <w:r>
+              <w:rPr>
+                <w:rFonts w:ascii="BRH Devanagari Extra" w:hAnsi="BRH Devanagari Extra" w:cs="BRH Devanagari Extra"/>
+                <w:sz w:val="40"/>
+                <w:szCs w:val="40"/>
                 <w:highlight w:val="green"/>
-                <w:cs/>
-                <w:lang w:bidi="ta-IN"/>
-              </w:rPr>
-              <w:t>4</w:t>
-            </w:r>
-            <w:r>
-              <w:rPr>
-                <w:rFonts w:ascii="Latha" w:hAnsi="Latha" w:cs="Latha"/>
-                <w:sz w:val="28"/>
-                <w:szCs w:val="28"/>
+              </w:rPr>
+              <w:t>¨</w:t>
+            </w:r>
+            <w:r>
+              <w:rPr>
+                <w:rFonts w:ascii="BRH Devanagari Extra" w:hAnsi="BRH Devanagari Extra" w:cs="BRH Devanagari Extra"/>
+                <w:sz w:val="40"/>
+                <w:szCs w:val="40"/>
+              </w:rPr>
+              <w:t>rÉæ | AÍpÉþ</w:t>
+            </w:r>
+            <w:r>
+              <w:rPr>
+                <w:rFonts w:ascii="BRH Devanagari Extra" w:hAnsi="BRH Devanagari Extra" w:cs="BRH Devanagari Extra"/>
+                <w:sz w:val="40"/>
+                <w:szCs w:val="40"/>
                 <w:highlight w:val="green"/>
-                <w:cs/>
-                <w:lang w:bidi="ta-IN"/>
-              </w:rPr>
-              <w:t>த்த்யை</w:t>
-            </w:r>
-            <w:r>
-              <w:rPr>
-                <w:rFonts w:ascii="Latha" w:hAnsi="Latha" w:cs="Latha"/>
-                <w:sz w:val="28"/>
-                <w:szCs w:val="28"/>
-                <w:lang w:bidi="ta-IN"/>
-              </w:rPr>
-              <w:t xml:space="preserve"> | </w:t>
-            </w:r>
-            <w:r>
-              <w:rPr>
-                <w:rFonts w:ascii="Latha" w:hAnsi="Latha" w:cs="Latha"/>
-                <w:sz w:val="28"/>
-                <w:szCs w:val="28"/>
-                <w:lang w:bidi="ta-IN"/>
-              </w:rPr>
-              <w:br/>
-            </w:r>
-            <w:r>
-              <w:rPr>
-                <w:rFonts w:ascii="Latha" w:hAnsi="Latha" w:cs="Latha"/>
-                <w:sz w:val="28"/>
-                <w:szCs w:val="28"/>
-                <w:cs/>
-                <w:lang w:bidi="ta-IN"/>
-              </w:rPr>
-              <w:t>அபி</w:t>
-            </w:r>
-            <w:r>
-              <w:rPr>
-                <w:rFonts w:ascii="BRH Tamil Tab Extra" w:hAnsi="BRH Tamil Tab Extra" w:cs="Latha"/>
-                <w:b/>
-                <w:sz w:val="36"/>
-                <w:szCs w:val="28"/>
-                <w:lang w:bidi="ta-IN"/>
-              </w:rPr>
-              <w:t>†</w:t>
-            </w:r>
-            <w:r>
-              <w:rPr>
-                <w:rFonts w:ascii="Latha" w:hAnsi="Latha" w:cs="Latha"/>
-                <w:b/>
-                <w:bCs/>
-                <w:position w:val="-12"/>
-                <w:sz w:val="28"/>
-                <w:szCs w:val="28"/>
-                <w:cs/>
-                <w:lang w:bidi="ta-IN"/>
-              </w:rPr>
-              <w:t>4</w:t>
-            </w:r>
-            <w:r>
-              <w:rPr>
-                <w:rFonts w:ascii="Latha" w:hAnsi="Latha" w:cs="Latha"/>
-                <w:sz w:val="28"/>
-                <w:szCs w:val="28"/>
+              </w:rPr>
+              <w:t>¨</w:t>
+            </w:r>
+            <w:r>
+              <w:rPr>
+                <w:rFonts w:ascii="BRH Devanagari Extra" w:hAnsi="BRH Devanagari Extra" w:cs="BRH Devanagari Extra"/>
+                <w:sz w:val="40"/>
+                <w:szCs w:val="40"/>
+              </w:rPr>
+              <w:t>rÉÉ</w:t>
+            </w:r>
+            <w:r>
+              <w:rPr>
+                <w:rFonts w:ascii="BRH Malayalam Extra" w:hAnsi="BRH Malayalam Extra" w:cs="BRH Devanagari Extra"/>
+                <w:sz w:val="32"/>
+                <w:szCs w:val="40"/>
+              </w:rPr>
+              <w:t>–</w:t>
+            </w:r>
+            <w:r>
+              <w:rPr>
+                <w:rFonts w:ascii="BRH Devanagari Extra" w:hAnsi="BRH Devanagari Extra" w:cs="BRH Devanagari Extra"/>
+                <w:sz w:val="40"/>
+                <w:szCs w:val="40"/>
+              </w:rPr>
+              <w:t xml:space="preserve"> CirÉÍpÉþ</w:t>
+            </w:r>
+            <w:r>
+              <w:rPr>
+                <w:rFonts w:ascii="BRH Devanagari Extra" w:hAnsi="BRH Devanagari Extra" w:cs="BRH Devanagari Extra"/>
+                <w:sz w:val="40"/>
+                <w:szCs w:val="40"/>
                 <w:highlight w:val="green"/>
-                <w:cs/>
-                <w:lang w:bidi="ta-IN"/>
-              </w:rPr>
-              <w:t>த்</w:t>
-            </w:r>
-            <w:r>
-              <w:rPr>
-                <w:rFonts w:ascii="Latha" w:hAnsi="Latha" w:cs="Latha"/>
-                <w:sz w:val="28"/>
-                <w:szCs w:val="28"/>
-                <w:cs/>
-                <w:lang w:bidi="ta-IN"/>
-              </w:rPr>
-              <w:t>த்யா</w:t>
-            </w:r>
-            <w:r>
-              <w:rPr>
-                <w:rFonts w:ascii="BRH Tamil Tab Extra" w:hAnsi="BRH Tamil Tab Extra" w:cs="Latha"/>
-                <w:b/>
-                <w:sz w:val="36"/>
-                <w:szCs w:val="28"/>
-                <w:lang w:bidi="ta-IN"/>
-              </w:rPr>
-              <w:t>…</w:t>
-            </w:r>
-            <w:r>
-              <w:rPr>
-                <w:rFonts w:ascii="Latha" w:hAnsi="Latha" w:cs="Latha"/>
-                <w:sz w:val="28"/>
-                <w:szCs w:val="28"/>
-                <w:lang w:bidi="ta-IN"/>
-              </w:rPr>
-              <w:t xml:space="preserve"> </w:t>
-            </w:r>
-            <w:r>
-              <w:rPr>
-                <w:rFonts w:ascii="Latha" w:hAnsi="Latha" w:cs="Latha"/>
-                <w:sz w:val="28"/>
-                <w:szCs w:val="28"/>
-                <w:cs/>
-                <w:lang w:bidi="ta-IN"/>
-              </w:rPr>
-              <w:t>இத்யபி</w:t>
-            </w:r>
-            <w:r>
-              <w:rPr>
-                <w:rFonts w:ascii="BRH Tamil Tab Extra" w:hAnsi="BRH Tamil Tab Extra" w:cs="Latha"/>
-                <w:b/>
-                <w:sz w:val="36"/>
-                <w:szCs w:val="28"/>
-                <w:lang w:bidi="ta-IN"/>
-              </w:rPr>
-              <w:t>†</w:t>
-            </w:r>
-            <w:r>
-              <w:rPr>
-                <w:rFonts w:ascii="Latha" w:hAnsi="Latha" w:cs="Latha"/>
-                <w:b/>
-                <w:bCs/>
-                <w:position w:val="-12"/>
-                <w:sz w:val="28"/>
-                <w:szCs w:val="28"/>
-                <w:cs/>
-                <w:lang w:bidi="ta-IN"/>
-              </w:rPr>
-              <w:t>4</w:t>
-            </w:r>
-            <w:r>
-              <w:rPr>
-                <w:rFonts w:ascii="Latha" w:hAnsi="Latha" w:cs="Latha"/>
-                <w:sz w:val="28"/>
-                <w:szCs w:val="28"/>
-                <w:cs/>
-                <w:lang w:bidi="ta-IN"/>
-              </w:rPr>
-              <w:t>த்</w:t>
-            </w:r>
-            <w:r>
-              <w:rPr>
-                <w:rFonts w:ascii="Latha" w:hAnsi="Latha" w:cs="Latha"/>
-                <w:sz w:val="28"/>
-                <w:szCs w:val="28"/>
-                <w:highlight w:val="green"/>
-                <w:cs/>
-                <w:lang w:bidi="ta-IN"/>
-              </w:rPr>
-              <w:t>த்</w:t>
-            </w:r>
-            <w:r>
-              <w:rPr>
-                <w:rFonts w:ascii="Latha" w:hAnsi="Latha" w:cs="Latha"/>
-                <w:sz w:val="28"/>
-                <w:szCs w:val="28"/>
-                <w:cs/>
-                <w:lang w:bidi="ta-IN"/>
-              </w:rPr>
-              <w:t>யை</w:t>
-            </w:r>
-            <w:r>
-              <w:rPr>
-                <w:rFonts w:ascii="Latha" w:hAnsi="Latha" w:cs="Latha"/>
-                <w:sz w:val="28"/>
-                <w:szCs w:val="28"/>
-                <w:lang w:bidi="ta-IN"/>
-              </w:rPr>
-              <w:t xml:space="preserve"> ||</w:t>
-            </w:r>
-          </w:p>
-          <w:p>
-            <w:pPr>
-              <w:widowControl w:val="0"/>
-              <w:autoSpaceDE w:val="0"/>
-              <w:autoSpaceDN w:val="0"/>
-              <w:adjustRightInd w:val="0"/>
-              <w:spacing w:before="0" w:line="240" w:lineRule="auto"/>
-              <w:rPr>
-                <w:rFonts w:ascii="BRH Devanagari Extra" w:hAnsi="BRH Devanagari Extra" w:cs="BRH Devanagari Extra"/>
-                <w:color w:val="000000"/>
-                <w:sz w:val="40"/>
-                <w:szCs w:val="40"/>
-              </w:rPr>
-            </w:pPr>
-            <w:r>
-              <w:rPr>
-                <w:rFonts w:ascii="Latha" w:hAnsi="Latha" w:cs="Latha"/>
-                <w:color w:val="000000"/>
-                <w:sz w:val="28"/>
-                <w:szCs w:val="28"/>
-                <w:highlight w:val="green"/>
-                <w:lang w:bidi="ta-IN"/>
-              </w:rPr>
-              <w:t>(add extra t)</w:t>
+              </w:rPr>
+              <w:t>¨</w:t>
+            </w:r>
+            <w:r>
+              <w:rPr>
+                <w:rFonts w:ascii="BRH Devanagari Extra" w:hAnsi="BRH Devanagari Extra" w:cs="BRH Devanagari Extra"/>
+                <w:sz w:val="40"/>
+                <w:szCs w:val="40"/>
+              </w:rPr>
+              <w:t xml:space="preserve">rÉæ || </w:t>
             </w:r>
           </w:p>
         </w:tc>
@@ -2656,7 +1628,6 @@
           <w:szCs w:val="32"/>
           <w:u w:val="single"/>
         </w:rPr>
-        <w:lastRenderedPageBreak/>
         <w:t xml:space="preserve">TS </w:t>
       </w:r>
       <w:r>
@@ -2974,6 +1945,7 @@
                 <w:sz w:val="28"/>
                 <w:szCs w:val="32"/>
               </w:rPr>
+              <w:lastRenderedPageBreak/>
               <w:t>Panchaati No</w:t>
             </w:r>
             <w:r>
@@ -3036,6 +2008,7 @@
                 <w:sz w:val="40"/>
                 <w:szCs w:val="40"/>
               </w:rPr>
+              <w:lastRenderedPageBreak/>
               <w:t>iuÉÉ</w:t>
             </w:r>
             <w:r>
@@ -4864,7 +3837,6 @@
           <w:szCs w:val="32"/>
           <w:u w:val="single"/>
         </w:rPr>
-        <w:lastRenderedPageBreak/>
         <w:t xml:space="preserve">TS </w:t>
       </w:r>
       <w:r>
@@ -4935,7 +3907,29 @@
           <w:szCs w:val="32"/>
           <w:u w:val="single"/>
         </w:rPr>
-        <w:t>31st  Oct 2021</w:t>
+        <w:t>31</w:t>
+      </w:r>
+      <w:proofErr w:type="gramStart"/>
+      <w:r>
+        <w:rPr>
+          <w:b/>
+          <w:bCs/>
+          <w:sz w:val="32"/>
+          <w:szCs w:val="32"/>
+          <w:u w:val="single"/>
+        </w:rPr>
+        <w:t>st  Oct</w:t>
+      </w:r>
+      <w:proofErr w:type="gramEnd"/>
+      <w:r>
+        <w:rPr>
+          <w:b/>
+          <w:bCs/>
+          <w:sz w:val="32"/>
+          <w:szCs w:val="32"/>
+          <w:u w:val="single"/>
+        </w:rPr>
+        <w:t xml:space="preserve"> 2021</w:t>
       </w:r>
     </w:p>
     <w:p>
@@ -5099,6 +4093,7 @@
                 <w:sz w:val="28"/>
                 <w:szCs w:val="32"/>
               </w:rPr>
+              <w:lastRenderedPageBreak/>
               <w:t>T.S.4.1.1.1 – Kramam</w:t>
             </w:r>
           </w:p>
@@ -6809,7 +5804,6 @@
                 <w:sz w:val="28"/>
                 <w:szCs w:val="32"/>
               </w:rPr>
-              <w:lastRenderedPageBreak/>
               <w:t>T.S.4.1.8.6 – Kramam</w:t>
             </w:r>
           </w:p>
@@ -7160,6 +6154,7 @@
                 <w:sz w:val="28"/>
                 <w:szCs w:val="32"/>
               </w:rPr>
+              <w:lastRenderedPageBreak/>
               <w:t>T.S.4.1.9.2 – Kramam</w:t>
             </w:r>
           </w:p>
@@ -8373,7 +7368,16 @@
           <w:bCs/>
           <w:sz w:val="32"/>
         </w:rPr>
-        <w:t>replaced with</w:t>
+        <w:t xml:space="preserve">replaced </w:t>
+      </w:r>
+      <w:proofErr w:type="gramStart"/>
+      <w:r>
+        <w:rPr>
+          <w:b/>
+          <w:bCs/>
+          <w:sz w:val="32"/>
+        </w:rPr>
+        <w:t>with</w:t>
       </w:r>
       <w:r>
         <w:rPr>
@@ -8395,6 +7399,7 @@
         </w:rPr>
         <w:t>"</w:t>
       </w:r>
+      <w:proofErr w:type="gramEnd"/>
       <w:r>
         <w:rPr>
           <w:rFonts w:ascii="BRH Devanagari" w:hAnsi="BRH Devanagari" w:cs="BRH Devanagari"/>
@@ -8502,7 +7507,6 @@
           <w:szCs w:val="32"/>
           <w:u w:val="single"/>
         </w:rPr>
-        <w:lastRenderedPageBreak/>
         <w:t xml:space="preserve">TS </w:t>
       </w:r>
       <w:r>
@@ -8657,6 +7661,7 @@
                 <w:sz w:val="32"/>
                 <w:szCs w:val="32"/>
               </w:rPr>
+              <w:lastRenderedPageBreak/>
               <w:t>Reference</w:t>
             </w:r>
           </w:p>
@@ -8679,6 +7684,7 @@
                 <w:sz w:val="32"/>
                 <w:szCs w:val="32"/>
               </w:rPr>
+              <w:lastRenderedPageBreak/>
               <w:t>As Printed</w:t>
             </w:r>
           </w:p>
@@ -8882,6 +7888,7 @@
               </w:rPr>
               <w:t>–</w:t>
             </w:r>
+            <w:proofErr w:type="gramStart"/>
             <w:r>
               <w:rPr>
                 <w:rFonts w:ascii="BRH Devanagari Extra" w:hAnsi="BRH Devanagari Extra" w:cs="BRH Devanagari Extra"/>
@@ -8892,6 +7899,7 @@
               </w:rPr>
               <w:t>lÉÉ  |</w:t>
             </w:r>
+            <w:proofErr w:type="gramEnd"/>
             <w:r>
               <w:rPr>
                 <w:rFonts w:ascii="BRH Devanagari Extra" w:hAnsi="BRH Devanagari Extra" w:cs="BRH Devanagari Extra"/>

</xml_diff>